<commit_message>
GabrielDeSouzaBorba: TCC1 - PreProjeto.
</commit_message>
<xml_diff>
--- a/_revisados/GabrielDeSouzaBorba/2026-05-07_GabrielDeSouzaBorba_Dalton.docx
+++ b/_revisados/GabrielDeSouzaBorba/2026-05-07_GabrielDeSouzaBorba_Dalton.docx
@@ -16,7 +16,23 @@
       <w:bookmarkStart w:id="7" w:name="_Toc96491849"/>
       <w:bookmarkStart w:id="8" w:name="_Toc411603089"/>
       <w:r>
-        <w:t>JOGO EM REALIDADE VIRTUAL PARA ESTIMULAR A COMUNICAÇÃO ORAL EM INGLÊS</w:t>
+        <w:t xml:space="preserve">JOGO EM </w:t>
+      </w:r>
+      <w:commentRangeStart w:id="9"/>
+      <w:r>
+        <w:t xml:space="preserve">REALIDADE </w:t>
+      </w:r>
+      <w:commentRangeEnd w:id="9"/>
+      <w:r>
+        <w:rPr>
+          <w:rStyle w:val="Refdecomentrio"/>
+          <w:sz w:val="24"/>
+          <w:szCs w:val="20"/>
+        </w:rPr>
+        <w:commentReference w:id="9"/>
+      </w:r>
+      <w:r>
+        <w:t>VIRTUAL PARA ESTIMULAR A COMUNICAÇÃO ORAL EM INGLÊS</w:t>
       </w:r>
     </w:p>
     <w:p>
@@ -32,7 +48,15 @@
         <w:pStyle w:val="TF-AUTOR0"/>
       </w:pPr>
       <w:r>
-        <w:t xml:space="preserve">Prof. </w:t>
+        <w:t>Prof</w:t>
+      </w:r>
+      <w:ins w:id="10" w:author="Dalton Solano dos Reis" w:date="2026-05-13T12:32:00Z" w16du:dateUtc="2026-05-13T15:32:00Z">
+        <w:r>
+          <w:t>a</w:t>
+        </w:r>
+      </w:ins>
+      <w:r>
+        <w:t xml:space="preserve">. </w:t>
       </w:r>
       <w:r>
         <w:t>Luciana Pereira de Araújo Kohler</w:t>
@@ -42,6 +66,8 @@
       <w:pPr>
         <w:pStyle w:val="Ttulo1"/>
       </w:pPr>
+      <w:commentRangeStart w:id="11"/>
+      <w:commentRangeStart w:id="12"/>
       <w:r>
         <w:t>Introdução</w:t>
       </w:r>
@@ -54,6 +80,24 @@
       <w:bookmarkEnd w:id="6"/>
       <w:bookmarkEnd w:id="7"/>
       <w:bookmarkEnd w:id="8"/>
+      <w:commentRangeEnd w:id="11"/>
+      <w:r>
+        <w:rPr>
+          <w:rStyle w:val="Refdecomentrio"/>
+          <w:sz w:val="20"/>
+          <w:szCs w:val="24"/>
+        </w:rPr>
+        <w:commentReference w:id="11"/>
+      </w:r>
+      <w:commentRangeEnd w:id="12"/>
+      <w:r>
+        <w:rPr>
+          <w:rStyle w:val="Refdecomentrio"/>
+          <w:sz w:val="20"/>
+          <w:szCs w:val="24"/>
+        </w:rPr>
+        <w:commentReference w:id="12"/>
+      </w:r>
     </w:p>
     <w:p>
       <w:pPr>
@@ -140,16 +184,11 @@
         <w:t>osta</w:t>
       </w:r>
       <w:r>
-        <w:t xml:space="preserve">; </w:t>
-      </w:r>
-      <w:proofErr w:type="spellStart"/>
-      <w:r>
-        <w:t>F</w:t>
+        <w:t>; F</w:t>
       </w:r>
       <w:r>
         <w:t>reschi</w:t>
       </w:r>
-      <w:proofErr w:type="spellEnd"/>
       <w:r>
         <w:t>, 2021)</w:t>
       </w:r>
@@ -208,27 +247,23 @@
       <w:pPr>
         <w:pStyle w:val="Ttulo2"/>
       </w:pPr>
-      <w:bookmarkStart w:id="9" w:name="_Toc419598576"/>
-      <w:bookmarkStart w:id="10" w:name="_Toc420721317"/>
-      <w:bookmarkStart w:id="11" w:name="_Toc420721467"/>
-      <w:bookmarkStart w:id="12" w:name="_Toc420721562"/>
-      <w:bookmarkStart w:id="13" w:name="_Toc420721768"/>
-      <w:bookmarkStart w:id="14" w:name="_Toc420723209"/>
-      <w:bookmarkStart w:id="15" w:name="_Toc482682370"/>
-      <w:bookmarkStart w:id="16" w:name="_Toc54164904"/>
-      <w:bookmarkStart w:id="17" w:name="_Toc54165664"/>
-      <w:bookmarkStart w:id="18" w:name="_Toc54169316"/>
-      <w:bookmarkStart w:id="19" w:name="_Toc96347426"/>
-      <w:bookmarkStart w:id="20" w:name="_Toc96357710"/>
-      <w:bookmarkStart w:id="21" w:name="_Toc96491850"/>
-      <w:bookmarkStart w:id="22" w:name="_Toc411603090"/>
+      <w:bookmarkStart w:id="13" w:name="_Toc419598576"/>
+      <w:bookmarkStart w:id="14" w:name="_Toc420721317"/>
+      <w:bookmarkStart w:id="15" w:name="_Toc420721467"/>
+      <w:bookmarkStart w:id="16" w:name="_Toc420721562"/>
+      <w:bookmarkStart w:id="17" w:name="_Toc420721768"/>
+      <w:bookmarkStart w:id="18" w:name="_Toc420723209"/>
+      <w:bookmarkStart w:id="19" w:name="_Toc482682370"/>
+      <w:bookmarkStart w:id="20" w:name="_Toc54164904"/>
+      <w:bookmarkStart w:id="21" w:name="_Toc54165664"/>
+      <w:bookmarkStart w:id="22" w:name="_Toc54169316"/>
+      <w:bookmarkStart w:id="23" w:name="_Toc96347426"/>
+      <w:bookmarkStart w:id="24" w:name="_Toc96357710"/>
+      <w:bookmarkStart w:id="25" w:name="_Toc96491850"/>
+      <w:bookmarkStart w:id="26" w:name="_Toc411603090"/>
       <w:r>
         <w:t>OBJETIVOS</w:t>
       </w:r>
-      <w:bookmarkEnd w:id="9"/>
-      <w:bookmarkEnd w:id="10"/>
-      <w:bookmarkEnd w:id="11"/>
-      <w:bookmarkEnd w:id="12"/>
       <w:bookmarkEnd w:id="13"/>
       <w:bookmarkEnd w:id="14"/>
       <w:bookmarkEnd w:id="15"/>
@@ -239,6 +274,10 @@
       <w:bookmarkEnd w:id="20"/>
       <w:bookmarkEnd w:id="21"/>
       <w:bookmarkEnd w:id="22"/>
+      <w:bookmarkEnd w:id="23"/>
+      <w:bookmarkEnd w:id="24"/>
+      <w:bookmarkEnd w:id="25"/>
+      <w:bookmarkEnd w:id="26"/>
     </w:p>
     <w:p>
       <w:pPr>
@@ -278,7 +317,23 @@
         <w:pStyle w:val="TF-TEXTO"/>
       </w:pPr>
       <w:r>
-        <w:t>Os objetivos específicos são:</w:t>
+        <w:t xml:space="preserve">Os </w:t>
+      </w:r>
+      <w:commentRangeStart w:id="27"/>
+      <w:r>
+        <w:t xml:space="preserve">objetivos </w:t>
+      </w:r>
+      <w:commentRangeEnd w:id="27"/>
+      <w:r>
+        <w:rPr>
+          <w:rStyle w:val="Refdecomentrio"/>
+          <w:sz w:val="20"/>
+          <w:szCs w:val="20"/>
+        </w:rPr>
+        <w:commentReference w:id="27"/>
+      </w:r>
+      <w:r>
+        <w:t>específicos são:</w:t>
       </w:r>
     </w:p>
     <w:p>
@@ -312,265 +367,393 @@
       <w:pPr>
         <w:pStyle w:val="TF-ALNEA"/>
       </w:pPr>
+      <w:commentRangeStart w:id="28"/>
+      <w:commentRangeStart w:id="29"/>
       <w:r>
         <w:t>d</w:t>
       </w:r>
       <w:r>
-        <w:t xml:space="preserve">esenvolver um módulo de processamento e validação linguística baseado em tecnologia </w:t>
-      </w:r>
-      <w:proofErr w:type="spellStart"/>
+        <w:t xml:space="preserve">esenvolver um módulo </w:t>
+      </w:r>
+      <w:commentRangeEnd w:id="28"/>
+      <w:r>
+        <w:rPr>
+          <w:rStyle w:val="Refdecomentrio"/>
+          <w:sz w:val="20"/>
+          <w:szCs w:val="20"/>
+        </w:rPr>
+        <w:commentReference w:id="28"/>
+      </w:r>
+      <w:commentRangeEnd w:id="29"/>
+      <w:r>
+        <w:rPr>
+          <w:rStyle w:val="Refdecomentrio"/>
+          <w:sz w:val="20"/>
+          <w:szCs w:val="20"/>
+        </w:rPr>
+        <w:commentReference w:id="29"/>
+      </w:r>
+      <w:r>
+        <w:t xml:space="preserve">de processamento e validação linguística baseado em tecnologia </w:t>
+      </w:r>
       <w:r>
         <w:rPr>
           <w:i/>
           <w:iCs/>
         </w:rPr>
-        <w:t>Speech-to-Text</w:t>
-      </w:r>
-      <w:proofErr w:type="spellEnd"/>
+        <w:t xml:space="preserve">Speech-to-Text </w:t>
+      </w:r>
+      <w:r>
+        <w:t>(STT)</w:t>
+      </w:r>
+      <w:r>
+        <w:t>.</w:t>
+      </w:r>
+    </w:p>
+    <w:p>
+      <w:pPr>
+        <w:pStyle w:val="Ttulo1"/>
+      </w:pPr>
+      <w:bookmarkStart w:id="30" w:name="_Toc419598587"/>
+      <w:r>
+        <w:t xml:space="preserve">trabalhos </w:t>
+      </w:r>
+      <w:r>
+        <w:t>correlatos</w:t>
+      </w:r>
+    </w:p>
+    <w:p>
+      <w:pPr>
+        <w:pStyle w:val="TF-TEXTO"/>
+      </w:pPr>
+      <w:r>
+        <w:t>Nesta seção s</w:t>
+      </w:r>
+      <w:r>
+        <w:t xml:space="preserve">ão </w:t>
+      </w:r>
+      <w:r>
+        <w:t xml:space="preserve">apresentados trabalhos com características semelhantes aos principais objetivos do estudo proposto. O primeiro é uma pesquisa que aplica a abordagem de aprendizagem situada em um ambiente de </w:t>
+      </w:r>
+      <w:r>
+        <w:t>RV</w:t>
+      </w:r>
+      <w:r>
+        <w:t xml:space="preserve"> para desenvolver as habilidades de fala de estudantes de inglês </w:t>
+      </w:r>
+      <w:r>
+        <w:t>(Y</w:t>
+      </w:r>
+      <w:r>
+        <w:t>an</w:t>
+      </w:r>
+      <w:r>
+        <w:t>; L</w:t>
+      </w:r>
+      <w:r>
+        <w:t>owell</w:t>
+      </w:r>
+      <w:r>
+        <w:t>; Y</w:t>
+      </w:r>
+      <w:r>
+        <w:t>ang</w:t>
+      </w:r>
+      <w:r>
+        <w:t>, 2024)</w:t>
+      </w:r>
+      <w:r>
+        <w:t>.</w:t>
+      </w:r>
+      <w:r>
+        <w:t xml:space="preserve"> </w:t>
+      </w:r>
+      <w:r>
+        <w:t xml:space="preserve">O segundo é um mapeamento bibliográfico sobre tecnologias de </w:t>
+      </w:r>
+      <w:r>
+        <w:t>RV</w:t>
+      </w:r>
+      <w:r>
+        <w:t xml:space="preserve"> voltadas para a aprendizagem da língua inglesa </w:t>
+      </w:r>
+      <w:r>
+        <w:t>(L</w:t>
+      </w:r>
+      <w:r>
+        <w:t>eal</w:t>
+      </w:r>
+      <w:r>
+        <w:t>; C</w:t>
+      </w:r>
+      <w:r>
+        <w:t>osta</w:t>
+      </w:r>
+      <w:r>
+        <w:t>; F</w:t>
+      </w:r>
+      <w:r>
+        <w:t>reschi</w:t>
+      </w:r>
+      <w:r>
+        <w:t>, 2021)</w:t>
+      </w:r>
+      <w:r>
+        <w:t xml:space="preserve">. </w:t>
+      </w:r>
+      <w:r>
+        <w:t xml:space="preserve">O terceiro é um estudo prático que investiga a motivação, o engajamento e o desempenho de alunos em múltiplas sessões de </w:t>
+      </w:r>
+      <w:r>
+        <w:t>RV</w:t>
+      </w:r>
+      <w:r>
+        <w:t> em diferentes níveis de imersão (H</w:t>
+      </w:r>
+      <w:r>
+        <w:t>uang</w:t>
+      </w:r>
+      <w:r>
+        <w:t xml:space="preserve"> </w:t>
+      </w:r>
       <w:r>
         <w:rPr>
           <w:i/>
           <w:iCs/>
         </w:rPr>
-        <w:t xml:space="preserve"> </w:t>
-      </w:r>
-      <w:r>
-        <w:t>(STT)</w:t>
-      </w:r>
-      <w:r>
-        <w:t>.</w:t>
+        <w:t>et al</w:t>
+      </w:r>
+      <w:r>
+        <w:t xml:space="preserve">., </w:t>
+      </w:r>
+      <w:del w:id="31" w:author="Dalton Solano dos Reis" w:date="2026-05-14T09:37:00Z" w16du:dateUtc="2026-05-14T12:37:00Z">
+        <w:r>
+          <w:delText>2020</w:delText>
+        </w:r>
+      </w:del>
+      <w:ins w:id="32" w:author="Dalton Solano dos Reis" w:date="2026-05-14T09:37:00Z" w16du:dateUtc="2026-05-14T12:37:00Z">
+        <w:r>
+          <w:t>2021</w:t>
+        </w:r>
+      </w:ins>
+      <w:r>
+        <w:t>).</w:t>
       </w:r>
     </w:p>
     <w:p>
       <w:pPr>
-        <w:pStyle w:val="Ttulo1"/>
-      </w:pPr>
-      <w:bookmarkStart w:id="23" w:name="_Toc419598587"/>
-      <w:r>
-        <w:t xml:space="preserve">trabalhos </w:t>
-      </w:r>
-      <w:r>
-        <w:t>correlatos</w:t>
+        <w:pStyle w:val="Ttulo2"/>
+      </w:pPr>
+      <w:commentRangeStart w:id="33"/>
+      <w:r>
+        <w:t>PRIMEIRO TRABALHO CORRELATO</w:t>
+      </w:r>
+      <w:commentRangeEnd w:id="33"/>
+      <w:r>
+        <w:rPr>
+          <w:rStyle w:val="Refdecomentrio"/>
+          <w:sz w:val="20"/>
+          <w:szCs w:val="20"/>
+        </w:rPr>
+        <w:commentReference w:id="33"/>
+      </w:r>
+      <w:r>
+        <w:t xml:space="preserve"> </w:t>
       </w:r>
     </w:p>
     <w:p>
       <w:pPr>
         <w:pStyle w:val="TF-TEXTO"/>
       </w:pPr>
-      <w:r>
-        <w:t>Nesta seção s</w:t>
-      </w:r>
-      <w:r>
-        <w:t xml:space="preserve">ão </w:t>
-      </w:r>
-      <w:r>
-        <w:t xml:space="preserve">apresentados trabalhos com características semelhantes aos principais objetivos do estudo proposto. O primeiro é uma pesquisa que aplica a abordagem de aprendizagem situada em um ambiente de </w:t>
-      </w:r>
-      <w:r>
-        <w:t>RV</w:t>
-      </w:r>
-      <w:r>
-        <w:t xml:space="preserve"> para desenvolver as habilidades de fala de estudantes de inglês </w:t>
-      </w:r>
-      <w:r>
-        <w:t>(Y</w:t>
-      </w:r>
-      <w:r>
-        <w:t>an</w:t>
-      </w:r>
-      <w:r>
-        <w:t>; L</w:t>
-      </w:r>
-      <w:r>
-        <w:t>owell</w:t>
-      </w:r>
-      <w:r>
-        <w:t>; Y</w:t>
-      </w:r>
-      <w:r>
-        <w:t>ang</w:t>
-      </w:r>
-      <w:r>
-        <w:t>, 2024)</w:t>
-      </w:r>
-      <w:r>
-        <w:t>.</w:t>
-      </w:r>
-      <w:r>
-        <w:t xml:space="preserve"> </w:t>
-      </w:r>
-      <w:r>
-        <w:t xml:space="preserve">O segundo é um mapeamento bibliográfico sobre tecnologias de </w:t>
-      </w:r>
-      <w:r>
-        <w:t>RV</w:t>
-      </w:r>
-      <w:r>
-        <w:t xml:space="preserve"> voltadas para a aprendizagem da língua inglesa </w:t>
-      </w:r>
-      <w:r>
-        <w:t>(L</w:t>
-      </w:r>
-      <w:r>
-        <w:t>eal</w:t>
-      </w:r>
-      <w:r>
-        <w:t>; C</w:t>
-      </w:r>
-      <w:r>
-        <w:t>osta</w:t>
-      </w:r>
-      <w:r>
-        <w:t xml:space="preserve">; </w:t>
-      </w:r>
-      <w:proofErr w:type="spellStart"/>
-      <w:r>
-        <w:t>F</w:t>
-      </w:r>
-      <w:r>
-        <w:t>reschi</w:t>
-      </w:r>
-      <w:proofErr w:type="spellEnd"/>
-      <w:r>
-        <w:t>, 2021)</w:t>
-      </w:r>
-      <w:r>
-        <w:t xml:space="preserve">. </w:t>
-      </w:r>
-      <w:r>
-        <w:t xml:space="preserve">O terceiro é um estudo prático que investiga a motivação, o engajamento e o desempenho de alunos em múltiplas sessões de </w:t>
-      </w:r>
-      <w:r>
-        <w:t>RV</w:t>
-      </w:r>
-      <w:r>
-        <w:t> em diferentes níveis de imersão (H</w:t>
-      </w:r>
-      <w:r>
-        <w:t>uang</w:t>
-      </w:r>
-      <w:r>
-        <w:t xml:space="preserve"> </w:t>
+      <w:commentRangeStart w:id="34"/>
+      <w:del w:id="35" w:author="Dalton Solano dos Reis" w:date="2026-05-13T12:48:00Z" w16du:dateUtc="2026-05-13T15:48:00Z">
+        <w:r>
+          <w:delText xml:space="preserve">O primeiro </w:delText>
+        </w:r>
+      </w:del>
+      <w:ins w:id="36" w:author="Dalton Solano dos Reis" w:date="2026-05-13T12:48:00Z" w16du:dateUtc="2026-05-13T15:48:00Z">
+        <w:r>
+          <w:t>Es</w:t>
+        </w:r>
+      </w:ins>
+      <w:ins w:id="37" w:author="Dalton Solano dos Reis" w:date="2026-05-13T12:49:00Z" w16du:dateUtc="2026-05-13T15:49:00Z">
+        <w:r>
+          <w:t>t</w:t>
+        </w:r>
+      </w:ins>
+      <w:ins w:id="38" w:author="Dalton Solano dos Reis" w:date="2026-05-13T12:48:00Z" w16du:dateUtc="2026-05-13T15:48:00Z">
+        <w:r>
+          <w:t xml:space="preserve">e </w:t>
+        </w:r>
+      </w:ins>
+      <w:r>
+        <w:t xml:space="preserve">trabalho </w:t>
+      </w:r>
+      <w:commentRangeEnd w:id="34"/>
+      <w:r>
+        <w:rPr>
+          <w:rStyle w:val="Refdecomentrio"/>
+          <w:sz w:val="20"/>
+          <w:szCs w:val="20"/>
+        </w:rPr>
+        <w:commentReference w:id="34"/>
+      </w:r>
+      <w:commentRangeStart w:id="39"/>
+      <w:r>
+        <w:t>correlato</w:t>
+      </w:r>
+      <w:del w:id="40" w:author="Dalton Solano dos Reis" w:date="2026-05-13T12:48:00Z" w16du:dateUtc="2026-05-13T15:48:00Z">
+        <w:r>
+          <w:delText xml:space="preserve">, </w:delText>
+        </w:r>
+      </w:del>
+      <w:ins w:id="41" w:author="Dalton Solano dos Reis" w:date="2026-05-13T12:48:00Z" w16du:dateUtc="2026-05-13T15:48:00Z">
+        <w:r>
+          <w:t xml:space="preserve"> </w:t>
+        </w:r>
+      </w:ins>
+      <w:commentRangeEnd w:id="39"/>
+      <w:r>
+        <w:rPr>
+          <w:rStyle w:val="Refdecomentrio"/>
+          <w:sz w:val="20"/>
+          <w:szCs w:val="20"/>
+        </w:rPr>
+        <w:commentReference w:id="39"/>
+      </w:r>
+      <w:r>
+        <w:t>investiga o impacto de um ambiente de aprendizagem baseado em situações reais utilizando a plataforma de </w:t>
+      </w:r>
+      <w:r>
+        <w:t>R</w:t>
+      </w:r>
+      <w:r>
+        <w:t xml:space="preserve">ealidade </w:t>
+      </w:r>
+      <w:r>
+        <w:t>V</w:t>
+      </w:r>
+      <w:r>
+        <w:t>irtual </w:t>
+      </w:r>
+      <w:r>
+        <w:t>Immerse. A pesquisa se caracterizou pela utilização de atividades de </w:t>
       </w:r>
       <w:r>
         <w:rPr>
           <w:i/>
           <w:iCs/>
         </w:rPr>
-        <w:t>et al</w:t>
-      </w:r>
-      <w:r>
-        <w:t>., 2020).</w:t>
+        <w:t>role-play</w:t>
+      </w:r>
+      <w:r>
+        <w:t xml:space="preserve"> (encenação), </w:t>
+      </w:r>
+      <w:r>
+        <w:t>na qual</w:t>
+      </w:r>
+      <w:r>
+        <w:t xml:space="preserve"> </w:t>
+      </w:r>
+      <w:r>
+        <w:t>mostrava situações comuns em que o inglês é necessário como fazer </w:t>
+      </w:r>
+      <w:r>
+        <w:rPr>
+          <w:i/>
+          <w:iCs/>
+        </w:rPr>
+        <w:t>check-in</w:t>
+      </w:r>
+      <w:r>
+        <w:t xml:space="preserve"> em aeroportos, pedir comida em restaurantes, realizar compras em lojas dentre outros cenários</w:t>
+      </w:r>
+      <w:r>
+        <w:t>.</w:t>
       </w:r>
     </w:p>
     <w:p>
       <w:pPr>
-        <w:pStyle w:val="Ttulo2"/>
-      </w:pPr>
-      <w:r>
-        <w:t xml:space="preserve">PRIMEIRO TRABALHO CORRELATO </w:t>
+        <w:pStyle w:val="TF-TEXTO"/>
+      </w:pPr>
+      <w:r>
+        <w:t>Como pontos fortes, o estudo destaca que o ambiente virtual fornece um contexto que simula a vida real, permit</w:t>
+      </w:r>
+      <w:r>
+        <w:t>indo</w:t>
+      </w:r>
+      <w:r>
+        <w:t xml:space="preserve"> que tenha várias pessoas em uma mesma cena interagindo entre si </w:t>
+      </w:r>
+      <w:r>
+        <w:t>e</w:t>
+      </w:r>
+      <w:r>
+        <w:t> com o cenário</w:t>
+      </w:r>
+      <w:r>
+        <w:t xml:space="preserve"> (Figura 1)</w:t>
+      </w:r>
+      <w:r>
+        <w:t xml:space="preserve">. Com isso, a ferramenta trouxe uma redução da ansiedade e vergonha de falar e forneceu feedbacks imediatos. Por outro lado, como pontos fracos o estudo apontou que a imersão era ocasionalmente prejudicada por problemas técnicos, como instabilidade de rede, além da </w:t>
+      </w:r>
+      <w:commentRangeStart w:id="42"/>
+      <w:r>
+        <w:t xml:space="preserve">limitação metodológica </w:t>
+      </w:r>
+      <w:commentRangeEnd w:id="42"/>
+      <w:r>
+        <w:rPr>
+          <w:rStyle w:val="Refdecomentrio"/>
+          <w:sz w:val="20"/>
+          <w:szCs w:val="20"/>
+        </w:rPr>
+        <w:commentReference w:id="42"/>
+      </w:r>
+      <w:r>
+        <w:t>referente ao tamanho pequeno da amostra e à ausência de um grupo de controle.</w:t>
+      </w:r>
+      <w:r>
+        <w:t xml:space="preserve"> </w:t>
+      </w:r>
+      <w:r>
+        <w:t xml:space="preserve">Como principais resultados, os </w:t>
+      </w:r>
+      <w:commentRangeStart w:id="43"/>
+      <w:r>
+        <w:t>autores relataram</w:t>
+      </w:r>
+      <w:commentRangeEnd w:id="43"/>
+      <w:r>
+        <w:rPr>
+          <w:rStyle w:val="Refdecomentrio"/>
+          <w:sz w:val="20"/>
+          <w:szCs w:val="20"/>
+        </w:rPr>
+        <w:commentReference w:id="43"/>
+      </w:r>
+      <w:r>
+        <w:t xml:space="preserve"> uma melhoria significativa no desempenho geral de fala dos alunos, com progressos notáveis na fluência, vocabulário, pronúncia e gramática. </w:t>
       </w:r>
     </w:p>
     <w:p>
       <w:pPr>
-        <w:pStyle w:val="TF-TEXTO"/>
-      </w:pPr>
-      <w:r>
-        <w:t>O primeiro trabalho correlato, investiga o impacto de um ambiente de aprendizagem baseado em situações reais utilizando a plataforma de </w:t>
-      </w:r>
-      <w:r>
-        <w:t>R</w:t>
-      </w:r>
-      <w:r>
-        <w:t xml:space="preserve">ealidade </w:t>
-      </w:r>
-      <w:r>
-        <w:t>V</w:t>
-      </w:r>
-      <w:r>
-        <w:t>irtual </w:t>
-      </w:r>
-      <w:proofErr w:type="spellStart"/>
-      <w:r>
-        <w:t>Immerse</w:t>
-      </w:r>
-      <w:proofErr w:type="spellEnd"/>
-      <w:r>
-        <w:t>. A pesquisa se caracterizou pela utilização de atividades de </w:t>
-      </w:r>
-      <w:r>
-        <w:rPr>
-          <w:i/>
-          <w:iCs/>
-        </w:rPr>
-        <w:t>role-play</w:t>
-      </w:r>
-      <w:r>
-        <w:t xml:space="preserve"> (encenação), </w:t>
-      </w:r>
-      <w:r>
-        <w:t>na qual</w:t>
-      </w:r>
-      <w:r>
-        <w:t xml:space="preserve"> </w:t>
-      </w:r>
-      <w:r>
-        <w:t>mostrava situações comuns em que o inglês é necessário como fazer </w:t>
-      </w:r>
-      <w:r>
-        <w:rPr>
-          <w:i/>
-          <w:iCs/>
-        </w:rPr>
-        <w:t>check-in</w:t>
-      </w:r>
-      <w:r>
-        <w:t xml:space="preserve"> em aeroportos, pedir comida em restaurantes, realizar compras em lojas dentre outros cenários</w:t>
-      </w:r>
-      <w:r>
-        <w:t>.</w:t>
-      </w:r>
-    </w:p>
-    <w:p>
-      <w:pPr>
-        <w:pStyle w:val="TF-TEXTO"/>
-      </w:pPr>
-      <w:r>
-        <w:t>Como pontos fortes, o estudo destaca que o ambiente virtual fornece um contexto que simula a vida real, permit</w:t>
-      </w:r>
-      <w:r>
-        <w:t>indo</w:t>
-      </w:r>
-      <w:r>
-        <w:t xml:space="preserve"> que tenha várias pessoas em uma mesma cena interagindo entre si </w:t>
-      </w:r>
-      <w:r>
-        <w:t>e</w:t>
-      </w:r>
-      <w:r>
-        <w:t> com o cenário</w:t>
-      </w:r>
-      <w:r>
-        <w:t xml:space="preserve"> (Figura 1)</w:t>
-      </w:r>
-      <w:r>
-        <w:t>. Com isso, a ferramenta trouxe uma redução da ansiedade e vergonha de falar e forneceu feedbacks imediatos. Por outro lado, como pontos fracos o estudo apontou que a imersão era ocasionalmente prejudicada por problemas técnicos, como instabilidade de rede, além da limitação metodológica referente ao tamanho pequeno da amostra e à ausência de um grupo de controle.</w:t>
-      </w:r>
-      <w:r>
-        <w:t xml:space="preserve"> </w:t>
-      </w:r>
-      <w:r>
-        <w:t xml:space="preserve">Como principais resultados, os autores relataram uma melhoria significativa no desempenho geral de fala dos alunos, com progressos notáveis na fluência, vocabulário, pronúncia e gramática. </w:t>
-      </w:r>
-    </w:p>
-    <w:p>
-      <w:pPr>
         <w:pStyle w:val="TF-FIGURA"/>
       </w:pPr>
+      <w:commentRangeStart w:id="44"/>
       <w:r>
         <w:lastRenderedPageBreak/>
         <w:t xml:space="preserve">Figura </w:t>
       </w:r>
+      <w:commentRangeEnd w:id="44"/>
+      <w:r>
+        <w:rPr>
+          <w:rStyle w:val="Refdecomentrio"/>
+          <w:sz w:val="20"/>
+          <w:szCs w:val="20"/>
+        </w:rPr>
+        <w:commentReference w:id="44"/>
+      </w:r>
       <w:r>
         <w:fldChar w:fldCharType="begin"/>
       </w:r>
@@ -596,13 +779,34 @@
         <w:t xml:space="preserve"> </w:t>
       </w:r>
       <w:r>
-        <w:t xml:space="preserve">– Ambiente na plataforma </w:t>
-      </w:r>
-      <w:proofErr w:type="spellStart"/>
-      <w:r>
-        <w:t>Immerse</w:t>
-      </w:r>
-      <w:proofErr w:type="spellEnd"/>
+        <w:t xml:space="preserve">– </w:t>
+      </w:r>
+      <w:commentRangeStart w:id="45"/>
+      <w:commentRangeStart w:id="46"/>
+      <w:r>
+        <w:t xml:space="preserve">Ambiente </w:t>
+      </w:r>
+      <w:commentRangeEnd w:id="45"/>
+      <w:r>
+        <w:rPr>
+          <w:rStyle w:val="Refdecomentrio"/>
+          <w:sz w:val="20"/>
+          <w:szCs w:val="20"/>
+        </w:rPr>
+        <w:commentReference w:id="45"/>
+      </w:r>
+      <w:commentRangeEnd w:id="46"/>
+      <w:r>
+        <w:rPr>
+          <w:rStyle w:val="Refdecomentrio"/>
+          <w:sz w:val="20"/>
+          <w:szCs w:val="20"/>
+        </w:rPr>
+        <w:commentReference w:id="46"/>
+      </w:r>
+      <w:r>
+        <w:t>na plataforma Immerse</w:t>
+      </w:r>
     </w:p>
     <w:p>
       <w:pPr>
@@ -633,7 +837,7 @@
                     </pic:cNvPicPr>
                   </pic:nvPicPr>
                   <pic:blipFill>
-                    <a:blip r:embed="rId11" cstate="print">
+                    <a:blip r:embed="rId15" cstate="print">
                       <a:extLst>
                         <a:ext uri="{28A0092B-C50C-407E-A947-70E740481C1C}">
                           <a14:useLocalDpi xmlns:a14="http://schemas.microsoft.com/office/drawing/2010/main" val="0"/>
@@ -681,13 +885,44 @@
       <w:r>
         <w:t>Fonte: Yan; Lowell; Yang (2024)</w:t>
       </w:r>
+      <w:ins w:id="47" w:author="Dalton Solano dos Reis" w:date="2026-05-13T12:58:00Z" w16du:dateUtc="2026-05-13T15:58:00Z">
+        <w:r>
+          <w:t>.</w:t>
+        </w:r>
+      </w:ins>
     </w:p>
     <w:p>
       <w:pPr>
         <w:pStyle w:val="Ttulo2"/>
       </w:pPr>
-      <w:r>
-        <w:t xml:space="preserve">SEGUNDO TRABALHO CORRELATO </w:t>
+      <w:commentRangeStart w:id="48"/>
+      <w:r>
+        <w:t xml:space="preserve">SEGUNDO </w:t>
+      </w:r>
+      <w:commentRangeEnd w:id="48"/>
+      <w:r>
+        <w:rPr>
+          <w:rStyle w:val="Refdecomentrio"/>
+          <w:sz w:val="20"/>
+          <w:szCs w:val="20"/>
+        </w:rPr>
+        <w:commentReference w:id="48"/>
+      </w:r>
+      <w:commentRangeStart w:id="49"/>
+      <w:r>
+        <w:t xml:space="preserve">TRABALHO </w:t>
+      </w:r>
+      <w:commentRangeEnd w:id="49"/>
+      <w:r>
+        <w:rPr>
+          <w:rStyle w:val="Refdecomentrio"/>
+          <w:sz w:val="20"/>
+          <w:szCs w:val="20"/>
+        </w:rPr>
+        <w:commentReference w:id="49"/>
+      </w:r>
+      <w:r>
+        <w:t xml:space="preserve">CORRELATO </w:t>
       </w:r>
     </w:p>
     <w:p>
@@ -701,34 +936,76 @@
         <w:rPr>
           <w:rStyle w:val="normaltextrun"/>
         </w:rPr>
-        <w:t xml:space="preserve">O segundo trabalho correlato apresenta uma pesquisa bibliográfica exploratória com o objetivo de mapear estudos, tecnologias e aplicativos de </w:t>
-      </w:r>
+        <w:t xml:space="preserve">O segundo </w:t>
+      </w:r>
+      <w:commentRangeStart w:id="50"/>
       <w:r>
         <w:rPr>
           <w:rStyle w:val="normaltextrun"/>
         </w:rPr>
+        <w:t xml:space="preserve">trabalho </w:t>
+      </w:r>
+      <w:commentRangeEnd w:id="50"/>
+      <w:r>
+        <w:rPr>
+          <w:rStyle w:val="Refdecomentrio"/>
+          <w:sz w:val="20"/>
+          <w:szCs w:val="20"/>
+        </w:rPr>
+        <w:commentReference w:id="50"/>
+      </w:r>
+      <w:r>
+        <w:rPr>
+          <w:rStyle w:val="normaltextrun"/>
+        </w:rPr>
+        <w:t xml:space="preserve">correlato apresenta uma pesquisa bibliográfica exploratória com o objetivo de mapear estudos, tecnologias e aplicativos de </w:t>
+      </w:r>
+      <w:r>
+        <w:rPr>
+          <w:rStyle w:val="normaltextrun"/>
+        </w:rPr>
         <w:t xml:space="preserve">RV </w:t>
       </w:r>
       <w:r>
         <w:rPr>
           <w:rStyle w:val="normaltextrun"/>
         </w:rPr>
-        <w:t>direcionados à aprendizagem da língua inglesa. As características da pesquisa envolveram o levantamento de ferramentas do mercado, destacando aplicativos como o</w:t>
-      </w:r>
+        <w:t xml:space="preserve">direcionados à aprendizagem da língua inglesa. As características da pesquisa envolveram o levantamento de ferramentas do mercado, </w:t>
+      </w:r>
+      <w:commentRangeStart w:id="51"/>
       <w:r>
         <w:rPr>
           <w:rStyle w:val="normaltextrun"/>
         </w:rPr>
+        <w:t xml:space="preserve">destacando </w:t>
+      </w:r>
+      <w:commentRangeEnd w:id="51"/>
+      <w:r>
+        <w:rPr>
+          <w:rStyle w:val="Refdecomentrio"/>
+          <w:sz w:val="20"/>
+          <w:szCs w:val="20"/>
+        </w:rPr>
+        <w:commentReference w:id="51"/>
+      </w:r>
+      <w:r>
+        <w:rPr>
+          <w:rStyle w:val="normaltextrun"/>
+        </w:rPr>
+        <w:t>aplicativos como o</w:t>
+      </w:r>
+      <w:r>
+        <w:rPr>
+          <w:rStyle w:val="normaltextrun"/>
+        </w:rPr>
         <w:t xml:space="preserve"> </w:t>
       </w:r>
-      <w:proofErr w:type="spellStart"/>
       <w:r>
         <w:rPr>
           <w:rStyle w:val="normaltextrun"/>
         </w:rPr>
         <w:t>VirtualSpeech</w:t>
       </w:r>
-      <w:proofErr w:type="spellEnd"/>
       <w:r>
         <w:rPr>
           <w:rStyle w:val="normaltextrun"/>
@@ -753,11 +1030,17 @@
         </w:rPr>
         <w:t>de habilidades de comunicação corporativa, o ClassVR, </w:t>
       </w:r>
+      <w:commentRangeStart w:id="52"/>
       <w:r>
         <w:rPr>
           <w:rStyle w:val="normaltextrun"/>
-          <w:i/>
-          <w:iCs/>
+          <w:rPrChange w:id="53" w:author="Dalton Solano dos Reis" w:date="2026-05-13T13:00:00Z" w16du:dateUtc="2026-05-13T16:00:00Z">
+            <w:rPr>
+              <w:rStyle w:val="normaltextrun"/>
+              <w:i/>
+              <w:iCs/>
+            </w:rPr>
+          </w:rPrChange>
         </w:rPr>
         <w:t>hardware</w:t>
       </w:r>
@@ -767,6 +1050,15 @@
         </w:rPr>
         <w:t> com jogos</w:t>
       </w:r>
+      <w:commentRangeEnd w:id="52"/>
+      <w:r>
+        <w:rPr>
+          <w:rStyle w:val="Refdecomentrio"/>
+          <w:sz w:val="20"/>
+          <w:szCs w:val="20"/>
+        </w:rPr>
+        <w:commentReference w:id="52"/>
+      </w:r>
       <w:r>
         <w:rPr>
           <w:rStyle w:val="normaltextrun"/>
@@ -783,40 +1075,15 @@
         <w:rPr>
           <w:rStyle w:val="normaltextrun"/>
         </w:rPr>
-        <w:t> para escolas e o </w:t>
-      </w:r>
-      <w:proofErr w:type="spellStart"/>
-      <w:r>
-        <w:rPr>
-          <w:rStyle w:val="normaltextrun"/>
-        </w:rPr>
-        <w:t>Altspace</w:t>
-      </w:r>
-      <w:proofErr w:type="spellEnd"/>
-      <w:r>
-        <w:rPr>
-          <w:rStyle w:val="normaltextrun"/>
-        </w:rPr>
-        <w:t xml:space="preserve"> VR, um </w:t>
-      </w:r>
-      <w:proofErr w:type="spellStart"/>
-      <w:r>
-        <w:rPr>
-          <w:rStyle w:val="normaltextrun"/>
-        </w:rPr>
-        <w:t>metaverso</w:t>
-      </w:r>
-      <w:proofErr w:type="spellEnd"/>
-      <w:r>
-        <w:rPr>
-          <w:rStyle w:val="normaltextrun"/>
-        </w:rPr>
-        <w:t> que permite interações sociais globais por meio de avatares interativos.</w:t>
+        <w:t> para escolas e o Altspace VR, um metaverso que permite interações sociais globais por meio de avatares interativos.</w:t>
       </w:r>
     </w:p>
     <w:p>
       <w:pPr>
         <w:pStyle w:val="TF-FIGURA"/>
+        <w:rPr>
+          <w:ins w:id="54" w:author="Dalton Solano dos Reis" w:date="2026-05-13T13:18:00Z" w16du:dateUtc="2026-05-13T16:18:00Z"/>
+        </w:rPr>
       </w:pPr>
       <w:r>
         <w:t xml:space="preserve">Figura </w:t>
@@ -849,13 +1116,29 @@
         <w:t xml:space="preserve">– </w:t>
       </w:r>
       <w:r>
-        <w:t xml:space="preserve">Simulação de entrevista de emprego na plataforma </w:t>
-      </w:r>
-      <w:proofErr w:type="spellStart"/>
-      <w:r>
-        <w:t>VirtualSpeech</w:t>
-      </w:r>
-      <w:proofErr w:type="spellEnd"/>
+        <w:t>Simulação de entrevista de emprego na plataforma VirtualSpeech</w:t>
+      </w:r>
+    </w:p>
+    <w:p>
+      <w:pPr>
+        <w:keepNext w:val="0"/>
+        <w:keepLines w:val="0"/>
+        <w:rPr>
+          <w:ins w:id="55" w:author="Dalton Solano dos Reis" w:date="2026-05-13T13:18:00Z" w16du:dateUtc="2026-05-13T16:18:00Z"/>
+          <w:sz w:val="20"/>
+          <w:szCs w:val="20"/>
+        </w:rPr>
+      </w:pPr>
+      <w:ins w:id="56" w:author="Dalton Solano dos Reis" w:date="2026-05-13T13:18:00Z" w16du:dateUtc="2026-05-13T16:18:00Z">
+        <w:r>
+          <w:br w:type="page"/>
+        </w:r>
+      </w:ins>
+    </w:p>
+    <w:p>
+      <w:pPr>
+        <w:pStyle w:val="TF-FIGURA"/>
+      </w:pPr>
     </w:p>
     <w:p>
       <w:pPr>
@@ -869,12 +1152,43 @@
         <w:rPr>
           <w:noProof/>
         </w:rPr>
+        <w:fldChar w:fldCharType="begin"/>
       </w:r>
       <w:r>
         <w:rPr>
           <w:noProof/>
         </w:rPr>
-        <w:pict w14:anchorId="32D02EB2">
+        <w:instrText xml:space="preserve"> INCLUDEPICTURE  "https://virtualspeech-com.b-cdn.net/wp-content/uploads/interview-upload-resume.jpg" \* MERGEFORMATINET </w:instrText>
+      </w:r>
+      <w:r>
+        <w:rPr>
+          <w:noProof/>
+        </w:rPr>
+        <w:fldChar w:fldCharType="separate"/>
+      </w:r>
+      <w:r>
+        <w:rPr>
+          <w:noProof/>
+        </w:rPr>
+        <w:fldChar w:fldCharType="begin"/>
+      </w:r>
+      <w:r>
+        <w:rPr>
+          <w:noProof/>
+        </w:rPr>
+        <w:instrText xml:space="preserve"> INCLUDEPICTURE  "https://virtualspeech-com.b-cdn.net/wp-content/uploads/interview-upload-resume.jpg" \* MERGEFORMATINET </w:instrText>
+      </w:r>
+      <w:r>
+        <w:rPr>
+          <w:noProof/>
+        </w:rPr>
+        <w:fldChar w:fldCharType="separate"/>
+      </w:r>
+      <w:r>
+        <w:rPr>
+          <w:noProof/>
+        </w:rPr>
+        <w:pict w14:anchorId="6312F3AD">
           <v:shapetype id="_x0000_t75" coordsize="21600,21600" o:spt="75" o:preferrelative="t" path="m@4@5l@4@11@9@11@9@5xe" filled="f" stroked="f">
             <v:stroke joinstyle="miter"/>
             <v:formulas>
@@ -894,8 +1208,8 @@
             <v:path o:extrusionok="f" gradientshapeok="t" o:connecttype="rect"/>
             <o:lock v:ext="edit" aspectratio="t"/>
           </v:shapetype>
-          <v:shape id="_x0000_i1025" type="#_x0000_t75" alt="" style="width:305.4pt;height:168.85pt" o:bordertopcolor="this" o:borderleftcolor="this" o:borderbottomcolor="this" o:borderrightcolor="this">
-            <v:imagedata r:id="rId12" r:href="rId13"/>
+          <v:shape id="_x0000_i1026" type="#_x0000_t75" alt="" style="width:305.1pt;height:169.2pt;mso-width-percent:0;mso-height-percent:0;mso-width-percent:0;mso-height-percent:0" o:bordertopcolor="this" o:borderleftcolor="this" o:borderbottomcolor="this" o:borderrightcolor="this">
+            <v:imagedata r:id="rId16" r:href="rId17"/>
             <w10:bordertop type="single" width="2"/>
             <w10:borderleft type="single" width="2"/>
             <w10:borderbottom type="single" width="2"/>
@@ -903,6 +1217,18 @@
           </v:shape>
         </w:pict>
       </w:r>
+      <w:r>
+        <w:rPr>
+          <w:noProof/>
+        </w:rPr>
+        <w:fldChar w:fldCharType="end"/>
+      </w:r>
+      <w:r>
+        <w:rPr>
+          <w:noProof/>
+        </w:rPr>
+        <w:fldChar w:fldCharType="end"/>
+      </w:r>
     </w:p>
     <w:p>
       <w:pPr>
@@ -912,16 +1238,13 @@
         </w:rPr>
       </w:pPr>
       <w:r>
-        <w:t xml:space="preserve">Fonte: </w:t>
-      </w:r>
-      <w:proofErr w:type="spellStart"/>
-      <w:r>
-        <w:t>VirtualSpeech</w:t>
-      </w:r>
-      <w:proofErr w:type="spellEnd"/>
-      <w:r>
-        <w:t xml:space="preserve"> (2026)</w:t>
-      </w:r>
+        <w:t>Fonte: VirtualSpeech (2026)</w:t>
+      </w:r>
+      <w:ins w:id="57" w:author="Dalton Solano dos Reis" w:date="2026-05-13T13:05:00Z" w16du:dateUtc="2026-05-13T16:05:00Z">
+        <w:r>
+          <w:t>.</w:t>
+        </w:r>
+      </w:ins>
     </w:p>
     <w:p>
       <w:pPr>
@@ -987,8 +1310,18 @@
       <w:pPr>
         <w:pStyle w:val="Ttulo2"/>
       </w:pPr>
+      <w:commentRangeStart w:id="58"/>
       <w:r>
         <w:t>TERCEIRO </w:t>
+      </w:r>
+      <w:commentRangeEnd w:id="58"/>
+      <w:r>
+        <w:rPr>
+          <w:rStyle w:val="Refdecomentrio"/>
+          <w:sz w:val="20"/>
+          <w:szCs w:val="20"/>
+        </w:rPr>
+        <w:commentReference w:id="58"/>
       </w:r>
       <w:r>
         <w:t xml:space="preserve">TRABALHO CORRELATO </w:t>
@@ -1005,61 +1338,63 @@
         <w:rPr>
           <w:rStyle w:val="normaltextrun"/>
         </w:rPr>
-        <w:t>O terceiro trabalho correlato consiste em um estudo prático que investiga as mudanças na motivação, no engajamento, no desempenho e no raciocínio espacial dos alunos ao longo do tempo, operando em diferentes níveis de imersão em RV. A metodologia se caracterizou pela comparação da aprendizagem de alunos explorando o sistema solar no software Titans of Space</w:t>
-      </w:r>
+        <w:t xml:space="preserve">O terceiro </w:t>
+      </w:r>
+      <w:commentRangeStart w:id="59"/>
       <w:r>
         <w:rPr>
           <w:rStyle w:val="normaltextrun"/>
         </w:rPr>
-        <w:t xml:space="preserve"> (Figura 3)</w:t>
+        <w:t xml:space="preserve">trabalho </w:t>
+      </w:r>
+      <w:commentRangeEnd w:id="59"/>
+      <w:r>
+        <w:rPr>
+          <w:rStyle w:val="Refdecomentrio"/>
+          <w:sz w:val="20"/>
+          <w:szCs w:val="20"/>
+        </w:rPr>
+        <w:commentReference w:id="59"/>
       </w:r>
       <w:r>
         <w:rPr>
           <w:rStyle w:val="normaltextrun"/>
         </w:rPr>
-        <w:t xml:space="preserve"> ao longo de três sessões, alternando entre um ambiente de imersão moderada com o </w:t>
-      </w:r>
-      <w:proofErr w:type="spellStart"/>
+        <w:t>correlato consiste em um estudo prático que investiga as mudanças na motivação, no engajamento, no desempenho e no raciocínio espacial dos alunos ao longo do tempo, operando em diferentes níveis de imersão em RV. A metodologia se caracterizou pela comparação da aprendizagem de alunos explorando o sistema solar no software </w:t>
+      </w:r>
+      <w:commentRangeStart w:id="60"/>
       <w:r>
         <w:rPr>
           <w:rStyle w:val="normaltextrun"/>
         </w:rPr>
-        <w:t>Oculus</w:t>
-      </w:r>
-      <w:proofErr w:type="spellEnd"/>
+        <w:t>Titans of Space</w:t>
+      </w:r>
       <w:r>
         <w:rPr>
           <w:rStyle w:val="normaltextrun"/>
         </w:rPr>
-        <w:t> Go e um de alta imersão com o </w:t>
-      </w:r>
-      <w:proofErr w:type="spellStart"/>
+        <w:t xml:space="preserve"> </w:t>
+      </w:r>
+      <w:commentRangeEnd w:id="60"/>
+      <w:r>
+        <w:rPr>
+          <w:rStyle w:val="Refdecomentrio"/>
+          <w:sz w:val="20"/>
+          <w:szCs w:val="20"/>
+        </w:rPr>
+        <w:commentReference w:id="60"/>
+      </w:r>
       <w:r>
         <w:rPr>
           <w:rStyle w:val="normaltextrun"/>
         </w:rPr>
-        <w:t>Oculus</w:t>
-      </w:r>
-      <w:proofErr w:type="spellEnd"/>
+        <w:t>(Figura 3)</w:t>
+      </w:r>
       <w:r>
         <w:rPr>
           <w:rStyle w:val="normaltextrun"/>
         </w:rPr>
-        <w:t> </w:t>
-      </w:r>
-      <w:proofErr w:type="spellStart"/>
-      <w:r>
-        <w:rPr>
-          <w:rStyle w:val="normaltextrun"/>
-        </w:rPr>
-        <w:t>Rift</w:t>
-      </w:r>
-      <w:proofErr w:type="spellEnd"/>
-      <w:r>
-        <w:rPr>
-          <w:rStyle w:val="normaltextrun"/>
-        </w:rPr>
-        <w:t>.</w:t>
+        <w:t xml:space="preserve"> ao longo de três sessões, alternando entre um ambiente de imersão moderada com o Oculus Go e um de alta imersão com o Oculus Rift.</w:t>
       </w:r>
     </w:p>
     <w:p>
@@ -1067,7 +1402,6 @@
         <w:pStyle w:val="TF-FIGURA"/>
       </w:pPr>
       <w:r>
-        <w:lastRenderedPageBreak/>
         <w:t xml:space="preserve">Figura </w:t>
       </w:r>
       <w:r>
@@ -1101,14 +1435,45 @@
         <w:rPr>
           <w:noProof/>
         </w:rPr>
+        <w:fldChar w:fldCharType="begin"/>
       </w:r>
       <w:r>
         <w:rPr>
           <w:noProof/>
         </w:rPr>
-        <w:pict w14:anchorId="6E4B925F">
-          <v:shape id="_x0000_i1026" type="#_x0000_t75" alt="Captura de ecrã n.º 3" style="width:317.8pt;height:181.25pt" o:bordertopcolor="this" o:borderleftcolor="this" o:borderbottomcolor="this" o:borderrightcolor="this">
-            <v:imagedata r:id="rId14" r:href="rId15"/>
+        <w:instrText xml:space="preserve"> INCLUDEPICTURE  "https://shared.akamai.steamstatic.com/store_item_assets/steam/apps/468820/ss_acac82dde7df6f7383e606cd61d3fd4476bfecc8.1920x1080.jpg?t=1586980270" \* MERGEFORMATINET </w:instrText>
+      </w:r>
+      <w:r>
+        <w:rPr>
+          <w:noProof/>
+        </w:rPr>
+        <w:fldChar w:fldCharType="separate"/>
+      </w:r>
+      <w:r>
+        <w:rPr>
+          <w:noProof/>
+        </w:rPr>
+        <w:fldChar w:fldCharType="begin"/>
+      </w:r>
+      <w:r>
+        <w:rPr>
+          <w:noProof/>
+        </w:rPr>
+        <w:instrText xml:space="preserve"> INCLUDEPICTURE  "https://shared.akamai.steamstatic.com/store_item_assets/steam/apps/468820/ss_acac82dde7df6f7383e606cd61d3fd4476bfecc8.1920x1080.jpg?t=1586980270" \* MERGEFORMATINET </w:instrText>
+      </w:r>
+      <w:r>
+        <w:rPr>
+          <w:noProof/>
+        </w:rPr>
+        <w:fldChar w:fldCharType="separate"/>
+      </w:r>
+      <w:r>
+        <w:rPr>
+          <w:noProof/>
+        </w:rPr>
+        <w:pict w14:anchorId="555F454B">
+          <v:shape id="_x0000_i1025" type="#_x0000_t75" alt="Captura de ecrã n.º 3" style="width:317.7pt;height:181pt;mso-width-percent:0;mso-height-percent:0;mso-width-percent:0;mso-height-percent:0" o:bordertopcolor="this" o:borderleftcolor="this" o:borderbottomcolor="this" o:borderrightcolor="this">
+            <v:imagedata r:id="rId18" r:href="rId19"/>
             <w10:bordertop type="single" width="2"/>
             <w10:borderleft type="single" width="2"/>
             <w10:borderbottom type="single" width="2"/>
@@ -1116,6 +1481,18 @@
           </v:shape>
         </w:pict>
       </w:r>
+      <w:r>
+        <w:rPr>
+          <w:noProof/>
+        </w:rPr>
+        <w:fldChar w:fldCharType="end"/>
+      </w:r>
+      <w:r>
+        <w:rPr>
+          <w:noProof/>
+        </w:rPr>
+        <w:fldChar w:fldCharType="end"/>
+      </w:r>
     </w:p>
     <w:p>
       <w:pPr>
@@ -1125,16 +1502,13 @@
         </w:rPr>
       </w:pPr>
       <w:r>
-        <w:t xml:space="preserve">Fonte: </w:t>
-      </w:r>
-      <w:proofErr w:type="spellStart"/>
-      <w:r>
-        <w:t>Steam</w:t>
-      </w:r>
-      <w:proofErr w:type="spellEnd"/>
-      <w:r>
-        <w:t xml:space="preserve"> (2019)</w:t>
-      </w:r>
+        <w:t>Fonte: Steam (2019)</w:t>
+      </w:r>
+      <w:ins w:id="61" w:author="Dalton Solano dos Reis" w:date="2026-05-13T13:07:00Z" w16du:dateUtc="2026-05-13T16:07:00Z">
+        <w:r>
+          <w:t>.</w:t>
+        </w:r>
+      </w:ins>
     </w:p>
     <w:p>
       <w:pPr>
@@ -1213,21 +1587,28 @@
         <w:rPr>
           <w:rStyle w:val="normaltextrun"/>
         </w:rPr>
-        <w:t xml:space="preserve"> (que diz que o interesse diminui após o primeiro contato) não se aplica nesse caso, mostrando que o engajamento permaneceu alto ao longo das múltiplas sessões, com desempenho de aprendizagem consistente e ganhos no raciocínio espacial dos participantes. </w:t>
+        <w:t xml:space="preserve"> (que diz que o interesse diminui após o primeiro contato) não se aplica nesse caso, mostrando que o engajamento permaneceu </w:t>
+      </w:r>
+      <w:r>
+        <w:rPr>
+          <w:rStyle w:val="normaltextrun"/>
+        </w:rPr>
+        <w:lastRenderedPageBreak/>
+        <w:t>alto ao longo das múltiplas sessões, com desempenho de aprendizagem consistente e ganhos no raciocínio espacial dos participantes. </w:t>
       </w:r>
     </w:p>
     <w:p>
       <w:pPr>
         <w:pStyle w:val="Ttulo1"/>
       </w:pPr>
-      <w:bookmarkStart w:id="24" w:name="_Toc54164921"/>
-      <w:bookmarkStart w:id="25" w:name="_Toc54165675"/>
-      <w:bookmarkStart w:id="26" w:name="_Toc54169333"/>
-      <w:bookmarkStart w:id="27" w:name="_Toc96347439"/>
-      <w:bookmarkStart w:id="28" w:name="_Toc96357723"/>
-      <w:bookmarkStart w:id="29" w:name="_Toc96491866"/>
-      <w:bookmarkStart w:id="30" w:name="_Toc411603107"/>
-      <w:bookmarkEnd w:id="23"/>
+      <w:bookmarkStart w:id="62" w:name="_Toc54164921"/>
+      <w:bookmarkStart w:id="63" w:name="_Toc54165675"/>
+      <w:bookmarkStart w:id="64" w:name="_Toc54169333"/>
+      <w:bookmarkStart w:id="65" w:name="_Toc96347439"/>
+      <w:bookmarkStart w:id="66" w:name="_Toc96357723"/>
+      <w:bookmarkStart w:id="67" w:name="_Toc96491866"/>
+      <w:bookmarkStart w:id="68" w:name="_Toc411603107"/>
+      <w:bookmarkEnd w:id="30"/>
       <w:r>
         <w:t>proposta</w:t>
       </w:r>
@@ -1236,14 +1617,66 @@
       <w:pPr>
         <w:pStyle w:val="TF-TEXTO"/>
       </w:pPr>
-      <w:r>
-        <w:t xml:space="preserve">Este capítulo descreve a proposta de desenvolvimento de um jogo em </w:t>
+      <w:del w:id="69" w:author="Dalton Solano dos Reis" w:date="2026-05-13T13:10:00Z" w16du:dateUtc="2026-05-13T16:10:00Z">
+        <w:r>
+          <w:delText>Este capítulo</w:delText>
+        </w:r>
+      </w:del>
+      <w:ins w:id="70" w:author="Dalton Solano dos Reis" w:date="2026-05-13T13:10:00Z" w16du:dateUtc="2026-05-13T16:10:00Z">
+        <w:r>
+          <w:t>Esta seção</w:t>
+        </w:r>
+      </w:ins>
+      <w:r>
+        <w:t xml:space="preserve"> descreve a proposta de desenvolvimento de um </w:t>
+      </w:r>
+      <w:commentRangeStart w:id="71"/>
+      <w:r>
+        <w:t xml:space="preserve">jogo </w:t>
+      </w:r>
+      <w:commentRangeEnd w:id="71"/>
+      <w:r>
+        <w:rPr>
+          <w:rStyle w:val="Refdecomentrio"/>
+          <w:sz w:val="20"/>
+          <w:szCs w:val="20"/>
+        </w:rPr>
+        <w:commentReference w:id="71"/>
+      </w:r>
+      <w:r>
+        <w:t xml:space="preserve">em </w:t>
       </w:r>
       <w:r>
         <w:t>RV</w:t>
       </w:r>
       <w:r>
-        <w:t xml:space="preserve"> voltado para o estímulo da comunicação oral em língua inglesa. Nas seções a seguir, o leitor encontrará a justificativa que fundamenta a relevância do estudo em relação aos trabalhos correlatos previamente analisados</w:t>
+        <w:t xml:space="preserve"> voltado para o estímulo da comunicação oral em língua inglesa. Nas </w:t>
+      </w:r>
+      <w:del w:id="72" w:author="Dalton Solano dos Reis" w:date="2026-05-13T13:11:00Z" w16du:dateUtc="2026-05-13T16:11:00Z">
+        <w:r>
+          <w:delText xml:space="preserve">seções </w:delText>
+        </w:r>
+      </w:del>
+      <w:ins w:id="73" w:author="Dalton Solano dos Reis" w:date="2026-05-13T13:11:00Z" w16du:dateUtc="2026-05-13T16:11:00Z">
+        <w:r>
+          <w:t>subseções</w:t>
+        </w:r>
+        <w:r>
+          <w:t xml:space="preserve"> </w:t>
+        </w:r>
+      </w:ins>
+      <w:del w:id="74" w:author="Dalton Solano dos Reis" w:date="2026-05-13T13:12:00Z" w16du:dateUtc="2026-05-13T16:12:00Z">
+        <w:r>
+          <w:delText xml:space="preserve">a seguir, o leitor encontrará </w:delText>
+        </w:r>
+      </w:del>
+      <w:ins w:id="75" w:author="Dalton Solano dos Reis" w:date="2026-05-13T13:12:00Z" w16du:dateUtc="2026-05-13T16:12:00Z">
+        <w:r>
+          <w:t xml:space="preserve">seguintes encontram-se </w:t>
+        </w:r>
+      </w:ins>
+      <w:r>
+        <w:t>a justificativa que fundamenta a relevância do estudo em relação aos trabalhos correlatos previamente analisados</w:t>
       </w:r>
       <w:r>
         <w:t xml:space="preserve"> e</w:t>
@@ -1256,13 +1689,13 @@
       <w:pPr>
         <w:pStyle w:val="Ttulo2"/>
       </w:pPr>
-      <w:bookmarkStart w:id="31" w:name="_Toc54164915"/>
-      <w:bookmarkStart w:id="32" w:name="_Toc54165669"/>
-      <w:bookmarkStart w:id="33" w:name="_Toc54169327"/>
-      <w:bookmarkStart w:id="34" w:name="_Toc96347433"/>
-      <w:bookmarkStart w:id="35" w:name="_Toc96357717"/>
-      <w:bookmarkStart w:id="36" w:name="_Toc96491860"/>
-      <w:bookmarkStart w:id="37" w:name="_Toc351015594"/>
+      <w:bookmarkStart w:id="76" w:name="_Toc54164915"/>
+      <w:bookmarkStart w:id="77" w:name="_Toc54165669"/>
+      <w:bookmarkStart w:id="78" w:name="_Toc54169327"/>
+      <w:bookmarkStart w:id="79" w:name="_Toc96347433"/>
+      <w:bookmarkStart w:id="80" w:name="_Toc96357717"/>
+      <w:bookmarkStart w:id="81" w:name="_Toc96491860"/>
+      <w:bookmarkStart w:id="82" w:name="_Toc351015594"/>
       <w:r>
         <w:t>JUSTIFICATIVA</w:t>
       </w:r>
@@ -1271,17 +1704,29 @@
       <w:pPr>
         <w:pStyle w:val="TF-TEXTO"/>
       </w:pPr>
-      <w:r>
-        <w:t>Para fundamentar a abordagem escolhida, o Quadro 1 apresenta um comparativo entre as principais características dos trabalhos correlatos analisados. </w:t>
+      <w:commentRangeStart w:id="83"/>
+      <w:r>
+        <w:t xml:space="preserve">Para </w:t>
+      </w:r>
+      <w:commentRangeEnd w:id="83"/>
+      <w:r>
+        <w:rPr>
+          <w:rStyle w:val="Refdecomentrio"/>
+          <w:sz w:val="20"/>
+          <w:szCs w:val="20"/>
+        </w:rPr>
+        <w:commentReference w:id="83"/>
+      </w:r>
+      <w:r>
+        <w:t>fundamentar a abordagem escolhida, o Quadro 1 apresenta um comparativo entre as principais características dos trabalhos correlatos analisados. </w:t>
       </w:r>
     </w:p>
     <w:p>
       <w:pPr>
         <w:pStyle w:val="TF-LEGENDA"/>
       </w:pPr>
-      <w:bookmarkStart w:id="38" w:name="_Ref52025161"/>
-      <w:r>
-        <w:lastRenderedPageBreak/>
+      <w:bookmarkStart w:id="84" w:name="_Ref52025161"/>
+      <w:r>
         <w:t xml:space="preserve">Quadro </w:t>
       </w:r>
       <w:r>
@@ -1305,9 +1750,25 @@
         </w:rPr>
         <w:fldChar w:fldCharType="end"/>
       </w:r>
-      <w:bookmarkEnd w:id="38"/>
-      <w:r>
-        <w:t xml:space="preserve"> - Características dos trabalhos correlatos</w:t>
+      <w:bookmarkEnd w:id="84"/>
+      <w:r>
+        <w:t xml:space="preserve"> - </w:t>
+      </w:r>
+      <w:commentRangeStart w:id="85"/>
+      <w:r>
+        <w:t xml:space="preserve">Características </w:t>
+      </w:r>
+      <w:commentRangeEnd w:id="85"/>
+      <w:r>
+        <w:rPr>
+          <w:rStyle w:val="Refdecomentrio"/>
+          <w:sz w:val="20"/>
+          <w:szCs w:val="20"/>
+        </w:rPr>
+        <w:commentReference w:id="85"/>
+      </w:r>
+      <w:r>
+        <w:t>dos trabalhos correlatos</w:t>
       </w:r>
     </w:p>
     <w:tbl>
@@ -1574,15 +2035,7 @@
               <w:jc w:val="center"/>
             </w:pPr>
             <w:r>
-              <w:t xml:space="preserve">Leal; Costa; </w:t>
-            </w:r>
-            <w:proofErr w:type="spellStart"/>
-            <w:r>
-              <w:t>Freschi</w:t>
-            </w:r>
-            <w:proofErr w:type="spellEnd"/>
-            <w:r>
-              <w:t xml:space="preserve"> (2021)</w:t>
+              <w:t>Leal; Costa; Freschi (2021)</w:t>
             </w:r>
           </w:p>
         </w:tc>
@@ -1826,11 +2279,31 @@
             <w:pPr>
               <w:pStyle w:val="TF-TEXTOQUADRO"/>
             </w:pPr>
+            <w:commentRangeStart w:id="86"/>
+            <w:commentRangeStart w:id="87"/>
             <w:r>
               <w:t>Interação oral co</w:t>
             </w:r>
             <w:r>
               <w:t>m personagens com Inteligência Artificial (IA)</w:t>
+            </w:r>
+            <w:commentRangeEnd w:id="86"/>
+            <w:r>
+              <w:rPr>
+                <w:rStyle w:val="Refdecomentrio"/>
+                <w:sz w:val="20"/>
+                <w:szCs w:val="20"/>
+              </w:rPr>
+              <w:commentReference w:id="86"/>
+            </w:r>
+            <w:commentRangeEnd w:id="87"/>
+            <w:r>
+              <w:rPr>
+                <w:rStyle w:val="Refdecomentrio"/>
+                <w:sz w:val="20"/>
+                <w:szCs w:val="20"/>
+              </w:rPr>
+              <w:commentReference w:id="87"/>
             </w:r>
           </w:p>
         </w:tc>
@@ -1950,28 +2423,12 @@
             <w:pPr>
               <w:pStyle w:val="TF-TEXTOQUADRO"/>
             </w:pPr>
-            <w:proofErr w:type="spellStart"/>
             <w:r>
               <w:rPr>
                 <w:lang w:val="en-US"/>
               </w:rPr>
-              <w:t>Experimento</w:t>
+              <w:t>Experimento quantitativo</w:t>
             </w:r>
-            <w:proofErr w:type="spellEnd"/>
-            <w:r>
-              <w:rPr>
-                <w:lang w:val="en-US"/>
-              </w:rPr>
-              <w:t xml:space="preserve"> </w:t>
-            </w:r>
-            <w:proofErr w:type="spellStart"/>
-            <w:r>
-              <w:rPr>
-                <w:lang w:val="en-US"/>
-              </w:rPr>
-              <w:t>quantitativo</w:t>
-            </w:r>
-            <w:proofErr w:type="spellEnd"/>
           </w:p>
         </w:tc>
       </w:tr>
@@ -2286,7 +2743,20 @@
         <w:t>,</w:t>
       </w:r>
       <w:r>
-        <w:t xml:space="preserve"> como entrevistas e vídeos ao longo de 6 semanas, evidenciando os benefícios da prática oral continuada, embora não tenha focado no desenvolvimento de um software autônomo</w:t>
+        <w:t xml:space="preserve"> como entrevistas e vídeos ao longo de 6 semanas, evidenciando os benefícios da prática oral continuada, embora não tenha focado no </w:t>
+      </w:r>
+      <w:commentRangeStart w:id="88"/>
+      <w:r>
+        <w:t>desenvolvimento de um software autônomo</w:t>
+      </w:r>
+      <w:commentRangeEnd w:id="88"/>
+      <w:r>
+        <w:rPr>
+          <w:rStyle w:val="Refdecomentrio"/>
+          <w:sz w:val="20"/>
+          <w:szCs w:val="20"/>
+        </w:rPr>
+        <w:commentReference w:id="88"/>
       </w:r>
       <w:r>
         <w:t>.</w:t>
@@ -2297,15 +2767,13 @@
         <w:pStyle w:val="TF-TEXTO"/>
       </w:pPr>
       <w:r>
-        <w:t xml:space="preserve">Em contrapartida, a pesquisa de Leal, Costa e </w:t>
-      </w:r>
-      <w:proofErr w:type="spellStart"/>
-      <w:r>
-        <w:t>Freschi</w:t>
-      </w:r>
-      <w:proofErr w:type="spellEnd"/>
-      <w:r>
-        <w:t xml:space="preserve"> (2021) </w:t>
+        <w:t xml:space="preserve">Em contrapartida, a pesquisa de </w:t>
+      </w:r>
+      <w:r>
+        <w:t>Leal, Costa e Freschi (2021</w:t>
+      </w:r>
+      <w:r>
+        <w:t xml:space="preserve">) </w:t>
       </w:r>
       <w:r>
         <w:t>não tem foco</w:t>
@@ -2353,6 +2821,7 @@
         <w:pStyle w:val="TF-TEXTO"/>
       </w:pPr>
       <w:r>
+        <w:lastRenderedPageBreak/>
         <w:t>Nesse contexto</w:t>
       </w:r>
       <w:r>
@@ -2366,15 +2835,7 @@
         <w:t>et al</w:t>
       </w:r>
       <w:r>
-        <w:t xml:space="preserve">., 2021) e para a redução da ansiedade na fala (Yan; Lowell; Yang, 2024), os estudos práticos ainda dependem de interações humanas síncronas e os mapeamentos tecnológicos (Leal; Costa; </w:t>
-      </w:r>
-      <w:proofErr w:type="spellStart"/>
-      <w:r>
-        <w:t>Freschi</w:t>
-      </w:r>
-      <w:proofErr w:type="spellEnd"/>
-      <w:r>
-        <w:t xml:space="preserve">, 2021) apontam a carência de soluções puramente lúdicas. Assim, </w:t>
+        <w:t xml:space="preserve">., 2021) e para a redução da ansiedade na fala (Yan; Lowell; Yang, 2024), os estudos práticos ainda dependem de interações humanas síncronas e os mapeamentos tecnológicos (Leal; Costa; Freschi, 2021) apontam a carência de soluções puramente lúdicas. Assim, </w:t>
       </w:r>
       <w:r>
         <w:t>a proposta de um jogo</w:t>
@@ -2393,7 +2854,23 @@
         <w:t>Escape Room</w:t>
       </w:r>
       <w:r>
-        <w:t xml:space="preserve"> ambientado em um mundo mágico se justifica por preencher uma lacuna metodológica e técnica. Ao invés de simular um diálogo aberto que exige interpretação humana ou um alto custo com processamento de IA, o protótipo utilizará mecânicas de comandos de voz fechados</w:t>
+        <w:t xml:space="preserve"> </w:t>
+      </w:r>
+      <w:commentRangeStart w:id="89"/>
+      <w:r>
+        <w:t xml:space="preserve">ambientado em um mundo mágico </w:t>
+      </w:r>
+      <w:commentRangeEnd w:id="89"/>
+      <w:r>
+        <w:rPr>
+          <w:rStyle w:val="Refdecomentrio"/>
+          <w:sz w:val="20"/>
+          <w:szCs w:val="20"/>
+        </w:rPr>
+        <w:commentReference w:id="89"/>
+      </w:r>
+      <w:r>
+        <w:t>se justifica por preencher uma lacuna metodológica e técnica. Ao invés de simular um diálogo aberto que exige interpretação humana ou um alto custo com processamento de IA, o protótipo utilizará mecânicas de comandos de voz fechados</w:t>
       </w:r>
       <w:r>
         <w:t>.</w:t>
@@ -2407,7 +2884,6 @@
       <w:r>
         <w:t>ssa abordagem técnica (</w:t>
       </w:r>
-      <w:proofErr w:type="spellStart"/>
       <w:r>
         <w:rPr>
           <w:i/>
@@ -2415,7 +2891,6 @@
         </w:rPr>
         <w:t>Speech-to-Text</w:t>
       </w:r>
-      <w:proofErr w:type="spellEnd"/>
       <w:r>
         <w:t>) permite que o sistema valide automaticamente a pronúncia e dispare eventos no jogo, promovendo a autonomia do jogador.</w:t>
       </w:r>
@@ -2429,22 +2904,37 @@
       </w:pPr>
       <w:r>
         <w:tab/>
-        <w:t>Cientificamente, o trabalho contribui para entender como um jogo em RV pode reduzir o medo de errar em alunos de inglês e motivá-los a apreender enquanto se divertem. Do ponto de vista prático, a contribuição consiste em entregar um protótipo funcional para o Meta Quest 3S que sirva como uma ferramenta imersiva, autônoma e acessível para que os alunos pratiquem o idioma em um ambiente seguro, lúdico e divertido. </w:t>
+        <w:t xml:space="preserve">Cientificamente, o trabalho contribui para entender como um jogo em RV pode reduzir o medo de </w:t>
+      </w:r>
+      <w:commentRangeStart w:id="90"/>
+      <w:r>
+        <w:t>errar em alunos de inglês </w:t>
+      </w:r>
+      <w:commentRangeEnd w:id="90"/>
+      <w:r>
+        <w:rPr>
+          <w:rStyle w:val="Refdecomentrio"/>
+          <w:sz w:val="20"/>
+          <w:szCs w:val="20"/>
+        </w:rPr>
+        <w:commentReference w:id="90"/>
+      </w:r>
+      <w:r>
+        <w:t>e motivá-los a apreender enquanto se divertem. Do ponto de vista prático, a contribuição consiste em entregar um protótipo funcional para o Meta Quest 3S que sirva como uma ferramenta imersiva, autônoma e acessível para que os alunos pratiquem o idioma em um ambiente seguro, lúdico e divertido. </w:t>
       </w:r>
     </w:p>
-    <w:bookmarkEnd w:id="31"/>
-    <w:bookmarkEnd w:id="32"/>
-    <w:bookmarkEnd w:id="33"/>
-    <w:bookmarkEnd w:id="34"/>
-    <w:bookmarkEnd w:id="35"/>
-    <w:bookmarkEnd w:id="36"/>
-    <w:bookmarkEnd w:id="37"/>
+    <w:bookmarkEnd w:id="76"/>
+    <w:bookmarkEnd w:id="77"/>
+    <w:bookmarkEnd w:id="78"/>
+    <w:bookmarkEnd w:id="79"/>
+    <w:bookmarkEnd w:id="80"/>
+    <w:bookmarkEnd w:id="81"/>
+    <w:bookmarkEnd w:id="82"/>
     <w:p>
       <w:pPr>
         <w:pStyle w:val="Ttulo2"/>
       </w:pPr>
       <w:r>
-        <w:lastRenderedPageBreak/>
         <w:t>METODOLOGIA</w:t>
       </w:r>
     </w:p>
@@ -2453,7 +2943,23 @@
         <w:pStyle w:val="TF-TEXTO"/>
       </w:pPr>
       <w:r>
-        <w:t>A metodologia para a concepção deste estudo baseia-se na prototipação e validação de software educacional. O trabalho será desenvolvido observando as seguintes etapas:</w:t>
+        <w:t xml:space="preserve">A metodologia para a concepção </w:t>
+      </w:r>
+      <w:commentRangeStart w:id="91"/>
+      <w:r>
+        <w:t xml:space="preserve">deste estudo </w:t>
+      </w:r>
+      <w:commentRangeEnd w:id="91"/>
+      <w:r>
+        <w:rPr>
+          <w:rStyle w:val="Refdecomentrio"/>
+          <w:sz w:val="20"/>
+          <w:szCs w:val="20"/>
+        </w:rPr>
+        <w:commentReference w:id="91"/>
+      </w:r>
+      <w:r>
+        <w:t>baseia-se na prototipação e validação de software educacional. O trabalho será desenvolvido observando as seguintes etapas:</w:t>
       </w:r>
       <w:r>
         <w:t> </w:t>
@@ -2491,633 +2997,763 @@
       <w:r>
         <w:t>ngloba o levantamento de requisitos, a seleção do vocabulário em inglês (feitiços e pistas) e o desenho dos </w:t>
       </w:r>
-      <w:proofErr w:type="spellStart"/>
       <w:r>
         <w:rPr>
           <w:i/>
           <w:iCs/>
         </w:rPr>
-        <w:t>puzzles</w:t>
-      </w:r>
-      <w:proofErr w:type="spellEnd"/>
+        <w:t>puzzles </w:t>
+      </w:r>
+      <w:r>
+        <w:t>(</w:t>
+      </w:r>
       <w:r>
         <w:rPr>
           <w:i/>
           <w:iCs/>
         </w:rPr>
-        <w:t> </w:t>
-      </w:r>
-      <w:r>
-        <w:t>(</w:t>
-      </w:r>
-      <w:proofErr w:type="spellStart"/>
+        <w:t>level design</w:t>
+      </w:r>
+      <w:r>
+        <w:t>) do </w:t>
+      </w:r>
       <w:r>
         <w:rPr>
           <w:i/>
           <w:iCs/>
         </w:rPr>
-        <w:t>level</w:t>
-      </w:r>
-      <w:proofErr w:type="spellEnd"/>
+        <w:t>Escape Room</w:t>
+      </w:r>
+      <w:r>
+        <w:t>;</w:t>
+      </w:r>
+    </w:p>
+    <w:p>
+      <w:pPr>
+        <w:pStyle w:val="TF-ALNEA"/>
+      </w:pPr>
+      <w:r>
+        <w:t>m</w:t>
+      </w:r>
+      <w:r>
+        <w:t xml:space="preserve">odelagem e </w:t>
+      </w:r>
+      <w:r>
+        <w:t>c</w:t>
+      </w:r>
+      <w:r>
+        <w:t xml:space="preserve">onfiguração do </w:t>
+      </w:r>
+      <w:r>
+        <w:t>a</w:t>
+      </w:r>
+      <w:r>
+        <w:t xml:space="preserve">mbiente: </w:t>
+      </w:r>
+      <w:r>
+        <w:t>e</w:t>
+      </w:r>
+      <w:r>
+        <w:t>nvolve a importação e configuração de </w:t>
+      </w:r>
       <w:r>
         <w:rPr>
           <w:i/>
           <w:iCs/>
         </w:rPr>
-        <w:t> design</w:t>
-      </w:r>
-      <w:r>
-        <w:t>) do </w:t>
+        <w:t>assets</w:t>
+      </w:r>
+      <w:r>
+        <w:t> 3D (cenário, objetos interativos</w:t>
+      </w:r>
+      <w:ins w:id="92" w:author="Dalton Solano dos Reis" w:date="2026-05-14T09:24:00Z" w16du:dateUtc="2026-05-14T12:24:00Z">
+        <w:r>
+          <w:t xml:space="preserve"> e</w:t>
+        </w:r>
+      </w:ins>
+      <w:del w:id="93" w:author="Dalton Solano dos Reis" w:date="2026-05-14T09:24:00Z" w16du:dateUtc="2026-05-14T12:24:00Z">
+        <w:r>
+          <w:delText>,</w:delText>
+        </w:r>
+      </w:del>
+      <w:r>
+        <w:t xml:space="preserve"> livro de feitiços) no motor Unity, bem como a configuração da iluminação e física básica</w:t>
+      </w:r>
+      <w:r>
+        <w:t>;</w:t>
+      </w:r>
+      <w:r>
+        <w:t> </w:t>
+      </w:r>
+    </w:p>
+    <w:p>
+      <w:pPr>
+        <w:pStyle w:val="TF-ALNEA"/>
+      </w:pPr>
+      <w:del w:id="94" w:author="Dalton Solano dos Reis" w:date="2026-05-14T09:25:00Z" w16du:dateUtc="2026-05-14T12:25:00Z">
+        <w:r>
+          <w:delText xml:space="preserve">Implementação </w:delText>
+        </w:r>
+      </w:del>
+      <w:ins w:id="95" w:author="Dalton Solano dos Reis" w:date="2026-05-14T09:25:00Z" w16du:dateUtc="2026-05-14T12:25:00Z">
+        <w:r>
+          <w:t>i</w:t>
+        </w:r>
+        <w:r>
+          <w:t xml:space="preserve">mplementação </w:t>
+        </w:r>
+      </w:ins>
+      <w:r>
+        <w:t xml:space="preserve">da </w:t>
+      </w:r>
+      <w:del w:id="96" w:author="Dalton Solano dos Reis" w:date="2026-05-14T09:25:00Z" w16du:dateUtc="2026-05-14T12:25:00Z">
+        <w:r>
+          <w:delText xml:space="preserve">Mecânica </w:delText>
+        </w:r>
+      </w:del>
+      <w:ins w:id="97" w:author="Dalton Solano dos Reis" w:date="2026-05-14T09:25:00Z" w16du:dateUtc="2026-05-14T12:25:00Z">
+        <w:r>
+          <w:t>m</w:t>
+        </w:r>
+        <w:r>
+          <w:t xml:space="preserve">ecânica </w:t>
+        </w:r>
+      </w:ins>
+      <w:r>
+        <w:t xml:space="preserve">em RV: </w:t>
+      </w:r>
+      <w:del w:id="98" w:author="Dalton Solano dos Reis" w:date="2026-05-14T09:25:00Z" w16du:dateUtc="2026-05-14T12:25:00Z">
+        <w:r>
+          <w:delText xml:space="preserve">Consiste </w:delText>
+        </w:r>
+      </w:del>
+      <w:ins w:id="99" w:author="Dalton Solano dos Reis" w:date="2026-05-14T09:25:00Z" w16du:dateUtc="2026-05-14T12:25:00Z">
+        <w:r>
+          <w:t>c</w:t>
+        </w:r>
+        <w:r>
+          <w:t xml:space="preserve">onsiste </w:t>
+        </w:r>
+      </w:ins>
+      <w:r>
+        <w:t>na programação em C# dos scripts de interação usando o SDK do Meta Quest (pegar, jogar</w:t>
+      </w:r>
+      <w:del w:id="100" w:author="Dalton Solano dos Reis" w:date="2026-05-14T09:25:00Z" w16du:dateUtc="2026-05-14T12:25:00Z">
+        <w:r>
+          <w:delText xml:space="preserve">, </w:delText>
+        </w:r>
+      </w:del>
+      <w:ins w:id="101" w:author="Dalton Solano dos Reis" w:date="2026-05-14T09:25:00Z" w16du:dateUtc="2026-05-14T12:25:00Z">
+        <w:r>
+          <w:t xml:space="preserve"> e</w:t>
+        </w:r>
+        <w:r>
+          <w:t xml:space="preserve"> </w:t>
+        </w:r>
+      </w:ins>
+      <w:r>
+        <w:t>ler) e a integração da API de reconhecimento de voz (</w:t>
       </w:r>
       <w:r>
         <w:rPr>
           <w:i/>
           <w:iCs/>
         </w:rPr>
-        <w:t xml:space="preserve">Escape </w:t>
-      </w:r>
-      <w:proofErr w:type="spellStart"/>
+        <w:t>Speech-to-Text</w:t>
+      </w:r>
+      <w:r>
+        <w:t>)</w:t>
+      </w:r>
+      <w:r>
+        <w:t>;</w:t>
+      </w:r>
+    </w:p>
+    <w:p>
+      <w:pPr>
+        <w:pStyle w:val="TF-ALNEA"/>
+      </w:pPr>
+      <w:commentRangeStart w:id="102"/>
+      <w:del w:id="103" w:author="Dalton Solano dos Reis" w:date="2026-05-14T09:25:00Z" w16du:dateUtc="2026-05-14T12:25:00Z">
+        <w:r>
+          <w:delText xml:space="preserve">Testes </w:delText>
+        </w:r>
+      </w:del>
+      <w:ins w:id="104" w:author="Dalton Solano dos Reis" w:date="2026-05-14T09:25:00Z" w16du:dateUtc="2026-05-14T12:25:00Z">
+        <w:r>
+          <w:t>t</w:t>
+        </w:r>
+        <w:r>
+          <w:t xml:space="preserve">estes </w:t>
+        </w:r>
+      </w:ins>
+      <w:commentRangeEnd w:id="102"/>
+      <w:r>
+        <w:rPr>
+          <w:rStyle w:val="Refdecomentrio"/>
+          <w:sz w:val="20"/>
+          <w:szCs w:val="20"/>
+        </w:rPr>
+        <w:commentReference w:id="102"/>
+      </w:r>
+      <w:r>
+        <w:t xml:space="preserve">de </w:t>
+      </w:r>
+      <w:del w:id="105" w:author="Dalton Solano dos Reis" w:date="2026-05-14T09:25:00Z" w16du:dateUtc="2026-05-14T12:25:00Z">
+        <w:r>
+          <w:delText xml:space="preserve">Integração </w:delText>
+        </w:r>
+      </w:del>
+      <w:ins w:id="106" w:author="Dalton Solano dos Reis" w:date="2026-05-14T09:25:00Z" w16du:dateUtc="2026-05-14T12:25:00Z">
+        <w:r>
+          <w:t>i</w:t>
+        </w:r>
+        <w:r>
+          <w:t xml:space="preserve">ntegração </w:t>
+        </w:r>
+      </w:ins>
+      <w:r>
+        <w:t xml:space="preserve">e </w:t>
+      </w:r>
+      <w:del w:id="107" w:author="Dalton Solano dos Reis" w:date="2026-05-14T09:25:00Z" w16du:dateUtc="2026-05-14T12:25:00Z">
+        <w:r>
+          <w:delText>Ajustes</w:delText>
+        </w:r>
+      </w:del>
+      <w:ins w:id="108" w:author="Dalton Solano dos Reis" w:date="2026-05-14T09:25:00Z" w16du:dateUtc="2026-05-14T12:25:00Z">
+        <w:r>
+          <w:t>a</w:t>
+        </w:r>
+        <w:r>
+          <w:t>justes</w:t>
+        </w:r>
+      </w:ins>
+      <w:r>
+        <w:t xml:space="preserve">: </w:t>
+      </w:r>
+      <w:del w:id="109" w:author="Dalton Solano dos Reis" w:date="2026-05-14T09:25:00Z" w16du:dateUtc="2026-05-14T12:25:00Z">
+        <w:r>
+          <w:delText xml:space="preserve">Realização </w:delText>
+        </w:r>
+      </w:del>
+      <w:ins w:id="110" w:author="Dalton Solano dos Reis" w:date="2026-05-14T09:25:00Z" w16du:dateUtc="2026-05-14T12:25:00Z">
+        <w:r>
+          <w:t>r</w:t>
+        </w:r>
+        <w:r>
+          <w:t xml:space="preserve">ealização </w:t>
+        </w:r>
+      </w:ins>
+      <w:r>
+        <w:t>de testes internos para verificar a precisão do reconhecimento de voz com sotaques brasileiros, correção de </w:t>
+      </w:r>
       <w:r>
         <w:rPr>
           <w:i/>
           <w:iCs/>
         </w:rPr>
-        <w:t>Room</w:t>
-      </w:r>
-      <w:proofErr w:type="spellEnd"/>
-      <w:r>
-        <w:t>;</w:t>
+        <w:t>bugs </w:t>
+      </w:r>
+      <w:r>
+        <w:t>de física e otimização de desempenho para o Meta Quest 3S. </w:t>
       </w:r>
     </w:p>
     <w:p>
       <w:pPr>
-        <w:pStyle w:val="TF-ALNEA"/>
-      </w:pPr>
+        <w:pStyle w:val="Ttulo1"/>
+      </w:pPr>
+      <w:r>
+        <w:t>REVISÃO BIBLIOGRÁFICA</w:t>
+      </w:r>
+    </w:p>
+    <w:p>
+      <w:pPr>
+        <w:pStyle w:val="TF-TEXTO"/>
+      </w:pPr>
+      <w:del w:id="111" w:author="Dalton Solano dos Reis" w:date="2026-05-14T09:26:00Z" w16du:dateUtc="2026-05-14T12:26:00Z">
+        <w:r>
+          <w:delText>Este capítulo</w:delText>
+        </w:r>
+      </w:del>
+      <w:ins w:id="112" w:author="Dalton Solano dos Reis" w:date="2026-05-14T09:26:00Z" w16du:dateUtc="2026-05-14T12:26:00Z">
+        <w:r>
+          <w:t>Esta seção</w:t>
+        </w:r>
+      </w:ins>
+      <w:r>
+        <w:t xml:space="preserve"> apresenta os principais conceitos teóricos que fundamentam o desenvolvimento deste estudo</w:t>
+      </w:r>
+      <w:r>
+        <w:t>, sendo dividida</w:t>
+      </w:r>
+      <w:r>
+        <w:t xml:space="preserve"> em três principais</w:t>
+      </w:r>
+      <w:r>
+        <w:t xml:space="preserve"> assuntos</w:t>
+      </w:r>
+      <w:r>
+        <w:t xml:space="preserve">: </w:t>
+      </w:r>
+      <w:del w:id="113" w:author="Dalton Solano dos Reis" w:date="2026-05-14T09:26:00Z" w16du:dateUtc="2026-05-14T12:26:00Z">
+        <w:r>
+          <w:delText xml:space="preserve">o primeiro </w:delText>
+        </w:r>
+      </w:del>
+      <w:r>
+        <w:t xml:space="preserve">aborda os desafios do ensino da língua inglesa e a </w:t>
+      </w:r>
+      <w:r>
+        <w:t>dificuldade</w:t>
+      </w:r>
+      <w:r>
+        <w:t xml:space="preserve"> na pro</w:t>
+      </w:r>
+      <w:r>
+        <w:t>ficiência</w:t>
+      </w:r>
+      <w:r>
+        <w:t xml:space="preserve"> oral; </w:t>
+      </w:r>
+      <w:del w:id="114" w:author="Dalton Solano dos Reis" w:date="2026-05-14T09:27:00Z" w16du:dateUtc="2026-05-14T12:27:00Z">
+        <w:r>
+          <w:delText xml:space="preserve">o segundo </w:delText>
+        </w:r>
+      </w:del>
+      <w:ins w:id="115" w:author="Dalton Solano dos Reis" w:date="2026-05-14T09:27:00Z" w16du:dateUtc="2026-05-14T12:27:00Z">
+        <w:r>
+          <w:t xml:space="preserve">como </w:t>
+        </w:r>
+      </w:ins>
+      <w:r>
+        <w:t xml:space="preserve">explora o uso da </w:t>
+      </w:r>
+      <w:r>
+        <w:t>RV</w:t>
+      </w:r>
+      <w:r>
+        <w:t xml:space="preserve"> e dos Jogos Educacionais como ferramentas imersivas de aprendizagem e</w:t>
+      </w:r>
+      <w:ins w:id="116" w:author="Dalton Solano dos Reis" w:date="2026-05-14T09:27:00Z" w16du:dateUtc="2026-05-14T12:27:00Z">
+        <w:r>
+          <w:t>,</w:t>
+        </w:r>
+      </w:ins>
+      <w:r>
+        <w:t xml:space="preserve"> </w:t>
+      </w:r>
+      <w:del w:id="117" w:author="Dalton Solano dos Reis" w:date="2026-05-14T09:27:00Z" w16du:dateUtc="2026-05-14T12:27:00Z">
+        <w:r>
+          <w:delText>o terceiro foca n</w:delText>
+        </w:r>
+      </w:del>
+      <w:r>
+        <w:t>as tecnologias de reconhecimento de voz aplicadas a ambientes simulados.</w:t>
+      </w:r>
+    </w:p>
+    <w:p>
+      <w:pPr>
+        <w:pStyle w:val="Ttulo2"/>
+      </w:pPr>
+      <w:r>
+        <w:t>Ensino de Língua Inglesa e o Bloqueio na Oralidade</w:t>
+      </w:r>
+    </w:p>
+    <w:p>
+      <w:pPr>
+        <w:pStyle w:val="TF-TEXTO"/>
+      </w:pPr>
+      <w:r>
+        <w:t>O domínio da fala numa língua estrangeira é frequentemente considerado uma das competências mais complexas de se alcançar</w:t>
+      </w:r>
+      <w:r>
+        <w:t xml:space="preserve"> </w:t>
+      </w:r>
+      <w:r>
+        <w:t>(Yan; Lowell; Yang, 2024)</w:t>
+      </w:r>
+      <w:r>
+        <w:t>. Segundo Yan, Lowell e Yang (2024), a comunicação oral exige o uso simultâneo de múltiplas habilidades linguísticas, incluindo vocabulário, gramática, pronúncia e fluência, além da capacidade de compreensão auditiva. No contexto globa</w:t>
+      </w:r>
+      <w:r>
+        <w:t>l</w:t>
+      </w:r>
+      <w:r>
+        <w:t>, muitos estudantes atingem níveis avançados de leitura e escrita, mas enfrentam um forte bloqueio no momento de se expressarem oralmente</w:t>
+      </w:r>
+      <w:r>
+        <w:t>, o que</w:t>
+      </w:r>
+      <w:r>
+        <w:t xml:space="preserve"> está intimamente ligado a fatores psicológicos, ambientais e cognitivos</w:t>
+      </w:r>
+      <w:r>
+        <w:t xml:space="preserve"> </w:t>
+      </w:r>
+      <w:r>
+        <w:t>(Yan; Lowell; Yang, 2024)</w:t>
+      </w:r>
+      <w:r>
+        <w:t xml:space="preserve">. </w:t>
+      </w:r>
+    </w:p>
+    <w:p>
+      <w:pPr>
+        <w:pStyle w:val="TF-TEXTO"/>
+      </w:pPr>
+      <w:r>
+        <w:t>Yan, Lowell e Yang (2024) destacam que as dificuldades no desenvolvimento da fala derivam, em grande parte, do medo de cometer erros, da baixa autoconfiança e da ansiedade de falar em uma língua estrangeira. No ambiente de sala de aula tradicional, os alunos sentem-se frequentemente expostos ao julgamento, o que inibe a prática voluntária</w:t>
+      </w:r>
+      <w:r>
+        <w:t xml:space="preserve"> </w:t>
+      </w:r>
+      <w:r>
+        <w:t>(Yan; Lowell; Yang, 2024)</w:t>
+      </w:r>
+      <w:r>
+        <w:t xml:space="preserve">. Sales, Ribeiro e Procópio (2024) </w:t>
+      </w:r>
+      <w:r>
+        <w:t>mostram</w:t>
+      </w:r>
+      <w:r>
+        <w:t xml:space="preserve"> a importância da atenção direcionada na </w:t>
+      </w:r>
+      <w:commentRangeStart w:id="118"/>
+      <w:r>
+        <w:t>aquisição lexical</w:t>
+      </w:r>
+      <w:commentRangeEnd w:id="118"/>
+      <w:r>
+        <w:rPr>
+          <w:rStyle w:val="Refdecomentrio"/>
+          <w:sz w:val="20"/>
+          <w:szCs w:val="20"/>
+        </w:rPr>
+        <w:commentReference w:id="118"/>
+      </w:r>
+      <w:r>
+        <w:t>, notando que a falta de estímulos multimodais no ensino convencional</w:t>
+      </w:r>
+      <w:r>
+        <w:t xml:space="preserve"> não</w:t>
+      </w:r>
+      <w:r>
+        <w:t xml:space="preserve"> </w:t>
+      </w:r>
+      <w:r>
+        <w:t xml:space="preserve">prende a </w:t>
+      </w:r>
+      <w:r>
+        <w:t>atenção do aluno para o objeto de aprendizagem, prejudicando a retenção a curto e longo prazo. Sem um vocabulário consolidado e sem ambientes de aprendizagem situados, o aluno não encontra as ferramentas nem as oportunidades adequadas para praticar a fala fora do contexto escolar</w:t>
+      </w:r>
+      <w:r>
+        <w:t xml:space="preserve"> (Yan; Lowell; Yang, 2024)</w:t>
+      </w:r>
+      <w:r>
+        <w:t>.</w:t>
+      </w:r>
+    </w:p>
+    <w:p>
+      <w:pPr>
+        <w:pStyle w:val="Ttulo2"/>
+      </w:pPr>
+      <w:r>
+        <w:t>Realidade Virtual e Jogos Educacionais</w:t>
+      </w:r>
+    </w:p>
+    <w:p>
+      <w:pPr>
+        <w:pStyle w:val="TF-TEXTO"/>
+      </w:pPr>
+      <w:r>
+        <w:t xml:space="preserve">Diante das limitações do ensino tradicional em providenciar contextos reais de imersão, a tecnologia surge como uma alternativa viável e transformadora. A </w:t>
+      </w:r>
+      <w:r>
+        <w:t>RV</w:t>
+      </w:r>
+      <w:r>
+        <w:t xml:space="preserve"> é definida como uma interface avançada que proporciona ao utilizador a visualização, movimentação e interação em tempo real dentro de um ambiente tridimensional (Leal; Costa; Freschi, 2021). De acordo com Ramos e Borges Júnior (2024), a RV tem-se destacado como uma ferramenta inovadora na educação, transformando a forma como os alunos aprendem e os professores ensinam, ao permitir a exploração de conceitos complexos de forma prática, dinâmica e significativa.</w:t>
+      </w:r>
+    </w:p>
+    <w:p>
+      <w:pPr>
+        <w:pStyle w:val="TF-TEXTO"/>
+      </w:pPr>
+      <w:r>
+        <w:lastRenderedPageBreak/>
+        <w:t xml:space="preserve">A utilização da RV aliada aos Jogos Educacionais (ou </w:t>
+      </w:r>
+      <w:r>
+        <w:t>Jogos Sérios</w:t>
+      </w:r>
+      <w:r>
+        <w:t>) potencializa</w:t>
+      </w:r>
       <w:r>
         <w:t>m</w:t>
       </w:r>
       <w:r>
-        <w:t xml:space="preserve">odelagem e </w:t>
-      </w:r>
-      <w:r>
-        <w:t>c</w:t>
-      </w:r>
-      <w:r>
-        <w:t xml:space="preserve">onfiguração do </w:t>
-      </w:r>
-      <w:r>
-        <w:t>a</w:t>
-      </w:r>
-      <w:r>
-        <w:t xml:space="preserve">mbiente: </w:t>
-      </w:r>
-      <w:r>
-        <w:t>e</w:t>
-      </w:r>
-      <w:r>
-        <w:t>nvolve a importação e configuração de </w:t>
-      </w:r>
-      <w:proofErr w:type="spellStart"/>
+        <w:t xml:space="preserve"> os resultados pedagógicos através do envolvimento e da atenção</w:t>
+      </w:r>
+      <w:r>
+        <w:t xml:space="preserve"> </w:t>
+      </w:r>
+      <w:r>
+        <w:t>(Sales; Ribeiro; Procópio, 2024)</w:t>
+      </w:r>
+      <w:r>
+        <w:t xml:space="preserve">. Sales, Ribeiro e Procópio (2024) demonstram que </w:t>
+      </w:r>
+      <w:r>
+        <w:t>ambientes ricos em estímulos visuais, sonoros e interativos</w:t>
+      </w:r>
+      <w:r>
+        <w:t xml:space="preserve">, também chamados de </w:t>
+      </w:r>
+      <w:r>
+        <w:t>hipermodais</w:t>
+      </w:r>
+      <w:r>
+        <w:t>, combinados</w:t>
+      </w:r>
+      <w:r>
+        <w:t xml:space="preserve"> com </w:t>
+      </w:r>
+      <w:r>
+        <w:t xml:space="preserve">uma </w:t>
+      </w:r>
+      <w:r>
+        <w:t xml:space="preserve">imersão </w:t>
+      </w:r>
+      <w:r>
+        <w:t>de</w:t>
+      </w:r>
+      <w:r>
+        <w:t xml:space="preserve"> 360</w:t>
+      </w:r>
+      <w:r>
+        <w:t>º proporcionada por óculos de RV,</w:t>
+      </w:r>
+      <w:r>
+        <w:t xml:space="preserve"> funcionam como facilitadores da aprendizagem, uma vez que ajudam a direcionar a atenção do aluno e promovem a motivação, fatores essenciais para a aquisição lexical e linguística. Complementarmente, num estudo sobre os níveis de imersão, Huang </w:t>
+      </w:r>
       <w:r>
         <w:rPr>
           <w:i/>
           <w:iCs/>
         </w:rPr>
-        <w:t>assets</w:t>
-      </w:r>
-      <w:proofErr w:type="spellEnd"/>
-      <w:r>
-        <w:t> 3D (cenário, objetos interativos, livro de feitiços) no motor Unity, bem como a configuração da iluminação e física básica</w:t>
-      </w:r>
-      <w:r>
-        <w:t>;</w:t>
-      </w:r>
-      <w:r>
-        <w:t> </w:t>
+        <w:t xml:space="preserve">et al. </w:t>
+      </w:r>
+      <w:r>
+        <w:t xml:space="preserve">(2021) comprovaram que a utilização de ambientes de alta imersão (com óculos de RV) eleva significativamente a motivação intrínseca dos utilizadores. Ao incorporar elementos de gamificação, o processo de aprendizagem deixa de ser uma tarefa árdua e passa a ser uma experiência lúdica, mantendo os alunos motivados ao longo de múltiplas sessões (Huang </w:t>
+      </w:r>
+      <w:r>
+        <w:rPr>
+          <w:i/>
+          <w:iCs/>
+        </w:rPr>
+        <w:t>et al.</w:t>
+      </w:r>
+      <w:r>
+        <w:t>, 2021).</w:t>
       </w:r>
     </w:p>
     <w:p>
       <w:pPr>
-        <w:pStyle w:val="TF-ALNEA"/>
-      </w:pPr>
-      <w:r>
-        <w:t>Implementação da Mecânica em RV: Consiste na programação em C# dos scripts de interação usando o SDK do Meta Quest (pegar, jogar, ler) e a integração da API de reconhecimento de voz (</w:t>
-      </w:r>
-      <w:proofErr w:type="spellStart"/>
+        <w:pStyle w:val="Ttulo2"/>
+      </w:pPr>
+      <w:r>
+        <w:t>Interação por Voz em Ambientes Virtuais</w:t>
+      </w:r>
+    </w:p>
+    <w:p>
+      <w:pPr>
+        <w:pStyle w:val="TF-TEXTO"/>
+      </w:pPr>
+      <w:r>
+        <w:t xml:space="preserve">Para que a </w:t>
+      </w:r>
+      <w:r>
+        <w:t>RV</w:t>
+      </w:r>
+      <w:r>
+        <w:t xml:space="preserve"> atinja o seu potencial máximo no ensino de idiomas, a interatividade precisa ir além do contacto visual e da exploração espacial</w:t>
+      </w:r>
+      <w:r>
+        <w:t xml:space="preserve"> </w:t>
+      </w:r>
+      <w:r>
+        <w:t>(Ramos; Borges Júnior, 2024)</w:t>
+      </w:r>
+      <w:r>
+        <w:t xml:space="preserve">. A imersão genuína requer que o aluno deixe de ser um observador passivo para se tornar um agente ativo no ambiente de aprendizagem (Ramos; Borges Júnior, 2024). A simulação de ambientes sociais por meio da RV oferece aos alunos um </w:t>
+      </w:r>
+      <w:r>
+        <w:t>“</w:t>
+      </w:r>
+      <w:r>
+        <w:t>espaço seguro</w:t>
+      </w:r>
+      <w:r>
+        <w:t>”</w:t>
+      </w:r>
+      <w:r>
+        <w:t xml:space="preserve"> para praticar, eliminando o receio de retaliação social ou constrangimento que ocorreria no mundo físico (Leal; Costa; Freschi, 2021).</w:t>
+      </w:r>
+    </w:p>
+    <w:p>
+      <w:pPr>
+        <w:pStyle w:val="TF-TEXTO"/>
+      </w:pPr>
+      <w:r>
+        <w:t>Neste sentido, a tecnologia de reconhecimento de fala (</w:t>
+      </w:r>
       <w:r>
         <w:rPr>
           <w:i/>
           <w:iCs/>
         </w:rPr>
+        <w:t>Speech Recognition</w:t>
+      </w:r>
+      <w:r>
+        <w:t xml:space="preserve"> ou </w:t>
+      </w:r>
+      <w:r>
+        <w:rPr>
+          <w:i/>
+          <w:iCs/>
+        </w:rPr>
         <w:t>Speech-to-Text</w:t>
       </w:r>
-      <w:proofErr w:type="spellEnd"/>
-      <w:r>
-        <w:t>)</w:t>
-      </w:r>
-      <w:r>
-        <w:t>;</w:t>
+      <w:r>
+        <w:t>) aplicada a personagens não jogáveis (</w:t>
+      </w:r>
+      <w:r>
+        <w:t xml:space="preserve">Non-Playable Character - </w:t>
+      </w:r>
+      <w:r>
+        <w:t>NPCs) e sistemas automatizados eleva a autonomia do estudante</w:t>
+      </w:r>
+      <w:r>
+        <w:t xml:space="preserve"> </w:t>
+      </w:r>
+      <w:r>
+        <w:t>(Leal; Costa; Freschi, 2021)</w:t>
+      </w:r>
+      <w:r>
+        <w:t xml:space="preserve">. Em vez de depender de interações síncronas com professores como ocorre </w:t>
+      </w:r>
+      <w:r>
+        <w:t xml:space="preserve">em </w:t>
+      </w:r>
+      <w:r>
+        <w:t>algumas plataformas de metaverso, a integração de comandos de voz permite que o próprio sistema valide a pronúncia e o contexto da fala do jogador</w:t>
+      </w:r>
+      <w:r>
+        <w:t xml:space="preserve"> (Leal; Costa; Freschi, 2021)</w:t>
+      </w:r>
+      <w:r>
+        <w:t xml:space="preserve">. Ao </w:t>
+      </w:r>
+      <w:r>
+        <w:t>ajuntar</w:t>
+      </w:r>
+      <w:r>
+        <w:t xml:space="preserve"> o vocabulário retido através da imersão à necessidade de verbalizar ações para progredir no jogo, o sistema reforça a repetição e a correção em tempo real</w:t>
+      </w:r>
+      <w:r>
+        <w:t xml:space="preserve"> </w:t>
+      </w:r>
+      <w:r>
+        <w:t>(Sales; Ribeiro; Procópio, 2024)</w:t>
+      </w:r>
+      <w:r>
+        <w:t xml:space="preserve">. Esta abordagem não só estimula a quebra do bloqueio oral de forma </w:t>
+      </w:r>
+      <w:r>
+        <w:t>aut</w:t>
+      </w:r>
+      <w:r>
+        <w:t>ô</w:t>
+      </w:r>
+      <w:r>
+        <w:t>noma</w:t>
+      </w:r>
+      <w:r>
+        <w:t>, como também garante que o foco educacional se mantém aliado à diversão proporcionada pelo jogo</w:t>
+      </w:r>
+      <w:r>
+        <w:t xml:space="preserve"> </w:t>
+      </w:r>
+      <w:r>
+        <w:t xml:space="preserve">(Huang </w:t>
+      </w:r>
+      <w:r>
+        <w:rPr>
+          <w:i/>
+          <w:iCs/>
+        </w:rPr>
+        <w:t>et al.</w:t>
+      </w:r>
+      <w:r>
+        <w:t>, 2021)</w:t>
+      </w:r>
+      <w:r>
+        <w:t>.</w:t>
       </w:r>
     </w:p>
     <w:p>
       <w:pPr>
-        <w:pStyle w:val="TF-ALNEA"/>
-      </w:pPr>
-      <w:r>
-        <w:t>Testes de Integração e Ajustes: Realização de testes internos para verificar a precisão do reconhecimento de voz com sotaques brasileiros, correção de </w:t>
-      </w:r>
-      <w:r>
-        <w:rPr>
-          <w:i/>
-          <w:iCs/>
-        </w:rPr>
-        <w:t>bugs </w:t>
-      </w:r>
-      <w:r>
-        <w:t>de física e otimização de desempenho para o Meta Quest 3S. </w:t>
+        <w:pStyle w:val="TF-refernciasbibliogrficasTTULO"/>
+        <w:rPr>
+          <w:lang w:val="en-US"/>
+        </w:rPr>
+      </w:pPr>
+      <w:bookmarkStart w:id="119" w:name="_Toc351015602"/>
+      <w:bookmarkEnd w:id="62"/>
+      <w:bookmarkEnd w:id="63"/>
+      <w:bookmarkEnd w:id="64"/>
+      <w:bookmarkEnd w:id="65"/>
+      <w:bookmarkEnd w:id="66"/>
+      <w:bookmarkEnd w:id="67"/>
+      <w:bookmarkEnd w:id="68"/>
+      <w:commentRangeStart w:id="120"/>
+      <w:r>
+        <w:rPr>
+          <w:lang w:val="en-US"/>
+        </w:rPr>
+        <w:t>Referências</w:t>
+      </w:r>
+      <w:bookmarkEnd w:id="119"/>
+      <w:commentRangeEnd w:id="120"/>
+      <w:r>
+        <w:rPr>
+          <w:rStyle w:val="Refdecomentrio"/>
+          <w:sz w:val="20"/>
+          <w:szCs w:val="20"/>
+          <w:lang w:val="en-US"/>
+        </w:rPr>
+        <w:commentReference w:id="120"/>
       </w:r>
     </w:p>
     <w:p>
       <w:pPr>
-        <w:pStyle w:val="Ttulo1"/>
-      </w:pPr>
-      <w:r>
-        <w:t>REVISÃO BIBLIOGRÁFICA</w:t>
-      </w:r>
-    </w:p>
-    <w:p>
-      <w:pPr>
-        <w:pStyle w:val="TF-TEXTO"/>
-      </w:pPr>
-      <w:r>
-        <w:t>Este capítulo apresenta os principais conceitos teóricos que fundamentam o desenvolvimento deste estudo</w:t>
-      </w:r>
-      <w:r>
-        <w:t>, sendo dividida</w:t>
-      </w:r>
-      <w:r>
-        <w:t xml:space="preserve"> em três principais</w:t>
-      </w:r>
-      <w:r>
-        <w:t xml:space="preserve"> assuntos</w:t>
-      </w:r>
-      <w:r>
-        <w:t xml:space="preserve">: o primeiro aborda os desafios do ensino da língua inglesa e a </w:t>
-      </w:r>
-      <w:r>
-        <w:t>dificuldade</w:t>
-      </w:r>
-      <w:r>
-        <w:t xml:space="preserve"> na pro</w:t>
-      </w:r>
-      <w:r>
-        <w:t>ficiência</w:t>
-      </w:r>
-      <w:r>
-        <w:t xml:space="preserve"> oral; o segundo explora o uso da </w:t>
-      </w:r>
-      <w:r>
-        <w:t>RV</w:t>
-      </w:r>
-      <w:r>
-        <w:t xml:space="preserve"> e dos Jogos Educacionais como ferramentas imersivas de aprendizagem e o terceiro foca nas tecnologias de reconhecimento de voz aplicadas a ambientes simulados.</w:t>
-      </w:r>
-    </w:p>
-    <w:p>
-      <w:pPr>
-        <w:pStyle w:val="Ttulo2"/>
-      </w:pPr>
-      <w:r>
-        <w:t>Ensino de Língua Inglesa e o Bloqueio na Oralidade</w:t>
-      </w:r>
-    </w:p>
-    <w:p>
-      <w:pPr>
-        <w:pStyle w:val="TF-TEXTO"/>
-      </w:pPr>
-      <w:r>
-        <w:t>O domínio da fala numa língua estrangeira é frequentemente considerado uma das competências mais complexas de se alcançar</w:t>
-      </w:r>
-      <w:r>
-        <w:t xml:space="preserve"> </w:t>
-      </w:r>
-      <w:r>
-        <w:t>(Yan; Lowell; Yang, 2024)</w:t>
-      </w:r>
-      <w:r>
-        <w:t>. Segundo Yan, Lowell e Yang (2024), a comunicação oral exige o uso simultâneo de múltiplas habilidades linguísticas, incluindo vocabulário, gramática, pronúncia e fluência, além da capacidade de compreensão auditiva. No contexto globa</w:t>
-      </w:r>
-      <w:r>
-        <w:t>l</w:t>
-      </w:r>
-      <w:r>
-        <w:t>, muitos estudantes atingem níveis avançados de leitura e escrita, mas enfrentam um forte bloqueio no momento de se expressarem oralmente</w:t>
-      </w:r>
-      <w:r>
-        <w:t>, o que</w:t>
-      </w:r>
-      <w:r>
-        <w:t xml:space="preserve"> está intimamente ligado a fatores psicológicos, ambientais e cognitivos</w:t>
-      </w:r>
-      <w:r>
-        <w:t xml:space="preserve"> </w:t>
-      </w:r>
-      <w:r>
-        <w:t>(Yan; Lowell; Yang, 2024)</w:t>
-      </w:r>
-      <w:r>
-        <w:t xml:space="preserve">. </w:t>
-      </w:r>
-    </w:p>
-    <w:p>
-      <w:pPr>
-        <w:pStyle w:val="TF-TEXTO"/>
-      </w:pPr>
-      <w:r>
-        <w:t>Yan, Lowell e Yang (2024) destacam que as dificuldades no desenvolvimento da fala derivam, em grande parte, do medo de cometer erros, da baixa autoconfiança e da ansiedade de falar em uma língua estrangeira. No ambiente de sala de aula tradicional, os alunos sentem-se frequentemente expostos ao julgamento, o que inibe a prática voluntária</w:t>
-      </w:r>
-      <w:r>
-        <w:t xml:space="preserve"> </w:t>
-      </w:r>
-      <w:r>
-        <w:t>(Yan; Lowell; Yang, 2024)</w:t>
-      </w:r>
-      <w:r>
-        <w:t xml:space="preserve">. Sales, Ribeiro e Procópio (2024) </w:t>
-      </w:r>
-      <w:r>
-        <w:t>mostram</w:t>
-      </w:r>
-      <w:r>
-        <w:t xml:space="preserve"> a importância da atenção direcionada na aquisição lexical, notando que a falta de estímulos multimodais no ensino convencional</w:t>
-      </w:r>
-      <w:r>
-        <w:t xml:space="preserve"> não</w:t>
-      </w:r>
-      <w:r>
-        <w:t xml:space="preserve"> </w:t>
-      </w:r>
-      <w:r>
-        <w:t xml:space="preserve">prende a </w:t>
-      </w:r>
-      <w:r>
-        <w:t>atenção do aluno para o objeto de aprendizagem, prejudicando a retenção a curto e longo prazo. Sem um vocabulário consolidado e sem ambientes de aprendizagem situados, o aluno não encontra as ferramentas nem as oportunidades adequadas para praticar a fala fora do contexto escolar</w:t>
-      </w:r>
-      <w:r>
-        <w:t xml:space="preserve"> (Yan; Lowell; Yang, 2024)</w:t>
-      </w:r>
-      <w:r>
-        <w:t>.</w:t>
-      </w:r>
-    </w:p>
-    <w:p>
-      <w:pPr>
-        <w:pStyle w:val="Ttulo2"/>
-      </w:pPr>
-      <w:r>
-        <w:t>Realidade Virtual e Jogos Educacionais</w:t>
-      </w:r>
-    </w:p>
-    <w:p>
-      <w:pPr>
-        <w:pStyle w:val="TF-TEXTO"/>
-      </w:pPr>
-      <w:r>
-        <w:t xml:space="preserve">Diante das limitações do ensino tradicional em providenciar contextos reais de imersão, a tecnologia surge como uma alternativa viável e transformadora. A </w:t>
-      </w:r>
-      <w:r>
-        <w:t>RV</w:t>
-      </w:r>
-      <w:r>
-        <w:t xml:space="preserve"> é definida como uma interface avançada que proporciona ao utilizador a visualização, movimentação e interação em tempo real dentro de um ambiente tridimensional (Leal; Costa; </w:t>
-      </w:r>
-      <w:proofErr w:type="spellStart"/>
-      <w:r>
-        <w:t>Freschi</w:t>
-      </w:r>
-      <w:proofErr w:type="spellEnd"/>
-      <w:r>
-        <w:t>, 2021). De acordo com Ramos e Borges Júnior (2024), a RV tem-se destacado como uma ferramenta inovadora na educação, transformando a forma como os alunos aprendem e os professores ensinam, ao permitir a exploração de conceitos complexos de forma prática, dinâmica e significativa.</w:t>
-      </w:r>
-    </w:p>
-    <w:p>
-      <w:pPr>
-        <w:pStyle w:val="TF-TEXTO"/>
-      </w:pPr>
-      <w:r>
-        <w:t xml:space="preserve">A utilização da RV aliada aos Jogos Educacionais (ou </w:t>
-      </w:r>
-      <w:r>
-        <w:t>Jogos Sérios</w:t>
-      </w:r>
-      <w:r>
-        <w:t>) potencializa</w:t>
-      </w:r>
-      <w:r>
-        <w:t>m</w:t>
-      </w:r>
-      <w:r>
-        <w:t xml:space="preserve"> os resultados pedagógicos através do envolvimento e da atenção</w:t>
-      </w:r>
-      <w:r>
-        <w:t xml:space="preserve"> </w:t>
-      </w:r>
-      <w:r>
-        <w:t>(Sales; Ribeiro; Procópio, 2024)</w:t>
-      </w:r>
-      <w:r>
-        <w:t xml:space="preserve">. Sales, Ribeiro e Procópio (2024) demonstram que </w:t>
-      </w:r>
-      <w:r>
-        <w:t>ambientes ricos em estímulos visuais, sonoros e interativos</w:t>
-      </w:r>
-      <w:r>
-        <w:t xml:space="preserve">, também chamados de </w:t>
-      </w:r>
-      <w:proofErr w:type="spellStart"/>
-      <w:r>
-        <w:t>hipermodais</w:t>
-      </w:r>
-      <w:proofErr w:type="spellEnd"/>
-      <w:r>
-        <w:t>, combinados</w:t>
-      </w:r>
-      <w:r>
-        <w:t xml:space="preserve"> com </w:t>
-      </w:r>
-      <w:r>
-        <w:t xml:space="preserve">uma </w:t>
-      </w:r>
-      <w:r>
-        <w:t xml:space="preserve">imersão </w:t>
-      </w:r>
-      <w:r>
-        <w:t>de</w:t>
-      </w:r>
-      <w:r>
-        <w:t xml:space="preserve"> 360</w:t>
-      </w:r>
-      <w:r>
-        <w:t>º proporcionada por óculos de RV,</w:t>
-      </w:r>
-      <w:r>
-        <w:t xml:space="preserve"> funcionam como facilitadores da aprendizagem, uma vez que ajudam a direcionar a atenção do aluno e promovem a motivação, fatores essenciais para a aquisição lexical e linguística. Complementarmente, num estudo sobre os níveis de imersão, Huang </w:t>
-      </w:r>
-      <w:r>
-        <w:rPr>
-          <w:i/>
-          <w:iCs/>
-        </w:rPr>
-        <w:t xml:space="preserve">et al. </w:t>
-      </w:r>
-      <w:r>
-        <w:t xml:space="preserve">(2021) comprovaram que a utilização de ambientes de alta imersão (com óculos de RV) eleva significativamente a motivação intrínseca dos utilizadores. Ao incorporar elementos de gamificação, o processo de aprendizagem deixa de ser uma tarefa árdua e passa a ser uma experiência lúdica, mantendo os alunos motivados ao longo de múltiplas sessões (Huang </w:t>
-      </w:r>
-      <w:r>
-        <w:rPr>
-          <w:i/>
-          <w:iCs/>
-        </w:rPr>
-        <w:t>et al.</w:t>
-      </w:r>
-      <w:r>
-        <w:t>, 2021).</w:t>
-      </w:r>
-    </w:p>
-    <w:p>
-      <w:pPr>
-        <w:pStyle w:val="Ttulo2"/>
-      </w:pPr>
-      <w:r>
-        <w:lastRenderedPageBreak/>
-        <w:t>Interação por Voz em Ambientes Virtuais</w:t>
-      </w:r>
-    </w:p>
-    <w:p>
-      <w:pPr>
-        <w:pStyle w:val="TF-TEXTO"/>
-      </w:pPr>
-      <w:r>
-        <w:t xml:space="preserve">Para que a </w:t>
-      </w:r>
-      <w:r>
-        <w:t>RV</w:t>
-      </w:r>
-      <w:r>
-        <w:t xml:space="preserve"> atinja o seu potencial máximo no ensino de idiomas, a interatividade precisa ir além do contacto visual e da exploração espacial</w:t>
-      </w:r>
-      <w:r>
-        <w:t xml:space="preserve"> </w:t>
-      </w:r>
-      <w:r>
-        <w:t>(Ramos; Borges Júnior, 2024)</w:t>
-      </w:r>
-      <w:r>
-        <w:t xml:space="preserve">. A imersão genuína requer que o aluno deixe de ser um observador passivo para se tornar um agente ativo no ambiente de aprendizagem (Ramos; Borges Júnior, 2024). A simulação de ambientes sociais por meio da RV oferece aos alunos um </w:t>
-      </w:r>
-      <w:r>
-        <w:t>“</w:t>
-      </w:r>
-      <w:r>
-        <w:t>espaço seguro</w:t>
-      </w:r>
-      <w:r>
-        <w:t>”</w:t>
-      </w:r>
-      <w:r>
-        <w:t xml:space="preserve"> para praticar, eliminando o receio de retaliação social ou constrangimento que ocorreria no mundo físico (Leal; Costa; </w:t>
-      </w:r>
-      <w:proofErr w:type="spellStart"/>
-      <w:r>
-        <w:t>Freschi</w:t>
-      </w:r>
-      <w:proofErr w:type="spellEnd"/>
-      <w:r>
-        <w:t>, 2021).</w:t>
-      </w:r>
-    </w:p>
-    <w:p>
-      <w:pPr>
-        <w:pStyle w:val="TF-TEXTO"/>
-      </w:pPr>
-      <w:r>
-        <w:t>Neste sentido, a tecnologia de reconhecimento de fala (</w:t>
-      </w:r>
-      <w:proofErr w:type="spellStart"/>
-      <w:r>
-        <w:rPr>
-          <w:i/>
-          <w:iCs/>
-        </w:rPr>
-        <w:t>Speech</w:t>
-      </w:r>
-      <w:proofErr w:type="spellEnd"/>
-      <w:r>
-        <w:rPr>
-          <w:i/>
-          <w:iCs/>
-        </w:rPr>
-        <w:t xml:space="preserve"> Recognition</w:t>
-      </w:r>
-      <w:r>
-        <w:t xml:space="preserve"> ou </w:t>
-      </w:r>
-      <w:proofErr w:type="spellStart"/>
-      <w:r>
-        <w:rPr>
-          <w:i/>
-          <w:iCs/>
-        </w:rPr>
-        <w:t>Speech-to-Text</w:t>
-      </w:r>
-      <w:proofErr w:type="spellEnd"/>
-      <w:r>
-        <w:t>) aplicada a personagens não jogáveis (</w:t>
-      </w:r>
-      <w:proofErr w:type="spellStart"/>
-      <w:r>
-        <w:t>Non-Playable</w:t>
-      </w:r>
-      <w:proofErr w:type="spellEnd"/>
-      <w:r>
-        <w:t xml:space="preserve"> </w:t>
-      </w:r>
-      <w:proofErr w:type="spellStart"/>
-      <w:r>
-        <w:t>Character</w:t>
-      </w:r>
-      <w:proofErr w:type="spellEnd"/>
-      <w:r>
-        <w:t xml:space="preserve"> - </w:t>
-      </w:r>
-      <w:r>
-        <w:t>NPCs) e sistemas automatizados eleva a autonomia do estudante</w:t>
-      </w:r>
-      <w:r>
-        <w:t xml:space="preserve"> </w:t>
-      </w:r>
-      <w:r>
-        <w:t xml:space="preserve">(Leal; Costa; </w:t>
-      </w:r>
-      <w:proofErr w:type="spellStart"/>
-      <w:r>
-        <w:t>Freschi</w:t>
-      </w:r>
-      <w:proofErr w:type="spellEnd"/>
-      <w:r>
-        <w:t>, 2021)</w:t>
-      </w:r>
-      <w:r>
-        <w:t xml:space="preserve">. Em vez de depender de interações síncronas com professores como ocorre </w:t>
-      </w:r>
-      <w:r>
-        <w:t xml:space="preserve">em </w:t>
-      </w:r>
-      <w:r>
-        <w:t>algumas plataformas de metaverso, a integração de comandos de voz permite que o próprio sistema valide a pronúncia e o contexto da fala do jogador</w:t>
-      </w:r>
-      <w:r>
-        <w:t xml:space="preserve"> (Leal; Costa; </w:t>
-      </w:r>
-      <w:proofErr w:type="spellStart"/>
-      <w:r>
-        <w:t>Freschi</w:t>
-      </w:r>
-      <w:proofErr w:type="spellEnd"/>
-      <w:r>
-        <w:t>, 2021)</w:t>
-      </w:r>
-      <w:r>
-        <w:t xml:space="preserve">. Ao </w:t>
-      </w:r>
-      <w:r>
-        <w:t>ajuntar</w:t>
-      </w:r>
-      <w:r>
-        <w:t xml:space="preserve"> o vocabulário retido através da imersão à necessidade de verbalizar ações para progredir no jogo, o sistema reforça a repetição e a correção em tempo real</w:t>
-      </w:r>
-      <w:r>
-        <w:t xml:space="preserve"> </w:t>
-      </w:r>
-      <w:r>
-        <w:t>(Sales; Ribeiro; Procópio, 2024)</w:t>
-      </w:r>
-      <w:r>
-        <w:t xml:space="preserve">. Esta abordagem não só estimula a quebra do bloqueio oral de forma </w:t>
-      </w:r>
-      <w:r>
-        <w:t>aut</w:t>
-      </w:r>
-      <w:r>
-        <w:t>ô</w:t>
-      </w:r>
-      <w:r>
-        <w:t>noma</w:t>
-      </w:r>
-      <w:r>
-        <w:t>, como também garante que o foco educacional se mantém aliado à diversão proporcionada pelo jogo</w:t>
-      </w:r>
-      <w:r>
-        <w:t xml:space="preserve"> </w:t>
-      </w:r>
-      <w:r>
-        <w:t xml:space="preserve">(Huang </w:t>
-      </w:r>
-      <w:r>
-        <w:rPr>
-          <w:i/>
-          <w:iCs/>
-        </w:rPr>
-        <w:t>et al.</w:t>
-      </w:r>
-      <w:r>
-        <w:t>, 2021)</w:t>
-      </w:r>
-      <w:r>
-        <w:t>.</w:t>
-      </w:r>
-    </w:p>
-    <w:p>
-      <w:pPr>
-        <w:pStyle w:val="TF-refernciasbibliogrficasTTULO"/>
+        <w:pStyle w:val="TF-REFERNCIASITEM0"/>
         <w:rPr>
           <w:lang w:val="en-US"/>
         </w:rPr>
       </w:pPr>
-      <w:bookmarkStart w:id="39" w:name="_Toc351015602"/>
-      <w:bookmarkEnd w:id="24"/>
-      <w:bookmarkEnd w:id="25"/>
-      <w:bookmarkEnd w:id="26"/>
-      <w:bookmarkEnd w:id="27"/>
-      <w:bookmarkEnd w:id="28"/>
-      <w:bookmarkEnd w:id="29"/>
-      <w:bookmarkEnd w:id="30"/>
       <w:r>
         <w:rPr>
           <w:lang w:val="en-US"/>
         </w:rPr>
-        <w:t>Referências</w:t>
-      </w:r>
-      <w:bookmarkEnd w:id="39"/>
-    </w:p>
-    <w:p>
-      <w:pPr>
-        <w:pStyle w:val="TF-REFERNCIASITEM0"/>
+        <w:t>H</w:t>
+      </w:r>
+      <w:r>
         <w:rPr>
           <w:lang w:val="en-US"/>
         </w:rPr>
-      </w:pPr>
-      <w:r>
-        <w:rPr>
-          <w:lang w:val="en-US"/>
-        </w:rPr>
-        <w:t>H</w:t>
-      </w:r>
-      <w:r>
-        <w:rPr>
-          <w:lang w:val="en-US"/>
-        </w:rPr>
-        <w:t>uang</w:t>
+        <w:t>UANG</w:t>
       </w:r>
       <w:r>
         <w:rPr>
@@ -3256,19 +3892,11 @@
       <w:r>
         <w:t xml:space="preserve">Disponível em: https://onlinelibrary.wiley.com/doi/full/10.1111/jcal.12520. </w:t>
       </w:r>
-      <w:proofErr w:type="spellStart"/>
       <w:r>
         <w:rPr>
           <w:lang w:val="en-US"/>
         </w:rPr>
-        <w:t>Acesso</w:t>
-      </w:r>
-      <w:proofErr w:type="spellEnd"/>
-      <w:r>
-        <w:rPr>
-          <w:lang w:val="en-US"/>
-        </w:rPr>
-        <w:t xml:space="preserve"> em: </w:t>
+        <w:t xml:space="preserve">Acesso em: </w:t>
       </w:r>
       <w:r>
         <w:rPr>
@@ -3297,31 +3925,43 @@
         <w:rPr>
           <w:lang w:val="en-US"/>
         </w:rPr>
-        <w:t>eal</w:t>
+        <w:t>EAL</w:t>
       </w:r>
       <w:r>
         <w:rPr>
           <w:lang w:val="en-US"/>
         </w:rPr>
-        <w:t>, João V.; C</w:t>
+        <w:t xml:space="preserve">, João V.; </w:t>
       </w:r>
       <w:r>
         <w:rPr>
           <w:lang w:val="en-US"/>
         </w:rPr>
-        <w:t>osta</w:t>
+        <w:t>C</w:t>
       </w:r>
       <w:r>
         <w:rPr>
           <w:lang w:val="en-US"/>
         </w:rPr>
-        <w:t>, Eduardo G.; F</w:t>
+        <w:t>OSTA</w:t>
       </w:r>
       <w:r>
         <w:rPr>
           <w:lang w:val="en-US"/>
         </w:rPr>
-        <w:t>reschi</w:t>
+        <w:t xml:space="preserve">, Eduardo G.; </w:t>
+      </w:r>
+      <w:r>
+        <w:rPr>
+          <w:lang w:val="en-US"/>
+        </w:rPr>
+        <w:t>F</w:t>
+      </w:r>
+      <w:r>
+        <w:rPr>
+          <w:lang w:val="en-US"/>
+        </w:rPr>
+        <w:t>RESCHI</w:t>
       </w:r>
       <w:r>
         <w:rPr>
@@ -3375,14 +4015,27 @@
         <w:t>R</w:t>
       </w:r>
       <w:r>
-        <w:t>amos</w:t>
-      </w:r>
-      <w:r>
-        <w:t>, R. C.; J</w:t>
-      </w:r>
-      <w:r>
-        <w:t>únior</w:t>
-      </w:r>
+        <w:t>AMOS</w:t>
+      </w:r>
+      <w:r>
+        <w:t xml:space="preserve">, R. C.; </w:t>
+      </w:r>
+      <w:r>
+        <w:t>J</w:t>
+      </w:r>
+      <w:r>
+        <w:t>ÚNIOR</w:t>
+      </w:r>
+      <w:ins w:id="121" w:author="Dalton Solano dos Reis" w:date="2026-05-14T09:38:00Z" w16du:dateUtc="2026-05-14T12:38:00Z">
+        <w:r>
+          <w:t xml:space="preserve"> </w:t>
+        </w:r>
+      </w:ins>
+      <w:ins w:id="122" w:author="Dalton Solano dos Reis" w:date="2026-05-14T09:38:00Z">
+        <w:r>
+          <w:t>BORGES</w:t>
+        </w:r>
+      </w:ins>
       <w:r>
         <w:t>, W</w:t>
       </w:r>
@@ -3390,7 +4043,15 @@
         <w:t>lamir</w:t>
       </w:r>
       <w:r>
-        <w:t xml:space="preserve"> L. B. </w:t>
+        <w:t xml:space="preserve"> L.</w:t>
+      </w:r>
+      <w:del w:id="123" w:author="Dalton Solano dos Reis" w:date="2026-05-14T09:38:00Z" w16du:dateUtc="2026-05-14T12:38:00Z">
+        <w:r>
+          <w:delText xml:space="preserve"> B.</w:delText>
+        </w:r>
+      </w:del>
+      <w:r>
+        <w:t xml:space="preserve"> </w:t>
       </w:r>
       <w:r>
         <w:t xml:space="preserve">Realidade virtual na educação: Fundamentos, Dispositivos, Aplicações e Inovação no Ensino. </w:t>
@@ -3426,33 +4087,22 @@
         <w:pStyle w:val="TF-REFERNCIASITEM0"/>
       </w:pPr>
       <w:r>
-        <w:t>S</w:t>
-      </w:r>
-      <w:r>
-        <w:t>ales</w:t>
-      </w:r>
-      <w:r>
-        <w:t>, Rafaela L.; R</w:t>
-      </w:r>
-      <w:r>
-        <w:t>ibeiro</w:t>
-      </w:r>
-      <w:r>
-        <w:t>, Patrícia N. de S.; P</w:t>
-      </w:r>
-      <w:r>
-        <w:t>rocópio</w:t>
-      </w:r>
-      <w:r>
-        <w:t xml:space="preserve">, Renata B. O impacto de um ambiente de aprendizagem </w:t>
-      </w:r>
-      <w:proofErr w:type="spellStart"/>
-      <w:r>
-        <w:t>hipermodal</w:t>
-      </w:r>
-      <w:proofErr w:type="spellEnd"/>
-      <w:r>
-        <w:t xml:space="preserve"> com imersão em 360º na aquisição lexical de inglês como língua estrangeira. </w:t>
+        <w:t>SALES</w:t>
+      </w:r>
+      <w:r>
+        <w:t xml:space="preserve">, Rafaela L.; </w:t>
+      </w:r>
+      <w:r>
+        <w:t>RIBEIRO</w:t>
+      </w:r>
+      <w:r>
+        <w:t xml:space="preserve">, Patrícia N. de S.; </w:t>
+      </w:r>
+      <w:r>
+        <w:t>PROCÓPIO</w:t>
+      </w:r>
+      <w:r>
+        <w:t xml:space="preserve">, Renata B. O impacto de um ambiente de aprendizagem hipermodal com imersão em 360º na aquisição lexical de inglês como língua estrangeira. </w:t>
       </w:r>
       <w:r>
         <w:rPr>
@@ -3496,11 +4146,9 @@
       <w:pPr>
         <w:pStyle w:val="TF-REFERNCIASITEM0"/>
       </w:pPr>
-      <w:proofErr w:type="spellStart"/>
-      <w:r>
-        <w:t>Steam</w:t>
-      </w:r>
-      <w:proofErr w:type="spellEnd"/>
+      <w:r>
+        <w:t>STEAM</w:t>
+      </w:r>
       <w:r>
         <w:t xml:space="preserve">. </w:t>
       </w:r>
@@ -3531,15 +4179,9 @@
           <w:lang w:val="en-US"/>
         </w:rPr>
       </w:pPr>
-      <w:proofErr w:type="spellStart"/>
-      <w:r>
-        <w:t>VirtualSpeech</w:t>
-      </w:r>
-      <w:proofErr w:type="spellEnd"/>
-      <w:r>
-        <w:t xml:space="preserve">. </w:t>
-      </w:r>
-      <w:proofErr w:type="spellStart"/>
+      <w:r>
+        <w:t xml:space="preserve">VirtualSpeech. </w:t>
+      </w:r>
       <w:r>
         <w:rPr>
           <w:b/>
@@ -3547,7 +4189,6 @@
         </w:rPr>
         <w:t>Education</w:t>
       </w:r>
-      <w:proofErr w:type="spellEnd"/>
       <w:r>
         <w:t>. 202</w:t>
       </w:r>
@@ -3557,19 +4198,11 @@
       <w:r>
         <w:t xml:space="preserve">. Disponível em: https://virtualspeech.com/education. </w:t>
       </w:r>
-      <w:proofErr w:type="spellStart"/>
       <w:r>
         <w:rPr>
           <w:lang w:val="en-US"/>
         </w:rPr>
-        <w:t>Acesso</w:t>
-      </w:r>
-      <w:proofErr w:type="spellEnd"/>
-      <w:r>
-        <w:rPr>
-          <w:lang w:val="en-US"/>
-        </w:rPr>
-        <w:t xml:space="preserve"> em: 26 abr. 2026.</w:t>
+        <w:t>Acesso em: 26 abr. 2026.</w:t>
       </w:r>
     </w:p>
     <w:p>
@@ -3586,31 +4219,43 @@
         <w:rPr>
           <w:lang w:val="en-US"/>
         </w:rPr>
-        <w:t>an</w:t>
+        <w:t>AN</w:t>
       </w:r>
       <w:r>
         <w:rPr>
           <w:lang w:val="en-US"/>
         </w:rPr>
-        <w:t>, Weijian; L</w:t>
+        <w:t xml:space="preserve">, Weijian; </w:t>
       </w:r>
       <w:r>
         <w:rPr>
           <w:lang w:val="en-US"/>
         </w:rPr>
-        <w:t>owell</w:t>
+        <w:t>L</w:t>
       </w:r>
       <w:r>
         <w:rPr>
           <w:lang w:val="en-US"/>
         </w:rPr>
-        <w:t>, Victoria L.; Y</w:t>
+        <w:t>OWELL</w:t>
       </w:r>
       <w:r>
         <w:rPr>
           <w:lang w:val="en-US"/>
         </w:rPr>
-        <w:t>ang</w:t>
+        <w:t xml:space="preserve">, Victoria L.; </w:t>
+      </w:r>
+      <w:r>
+        <w:rPr>
+          <w:lang w:val="en-US"/>
+        </w:rPr>
+        <w:t>Y</w:t>
+      </w:r>
+      <w:r>
+        <w:rPr>
+          <w:lang w:val="en-US"/>
+        </w:rPr>
+        <w:t>ANG</w:t>
       </w:r>
       <w:r>
         <w:rPr>
@@ -3649,8 +4294,8 @@
         <w:pStyle w:val="TF-refernciasbibliogrficasTTULO"/>
         <w:jc w:val="left"/>
         <w:sectPr>
-          <w:footerReference w:type="default" r:id="rId16"/>
-          <w:headerReference w:type="first" r:id="rId17"/>
+          <w:footerReference w:type="default" r:id="rId20"/>
+          <w:headerReference w:type="first" r:id="rId21"/>
           <w:pgSz w:w="11907" w:h="16840" w:code="9"/>
           <w:pgMar w:top="1701" w:right="1134" w:bottom="1134" w:left="1701" w:header="720" w:footer="720" w:gutter="0"/>
           <w:pgNumType w:start="1"/>
@@ -3667,7 +4312,7 @@
       <w:pPr>
         <w:pStyle w:val="TF-xAvalTTULO"/>
       </w:pPr>
-      <w:bookmarkStart w:id="40" w:name="_Hlk228462730"/>
+      <w:bookmarkStart w:id="124" w:name="_Hlk228462730"/>
       <w:r>
         <w:lastRenderedPageBreak/>
         <w:t>FORMULÁRIO  DE  avaliação</w:t>
@@ -3954,6 +4599,12 @@
                 <w:sz w:val="18"/>
               </w:rPr>
             </w:pPr>
+            <w:r>
+              <w:rPr>
+                <w:sz w:val="18"/>
+              </w:rPr>
+              <w:t>X</w:t>
+            </w:r>
           </w:p>
         </w:tc>
       </w:tr>
@@ -4048,6 +4699,12 @@
                 <w:sz w:val="18"/>
               </w:rPr>
             </w:pPr>
+            <w:r>
+              <w:rPr>
+                <w:sz w:val="18"/>
+              </w:rPr>
+              <w:t>X</w:t>
+            </w:r>
           </w:p>
         </w:tc>
         <w:tc>
@@ -4153,6 +4810,12 @@
                 <w:sz w:val="18"/>
               </w:rPr>
             </w:pPr>
+            <w:r>
+              <w:rPr>
+                <w:sz w:val="18"/>
+              </w:rPr>
+              <w:t>X</w:t>
+            </w:r>
           </w:p>
         </w:tc>
         <w:tc>
@@ -4291,6 +4954,12 @@
                 <w:sz w:val="18"/>
               </w:rPr>
             </w:pPr>
+            <w:r>
+              <w:rPr>
+                <w:sz w:val="18"/>
+              </w:rPr>
+              <w:t>X</w:t>
+            </w:r>
           </w:p>
         </w:tc>
         <w:tc>
@@ -4441,6 +5110,12 @@
                 <w:sz w:val="18"/>
               </w:rPr>
             </w:pPr>
+            <w:r>
+              <w:rPr>
+                <w:sz w:val="18"/>
+              </w:rPr>
+              <w:t>X</w:t>
+            </w:r>
           </w:p>
         </w:tc>
       </w:tr>
@@ -4568,6 +5243,12 @@
                 <w:sz w:val="18"/>
               </w:rPr>
             </w:pPr>
+            <w:r>
+              <w:rPr>
+                <w:sz w:val="18"/>
+              </w:rPr>
+              <w:t>X</w:t>
+            </w:r>
           </w:p>
         </w:tc>
       </w:tr>
@@ -4673,6 +5354,12 @@
                 <w:sz w:val="18"/>
               </w:rPr>
             </w:pPr>
+            <w:r>
+              <w:rPr>
+                <w:sz w:val="18"/>
+              </w:rPr>
+              <w:t>X</w:t>
+            </w:r>
           </w:p>
         </w:tc>
         <w:tc>
@@ -4811,6 +5498,12 @@
                 <w:sz w:val="18"/>
               </w:rPr>
             </w:pPr>
+            <w:r>
+              <w:rPr>
+                <w:sz w:val="18"/>
+              </w:rPr>
+              <w:t>X</w:t>
+            </w:r>
           </w:p>
         </w:tc>
         <w:tc>
@@ -4904,6 +5597,12 @@
                 <w:sz w:val="18"/>
               </w:rPr>
             </w:pPr>
+            <w:r>
+              <w:rPr>
+                <w:sz w:val="18"/>
+              </w:rPr>
+              <w:t>X</w:t>
+            </w:r>
           </w:p>
         </w:tc>
         <w:tc>
@@ -5020,6 +5719,12 @@
                 <w:sz w:val="18"/>
               </w:rPr>
             </w:pPr>
+            <w:r>
+              <w:rPr>
+                <w:sz w:val="18"/>
+              </w:rPr>
+              <w:t>X</w:t>
+            </w:r>
           </w:p>
         </w:tc>
         <w:tc>
@@ -5148,6 +5853,12 @@
                 <w:sz w:val="18"/>
               </w:rPr>
             </w:pPr>
+            <w:r>
+              <w:rPr>
+                <w:sz w:val="18"/>
+              </w:rPr>
+              <w:t>X</w:t>
+            </w:r>
           </w:p>
         </w:tc>
         <w:tc>
@@ -5276,6 +5987,12 @@
                 <w:sz w:val="18"/>
               </w:rPr>
             </w:pPr>
+            <w:r>
+              <w:rPr>
+                <w:sz w:val="18"/>
+              </w:rPr>
+              <w:t>X</w:t>
+            </w:r>
           </w:p>
         </w:tc>
         <w:tc>
@@ -5414,6 +6131,12 @@
                 <w:sz w:val="18"/>
               </w:rPr>
             </w:pPr>
+            <w:r>
+              <w:rPr>
+                <w:sz w:val="18"/>
+              </w:rPr>
+              <w:t>X</w:t>
+            </w:r>
           </w:p>
         </w:tc>
         <w:tc>
@@ -5520,6 +6243,12 @@
                 <w:sz w:val="18"/>
               </w:rPr>
             </w:pPr>
+            <w:r>
+              <w:rPr>
+                <w:sz w:val="18"/>
+              </w:rPr>
+              <w:t>X</w:t>
+            </w:r>
           </w:p>
         </w:tc>
         <w:tc>
@@ -5635,6 +6364,12 @@
                 <w:sz w:val="18"/>
               </w:rPr>
             </w:pPr>
+            <w:r>
+              <w:rPr>
+                <w:sz w:val="18"/>
+              </w:rPr>
+              <w:t>X</w:t>
+            </w:r>
           </w:p>
         </w:tc>
         <w:tc>
@@ -5712,7 +6447,7 @@
         <w:t xml:space="preserve"> Quando o avaliador marcar algum item como atende parcialmente ou não atende, deve obrigatoriamente indicar os motivos no texto, para que o aluno saiba o porquê da avaliação.</w:t>
       </w:r>
     </w:p>
-    <w:bookmarkEnd w:id="40"/>
+    <w:bookmarkEnd w:id="124"/>
     <w:p>
       <w:pPr>
         <w:pStyle w:val="TF-refernciasbibliogrficasTTULO"/>
@@ -5727,9 +6462,9 @@
       </w:pPr>
     </w:p>
     <w:sectPr>
-      <w:headerReference w:type="default" r:id="rId18"/>
-      <w:footerReference w:type="default" r:id="rId19"/>
-      <w:headerReference w:type="first" r:id="rId20"/>
+      <w:headerReference w:type="default" r:id="rId22"/>
+      <w:footerReference w:type="default" r:id="rId23"/>
+      <w:headerReference w:type="first" r:id="rId24"/>
       <w:pgSz w:w="11907" w:h="16840" w:code="9"/>
       <w:pgMar w:top="1701" w:right="1134" w:bottom="1134" w:left="1701" w:header="720" w:footer="720" w:gutter="0"/>
       <w:pgNumType w:start="1"/>
@@ -5738,6 +6473,782 @@
     </w:sectPr>
   </w:body>
 </w:document>
+</file>
+
+<file path=word/comments.xml><?xml version="1.0" encoding="utf-8"?>
+<w:comments xmlns:wpc="http://schemas.microsoft.com/office/word/2010/wordprocessingCanvas" xmlns:cx="http://schemas.microsoft.com/office/drawing/2014/chartex" xmlns:cx1="http://schemas.microsoft.com/office/drawing/2015/9/8/chartex" xmlns:cx2="http://schemas.microsoft.com/office/drawing/2015/10/21/chartex" xmlns:cx3="http://schemas.microsoft.com/office/drawing/2016/5/9/chartex" xmlns:cx4="http://schemas.microsoft.com/office/drawing/2016/5/10/chartex" xmlns:cx5="http://schemas.microsoft.com/office/drawing/2016/5/11/chartex" xmlns:cx6="http://schemas.microsoft.com/office/drawing/2016/5/12/chartex" xmlns:cx7="http://schemas.microsoft.com/office/drawing/2016/5/13/chartex" xmlns:cx8="http://schemas.microsoft.com/office/drawing/2016/5/14/chartex" xmlns:mc="http://schemas.openxmlformats.org/markup-compatibility/2006" xmlns:aink="http://schemas.microsoft.com/office/drawing/2016/ink" xmlns:am3d="http://schemas.microsoft.com/office/drawing/2017/model3d" xmlns:o="urn:schemas-microsoft-com:office:office" xmlns:oel="http://schemas.microsoft.com/office/2019/extlst" xmlns:r="http://schemas.openxmlformats.org/officeDocument/2006/relationships" xmlns:m="http://schemas.openxmlformats.org/officeDocument/2006/math" xmlns:v="urn:schemas-microsoft-com:vml" xmlns:wp14="http://schemas.microsoft.com/office/word/2010/wordprocessingDrawing" xmlns:wp="http://schemas.openxmlformats.org/drawingml/2006/wordprocessingDrawing" xmlns:w10="urn:schemas-microsoft-com:office:word" xmlns:w="http://schemas.openxmlformats.org/wordprocessingml/2006/main" xmlns:w14="http://schemas.microsoft.com/office/word/2010/wordml" xmlns:w15="http://schemas.microsoft.com/office/word/2012/wordml" xmlns:w16cex="http://schemas.microsoft.com/office/word/2018/wordml/cex" xmlns:w16cid="http://schemas.microsoft.com/office/word/2016/wordml/cid" xmlns:w16="http://schemas.microsoft.com/office/word/2018/wordml" xmlns:w16du="http://schemas.microsoft.com/office/word/2023/wordml/word16du" xmlns:w16sdtdh="http://schemas.microsoft.com/office/word/2020/wordml/sdtdatahash" xmlns:w16sdtfl="http://schemas.microsoft.com/office/word/2024/wordml/sdtformatlock" xmlns:w16se="http://schemas.microsoft.com/office/word/2015/wordml/symex" xmlns:wpg="http://schemas.microsoft.com/office/word/2010/wordprocessingGroup" xmlns:wpi="http://schemas.microsoft.com/office/word/2010/wordprocessingInk" xmlns:wne="http://schemas.microsoft.com/office/word/2006/wordml" xmlns:wps="http://schemas.microsoft.com/office/word/2010/wordprocessingShape" mc:Ignorable="w14 w15 w16se w16cid w16 w16cex w16sdtdh w16sdtfl w16du wp14">
+  <w:comment w:id="9" w:author="Dalton Solano dos Reis" w:date="2026-05-14T09:36:00Z" w:initials="DR">
+    <w:p>
+      <w:r>
+        <w:rPr>
+          <w:rStyle w:val="Refdecomentrio"/>
+        </w:rPr>
+        <w:annotationRef/>
+      </w:r>
+      <w:r>
+        <w:rPr>
+          <w:sz w:val="20"/>
+          <w:szCs w:val="20"/>
+        </w:rPr>
+        <w:t>Aumentar a Introdução</w:t>
+      </w:r>
+    </w:p>
+    <w:p>
+      <w:r>
+        <w:rPr>
+          <w:sz w:val="20"/>
+          <w:szCs w:val="20"/>
+        </w:rPr>
+        <w:t>Ensino de idiomas, inglês</w:t>
+      </w:r>
+    </w:p>
+    <w:p>
+      <w:r>
+        <w:rPr>
+          <w:sz w:val="20"/>
+          <w:szCs w:val="20"/>
+        </w:rPr>
+        <w:t>O que existe: Duolingo</w:t>
+      </w:r>
+    </w:p>
+    <w:p>
+      <w:r>
+        <w:rPr>
+          <w:sz w:val="20"/>
+          <w:szCs w:val="20"/>
+        </w:rPr>
+        <w:t>RV para ensinar</w:t>
+      </w:r>
+    </w:p>
+    <w:p>
+      <w:r>
+        <w:rPr>
+          <w:sz w:val="20"/>
+          <w:szCs w:val="20"/>
+        </w:rPr>
+        <w:t>RV e Inglês</w:t>
+      </w:r>
+    </w:p>
+  </w:comment>
+  <w:comment w:id="11" w:author="Dalton Solano dos Reis" w:date="2026-05-13T12:38:00Z" w:initials="DR">
+    <w:p>
+      <w:r>
+        <w:rPr>
+          <w:rStyle w:val="Refdecomentrio"/>
+        </w:rPr>
+        <w:annotationRef/>
+      </w:r>
+      <w:r>
+        <w:rPr>
+          <w:sz w:val="20"/>
+          <w:szCs w:val="20"/>
+        </w:rPr>
+        <w:t>Precisa ampliar a seção da Introdução. E, usar parágrafos mais "longos".</w:t>
+      </w:r>
+    </w:p>
+    <w:p>
+      <w:r>
+        <w:rPr>
+          <w:sz w:val="20"/>
+          <w:szCs w:val="20"/>
+        </w:rPr>
+        <w:t>Sugestão, podes comentar o que já existe, por exemplo, já se tem (a um bom tempo) Aplicativos para o Quest para ensinar idiomas.</w:t>
+      </w:r>
+    </w:p>
+  </w:comment>
+  <w:comment w:id="12" w:author="Dalton Solano dos Reis" w:date="2026-05-13T12:43:00Z" w:initials="DR">
+    <w:p>
+      <w:r>
+        <w:rPr>
+          <w:rStyle w:val="Refdecomentrio"/>
+        </w:rPr>
+        <w:annotationRef/>
+      </w:r>
+      <w:r>
+        <w:rPr>
+          <w:sz w:val="20"/>
+          <w:szCs w:val="20"/>
+        </w:rPr>
+        <w:t>Também, deveria ter pelo menos um parágrafo ("gordo") para contextualizar o assunto principal ... como "ensinar" o idioma em inglês.</w:t>
+      </w:r>
+    </w:p>
+  </w:comment>
+  <w:comment w:id="27" w:author="Dalton Solano dos Reis" w:date="2026-05-13T12:42:00Z" w:initials="DR">
+    <w:p>
+      <w:r>
+        <w:rPr>
+          <w:rStyle w:val="Refdecomentrio"/>
+        </w:rPr>
+        <w:annotationRef/>
+      </w:r>
+      <w:r>
+        <w:rPr>
+          <w:sz w:val="20"/>
+          <w:szCs w:val="20"/>
+        </w:rPr>
+        <w:t>Hum, será que não deveria fazer parte do objetivo específico pesquisar por alguma metodologia de ensino do idioma, no caso o Inglês. E, deveria ser o objetivo específico a).</w:t>
+      </w:r>
+    </w:p>
+  </w:comment>
+  <w:comment w:id="28" w:author="Dalton Solano dos Reis" w:date="2026-05-13T12:40:00Z" w:initials="DR">
+    <w:p>
+      <w:r>
+        <w:rPr>
+          <w:rStyle w:val="Refdecomentrio"/>
+        </w:rPr>
+        <w:annotationRef/>
+      </w:r>
+      <w:r>
+        <w:rPr>
+          <w:sz w:val="20"/>
+          <w:szCs w:val="20"/>
+        </w:rPr>
+        <w:t>Dúvida, vai realmente desenvolver um módulo novo? Ou usar um dos Assets já disponíveis na loja da Unity. Ou mesmo, costumizar alguma solução de código livre.</w:t>
+      </w:r>
+    </w:p>
+  </w:comment>
+  <w:comment w:id="29" w:author="Dalton Solano dos Reis" w:date="2026-05-13T12:46:00Z" w:initials="DR">
+    <w:p>
+      <w:r>
+        <w:rPr>
+          <w:rStyle w:val="Refdecomentrio"/>
+        </w:rPr>
+        <w:annotationRef/>
+      </w:r>
+      <w:hyperlink r:id="rId1" w:history="1">
+        <w:r>
+          <w:rPr>
+            <w:rStyle w:val="Hyperlink"/>
+            <w:noProof w:val="0"/>
+            <w:sz w:val="20"/>
+            <w:szCs w:val="20"/>
+          </w:rPr>
+          <w:t>https://assetstore.unity.com/packages/tools/audio/rt-voice-pro-41068</w:t>
+        </w:r>
+      </w:hyperlink>
+    </w:p>
+  </w:comment>
+  <w:comment w:id="33" w:author="Dalton Solano dos Reis" w:date="2026-05-13T12:48:00Z" w:initials="DR">
+    <w:p>
+      <w:r>
+        <w:rPr>
+          <w:rStyle w:val="Refdecomentrio"/>
+        </w:rPr>
+        <w:annotationRef/>
+      </w:r>
+      <w:r>
+        <w:rPr>
+          <w:sz w:val="20"/>
+          <w:szCs w:val="20"/>
+        </w:rPr>
+        <w:t>Mudar para o título do trabalho</w:t>
+      </w:r>
+    </w:p>
+  </w:comment>
+  <w:comment w:id="34" w:author="Dalton Solano dos Reis" w:date="2026-05-13T12:56:00Z" w:initials="DR">
+    <w:p>
+      <w:r>
+        <w:rPr>
+          <w:rStyle w:val="Refdecomentrio"/>
+        </w:rPr>
+        <w:annotationRef/>
+      </w:r>
+      <w:r>
+        <w:rPr>
+          <w:sz w:val="20"/>
+          <w:szCs w:val="20"/>
+        </w:rPr>
+        <w:t>Hum, descrição muito superficial ... melhorar.</w:t>
+      </w:r>
+    </w:p>
+    <w:p>
+      <w:r>
+        <w:rPr>
+          <w:sz w:val="20"/>
+          <w:szCs w:val="20"/>
+        </w:rPr>
+        <w:t>Por exemplo, é para ser usado no Quest? Quantas idiomas propõem a ensinar? Adota alguma metodologia de ensino ... etc.</w:t>
+      </w:r>
+    </w:p>
+  </w:comment>
+  <w:comment w:id="39" w:author="Dalton Solano dos Reis" w:date="2026-05-13T13:02:00Z" w:initials="DR">
+    <w:p>
+      <w:r>
+        <w:rPr>
+          <w:rStyle w:val="Refdecomentrio"/>
+        </w:rPr>
+        <w:annotationRef/>
+      </w:r>
+      <w:r>
+        <w:rPr>
+          <w:sz w:val="20"/>
+          <w:szCs w:val="20"/>
+        </w:rPr>
+        <w:t>Subseção com afirmações mas sem citações para referências bibliográficas.</w:t>
+      </w:r>
+    </w:p>
+  </w:comment>
+  <w:comment w:id="42" w:author="Dalton Solano dos Reis" w:date="2026-05-13T12:52:00Z" w:initials="DR">
+    <w:p>
+      <w:r>
+        <w:rPr>
+          <w:rStyle w:val="Refdecomentrio"/>
+        </w:rPr>
+        <w:annotationRef/>
+      </w:r>
+      <w:r>
+        <w:rPr>
+          <w:sz w:val="20"/>
+          <w:szCs w:val="20"/>
+        </w:rPr>
+        <w:t>Reforço o que comentei na seção anterior, além de propor desenvolver a parte do RV, precisa "pesquisar" sobre como se ensina um idioma, uma metodologia.</w:t>
+      </w:r>
+    </w:p>
+  </w:comment>
+  <w:comment w:id="43" w:author="Dalton Solano dos Reis" w:date="2026-05-13T12:53:00Z" w:initials="DR">
+    <w:p>
+      <w:r>
+        <w:rPr>
+          <w:rStyle w:val="Refdecomentrio"/>
+        </w:rPr>
+        <w:annotationRef/>
+      </w:r>
+      <w:r>
+        <w:rPr>
+          <w:sz w:val="20"/>
+          <w:szCs w:val="20"/>
+        </w:rPr>
+        <w:t>O estudo traz informações de como fez a avaliação para chegar nesses resultados? Se sim, descrever. Vai ser útil para fazer sua avaliação.</w:t>
+      </w:r>
+    </w:p>
+  </w:comment>
+  <w:comment w:id="44" w:author="Dalton Solano dos Reis" w:date="2026-05-13T12:58:00Z" w:initials="DR">
+    <w:p>
+      <w:r>
+        <w:rPr>
+          <w:rStyle w:val="Refdecomentrio"/>
+        </w:rPr>
+        <w:annotationRef/>
+      </w:r>
+      <w:r>
+        <w:rPr>
+          <w:sz w:val="20"/>
+          <w:szCs w:val="20"/>
+        </w:rPr>
+        <w:t>Melhorar a explicação da figura. Imagino que essa cena ocorra em um bar. O que são os números e cores embaixo dos avatares? Em cima aparece "10:00", o que é ... etc.</w:t>
+      </w:r>
+    </w:p>
+  </w:comment>
+  <w:comment w:id="45" w:author="Dalton Solano dos Reis" w:date="2026-05-13T12:59:00Z" w:initials="DR">
+    <w:p>
+      <w:r>
+        <w:rPr>
+          <w:rStyle w:val="Refdecomentrio"/>
+        </w:rPr>
+        <w:annotationRef/>
+      </w:r>
+      <w:r>
+        <w:rPr>
+          <w:sz w:val="20"/>
+          <w:szCs w:val="20"/>
+        </w:rPr>
+        <w:t>Rever estilo de formato da legenda e figura.</w:t>
+      </w:r>
+    </w:p>
+  </w:comment>
+  <w:comment w:id="46" w:author="Dalton Solano dos Reis" w:date="2026-05-13T13:03:00Z" w:initials="DR">
+    <w:p>
+      <w:r>
+        <w:rPr>
+          <w:rStyle w:val="Refdecomentrio"/>
+        </w:rPr>
+        <w:annotationRef/>
+      </w:r>
+      <w:r>
+        <w:rPr>
+          <w:sz w:val="20"/>
+          <w:szCs w:val="20"/>
+        </w:rPr>
+        <w:t>Rever em TODO o texto.</w:t>
+      </w:r>
+    </w:p>
+  </w:comment>
+  <w:comment w:id="48" w:author="Dalton Solano dos Reis" w:date="2026-05-13T12:59:00Z" w:initials="DR">
+    <w:p>
+      <w:r>
+        <w:rPr>
+          <w:rStyle w:val="Refdecomentrio"/>
+        </w:rPr>
+        <w:annotationRef/>
+      </w:r>
+      <w:r>
+        <w:rPr>
+          <w:sz w:val="20"/>
+          <w:szCs w:val="20"/>
+        </w:rPr>
+        <w:t>Título do trabalho</w:t>
+      </w:r>
+    </w:p>
+  </w:comment>
+  <w:comment w:id="49" w:author="Dalton Solano dos Reis" w:date="2026-05-13T13:18:00Z" w:initials="DR">
+    <w:p>
+      <w:r>
+        <w:rPr>
+          <w:rStyle w:val="Refdecomentrio"/>
+        </w:rPr>
+        <w:annotationRef/>
+      </w:r>
+      <w:r>
+        <w:rPr>
+          <w:sz w:val="20"/>
+          <w:szCs w:val="20"/>
+        </w:rPr>
+        <w:t>Hum tem forte dúvida se este trabalho se encaixa como correlato? Pois tens dois trabalhos que descrevem uma aplicação de RV, e esse é um mapeamento de vários trabalhos ... como vais fazer a correlação com os outros trabalhos?</w:t>
+      </w:r>
+    </w:p>
+    <w:p>
+      <w:r>
+        <w:rPr>
+          <w:sz w:val="20"/>
+          <w:szCs w:val="20"/>
+        </w:rPr>
+        <w:t>Acredito que possa (e deves) usar esse trabalho como fonte na seção de Revisão Bibliográfica, mas não como correlato.</w:t>
+      </w:r>
+    </w:p>
+  </w:comment>
+  <w:comment w:id="50" w:author="Dalton Solano dos Reis" w:date="2026-05-13T13:02:00Z" w:initials="DR">
+    <w:p>
+      <w:r>
+        <w:rPr>
+          <w:rStyle w:val="Refdecomentrio"/>
+        </w:rPr>
+        <w:annotationRef/>
+      </w:r>
+      <w:r>
+        <w:rPr>
+          <w:sz w:val="20"/>
+          <w:szCs w:val="20"/>
+        </w:rPr>
+        <w:t>Subseção com afirmações mas sem citações para referências bibliográficas.</w:t>
+      </w:r>
+    </w:p>
+  </w:comment>
+  <w:comment w:id="51" w:author="Dalton Solano dos Reis" w:date="2026-05-13T13:05:00Z" w:initials="DR">
+    <w:p>
+      <w:r>
+        <w:rPr>
+          <w:rStyle w:val="Refdecomentrio"/>
+        </w:rPr>
+        <w:annotationRef/>
+      </w:r>
+      <w:r>
+        <w:rPr>
+          <w:sz w:val="20"/>
+          <w:szCs w:val="20"/>
+        </w:rPr>
+        <w:t>Mesmo que só liste os "destacados" deveria trazer números ... qtds. de aplicativos, tipos de aplicativos etc.</w:t>
+      </w:r>
+    </w:p>
+  </w:comment>
+  <w:comment w:id="52" w:author="Dalton Solano dos Reis" w:date="2026-05-13T13:05:00Z" w:initials="DR">
+    <w:p>
+      <w:r>
+        <w:rPr>
+          <w:rStyle w:val="Refdecomentrio"/>
+        </w:rPr>
+        <w:annotationRef/>
+      </w:r>
+      <w:r>
+        <w:rPr>
+          <w:sz w:val="20"/>
+          <w:szCs w:val="20"/>
+        </w:rPr>
+        <w:t>O que seria isso?</w:t>
+      </w:r>
+    </w:p>
+  </w:comment>
+  <w:comment w:id="58" w:author="Dalton Solano dos Reis" w:date="2026-05-13T13:06:00Z" w:initials="DR">
+    <w:p>
+      <w:r>
+        <w:rPr>
+          <w:rStyle w:val="Refdecomentrio"/>
+        </w:rPr>
+        <w:annotationRef/>
+      </w:r>
+      <w:r>
+        <w:rPr>
+          <w:sz w:val="20"/>
+          <w:szCs w:val="20"/>
+        </w:rPr>
+        <w:t>Título</w:t>
+      </w:r>
+    </w:p>
+  </w:comment>
+  <w:comment w:id="59" w:author="Dalton Solano dos Reis" w:date="2026-05-13T13:03:00Z" w:initials="DR">
+    <w:p>
+      <w:r>
+        <w:rPr>
+          <w:rStyle w:val="Refdecomentrio"/>
+        </w:rPr>
+        <w:annotationRef/>
+      </w:r>
+      <w:r>
+        <w:rPr>
+          <w:sz w:val="20"/>
+          <w:szCs w:val="20"/>
+        </w:rPr>
+        <w:t>Subseção com afirmações mas sem citações para referências bibliográficas.</w:t>
+      </w:r>
+    </w:p>
+  </w:comment>
+  <w:comment w:id="60" w:author="Dalton Solano dos Reis" w:date="2026-05-13T13:10:00Z" w:initials="DR">
+    <w:p>
+      <w:r>
+        <w:rPr>
+          <w:rStyle w:val="Refdecomentrio"/>
+        </w:rPr>
+        <w:annotationRef/>
+      </w:r>
+      <w:r>
+        <w:rPr>
+          <w:sz w:val="20"/>
+          <w:szCs w:val="20"/>
+        </w:rPr>
+        <w:t>Detalhar mais a figura ... descrever sobre ela, e o que é esse software (ou é um jogo, ou simulador).</w:t>
+      </w:r>
+    </w:p>
+  </w:comment>
+  <w:comment w:id="71" w:author="Dalton Solano dos Reis" w:date="2026-05-13T13:11:00Z" w:initials="DR">
+    <w:p>
+      <w:r>
+        <w:rPr>
+          <w:rStyle w:val="Refdecomentrio"/>
+        </w:rPr>
+        <w:annotationRef/>
+      </w:r>
+      <w:r>
+        <w:rPr>
+          <w:sz w:val="20"/>
+          <w:szCs w:val="20"/>
+        </w:rPr>
+        <w:t>ou seria um protótipo de jogo</w:t>
+      </w:r>
+    </w:p>
+  </w:comment>
+  <w:comment w:id="83" w:author="Dalton Solano dos Reis" w:date="2026-05-13T13:13:00Z" w:initials="DR">
+    <w:p>
+      <w:r>
+        <w:rPr>
+          <w:rStyle w:val="Refdecomentrio"/>
+        </w:rPr>
+        <w:annotationRef/>
+      </w:r>
+      <w:r>
+        <w:rPr>
+          <w:sz w:val="20"/>
+          <w:szCs w:val="20"/>
+        </w:rPr>
+        <w:t>Evitar deixar espaço em branco no final da página adiantando parágrafos que estão depois do quadro.</w:t>
+      </w:r>
+    </w:p>
+  </w:comment>
+  <w:comment w:id="85" w:author="Dalton Solano dos Reis" w:date="2026-05-13T13:21:00Z" w:initials="DR">
+    <w:p>
+      <w:r>
+        <w:rPr>
+          <w:rStyle w:val="Refdecomentrio"/>
+        </w:rPr>
+        <w:annotationRef/>
+      </w:r>
+      <w:r>
+        <w:rPr>
+          <w:sz w:val="20"/>
+          <w:szCs w:val="20"/>
+        </w:rPr>
+        <w:t>ATENÇÃO, tudo o que descreves nesse quadro como informação de cada trabalho correlato deve ser descrito em detalhes no respectivo trabalho.</w:t>
+      </w:r>
+    </w:p>
+  </w:comment>
+  <w:comment w:id="86" w:author="Dalton Solano dos Reis" w:date="2026-05-13T13:20:00Z" w:initials="DR">
+    <w:p>
+      <w:r>
+        <w:rPr>
+          <w:rStyle w:val="Refdecomentrio"/>
+        </w:rPr>
+        <w:annotationRef/>
+      </w:r>
+      <w:r>
+        <w:rPr>
+          <w:sz w:val="20"/>
+          <w:szCs w:val="20"/>
+        </w:rPr>
+        <w:t>O que comentei na subseção do próprio correlato ... se é um mapeamento de vários trabalhos, todos tem essa característica? Qual tem?</w:t>
+      </w:r>
+    </w:p>
+  </w:comment>
+  <w:comment w:id="87" w:author="Dalton Solano dos Reis" w:date="2026-05-13T13:23:00Z" w:initials="DR">
+    <w:p>
+      <w:r>
+        <w:rPr>
+          <w:rStyle w:val="Refdecomentrio"/>
+        </w:rPr>
+        <w:annotationRef/>
+      </w:r>
+      <w:r>
+        <w:rPr>
+          <w:sz w:val="20"/>
+          <w:szCs w:val="20"/>
+        </w:rPr>
+        <w:t>Só um exemplo, "3D simplificado", é um cenário low poly, etc. O que é?</w:t>
+      </w:r>
+    </w:p>
+  </w:comment>
+  <w:comment w:id="88" w:author="Dalton Solano dos Reis" w:date="2026-05-13T13:26:00Z" w:initials="DR">
+    <w:p>
+      <w:r>
+        <w:rPr>
+          <w:rStyle w:val="Refdecomentrio"/>
+        </w:rPr>
+        <w:annotationRef/>
+      </w:r>
+      <w:r>
+        <w:rPr>
+          <w:sz w:val="20"/>
+          <w:szCs w:val="20"/>
+        </w:rPr>
+        <w:t>O que seria o "autônomo" nesse contexto?</w:t>
+      </w:r>
+    </w:p>
+  </w:comment>
+  <w:comment w:id="89" w:author="Dalton Solano dos Reis" w:date="2026-05-14T09:21:00Z" w:initials="DR">
+    <w:p>
+      <w:r>
+        <w:rPr>
+          <w:rStyle w:val="Refdecomentrio"/>
+        </w:rPr>
+        <w:annotationRef/>
+      </w:r>
+      <w:r>
+        <w:rPr>
+          <w:sz w:val="20"/>
+          <w:szCs w:val="20"/>
+        </w:rPr>
+        <w:t>O que seria?</w:t>
+      </w:r>
+    </w:p>
+    <w:p>
+      <w:r>
+        <w:rPr>
+          <w:sz w:val="20"/>
+          <w:szCs w:val="20"/>
+        </w:rPr>
+        <w:t>Não apareceu antes no texto.</w:t>
+      </w:r>
+    </w:p>
+  </w:comment>
+  <w:comment w:id="90" w:author="Dalton Solano dos Reis" w:date="2026-05-14T09:23:00Z" w:initials="DR">
+    <w:p>
+      <w:r>
+        <w:rPr>
+          <w:rStyle w:val="Refdecomentrio"/>
+        </w:rPr>
+        <w:annotationRef/>
+      </w:r>
+      <w:r>
+        <w:rPr>
+          <w:sz w:val="20"/>
+          <w:szCs w:val="20"/>
+        </w:rPr>
+        <w:t>Frase "estranha".</w:t>
+      </w:r>
+    </w:p>
+  </w:comment>
+  <w:comment w:id="91" w:author="Dalton Solano dos Reis" w:date="2026-05-14T09:24:00Z" w:initials="DR">
+    <w:p>
+      <w:r>
+        <w:rPr>
+          <w:rStyle w:val="Refdecomentrio"/>
+        </w:rPr>
+        <w:annotationRef/>
+      </w:r>
+      <w:r>
+        <w:rPr>
+          <w:sz w:val="20"/>
+          <w:szCs w:val="20"/>
+        </w:rPr>
+        <w:t>Padronizar ... jogo, simulador, software, estudo ...</w:t>
+      </w:r>
+    </w:p>
+  </w:comment>
+  <w:comment w:id="102" w:author="Dalton Solano dos Reis" w:date="2026-05-14T09:26:00Z" w:initials="DR">
+    <w:p>
+      <w:r>
+        <w:rPr>
+          <w:rStyle w:val="Refdecomentrio"/>
+        </w:rPr>
+        <w:annotationRef/>
+      </w:r>
+      <w:r>
+        <w:rPr>
+          <w:sz w:val="20"/>
+          <w:szCs w:val="20"/>
+        </w:rPr>
+        <w:t>Acho que também deveria testar com especialista da área (professor de inglês), e usuários finais.</w:t>
+      </w:r>
+    </w:p>
+  </w:comment>
+  <w:comment w:id="118" w:author="Dalton Solano dos Reis" w:date="2026-05-14T09:30:00Z" w:initials="DR">
+    <w:p>
+      <w:r>
+        <w:rPr>
+          <w:rStyle w:val="Refdecomentrio"/>
+        </w:rPr>
+        <w:annotationRef/>
+      </w:r>
+      <w:r>
+        <w:rPr>
+          <w:sz w:val="20"/>
+          <w:szCs w:val="20"/>
+        </w:rPr>
+        <w:t>O que seria?</w:t>
+      </w:r>
+    </w:p>
+  </w:comment>
+  <w:comment w:id="120" w:author="Dalton Solano dos Reis" w:date="2026-05-14T09:39:00Z" w:initials="DR">
+    <w:p>
+      <w:r>
+        <w:rPr>
+          <w:rStyle w:val="Refdecomentrio"/>
+        </w:rPr>
+        <w:annotationRef/>
+      </w:r>
+      <w:r>
+        <w:rPr>
+          <w:sz w:val="20"/>
+          <w:szCs w:val="20"/>
+        </w:rPr>
+        <w:t>Arrumei, os sobrenomes dos autores deve estar em maiúsculo.</w:t>
+      </w:r>
+    </w:p>
+  </w:comment>
+</w:comments>
+</file>
+
+<file path=word/commentsExtended.xml><?xml version="1.0" encoding="utf-8"?>
+<w15:commentsEx xmlns:wpc="http://schemas.microsoft.com/office/word/2010/wordprocessingCanvas" xmlns:cx="http://schemas.microsoft.com/office/drawing/2014/chartex" xmlns:cx1="http://schemas.microsoft.com/office/drawing/2015/9/8/chartex" xmlns:cx2="http://schemas.microsoft.com/office/drawing/2015/10/21/chartex" xmlns:cx3="http://schemas.microsoft.com/office/drawing/2016/5/9/chartex" xmlns:cx4="http://schemas.microsoft.com/office/drawing/2016/5/10/chartex" xmlns:cx5="http://schemas.microsoft.com/office/drawing/2016/5/11/chartex" xmlns:cx6="http://schemas.microsoft.com/office/drawing/2016/5/12/chartex" xmlns:cx7="http://schemas.microsoft.com/office/drawing/2016/5/13/chartex" xmlns:cx8="http://schemas.microsoft.com/office/drawing/2016/5/14/chartex" xmlns:mc="http://schemas.openxmlformats.org/markup-compatibility/2006" xmlns:aink="http://schemas.microsoft.com/office/drawing/2016/ink" xmlns:am3d="http://schemas.microsoft.com/office/drawing/2017/model3d" xmlns:o="urn:schemas-microsoft-com:office:office" xmlns:oel="http://schemas.microsoft.com/office/2019/extlst" xmlns:r="http://schemas.openxmlformats.org/officeDocument/2006/relationships" xmlns:m="http://schemas.openxmlformats.org/officeDocument/2006/math" xmlns:v="urn:schemas-microsoft-com:vml" xmlns:wp14="http://schemas.microsoft.com/office/word/2010/wordprocessingDrawing" xmlns:wp="http://schemas.openxmlformats.org/drawingml/2006/wordprocessingDrawing" xmlns:w10="urn:schemas-microsoft-com:office:word" xmlns:w="http://schemas.openxmlformats.org/wordprocessingml/2006/main" xmlns:w14="http://schemas.microsoft.com/office/word/2010/wordml" xmlns:w15="http://schemas.microsoft.com/office/word/2012/wordml" xmlns:w16cex="http://schemas.microsoft.com/office/word/2018/wordml/cex" xmlns:w16cid="http://schemas.microsoft.com/office/word/2016/wordml/cid" xmlns:w16="http://schemas.microsoft.com/office/word/2018/wordml" xmlns:w16du="http://schemas.microsoft.com/office/word/2023/wordml/word16du" xmlns:w16sdtdh="http://schemas.microsoft.com/office/word/2020/wordml/sdtdatahash" xmlns:w16sdtfl="http://schemas.microsoft.com/office/word/2024/wordml/sdtformatlock" xmlns:w16se="http://schemas.microsoft.com/office/word/2015/wordml/symex" xmlns:wpg="http://schemas.microsoft.com/office/word/2010/wordprocessingGroup" xmlns:wpi="http://schemas.microsoft.com/office/word/2010/wordprocessingInk" xmlns:wne="http://schemas.microsoft.com/office/word/2006/wordml" xmlns:wps="http://schemas.microsoft.com/office/word/2010/wordprocessingShape" mc:Ignorable="w14 w15 w16se w16cid w16 w16cex w16sdtdh w16sdtfl w16du wp14">
+  <w15:commentEx w15:paraId="6D89C2C6" w15:done="0"/>
+  <w15:commentEx w15:paraId="4DB3189A" w15:done="0"/>
+  <w15:commentEx w15:paraId="114B079A" w15:paraIdParent="4DB3189A" w15:done="0"/>
+  <w15:commentEx w15:paraId="6F916F94" w15:done="0"/>
+  <w15:commentEx w15:paraId="1C1EB747" w15:done="0"/>
+  <w15:commentEx w15:paraId="080CE271" w15:paraIdParent="1C1EB747" w15:done="0"/>
+  <w15:commentEx w15:paraId="104E76FF" w15:done="0"/>
+  <w15:commentEx w15:paraId="2FD83F76" w15:done="0"/>
+  <w15:commentEx w15:paraId="105C2A52" w15:done="0"/>
+  <w15:commentEx w15:paraId="2C05B962" w15:done="0"/>
+  <w15:commentEx w15:paraId="313ED4F9" w15:done="0"/>
+  <w15:commentEx w15:paraId="77129AF0" w15:done="0"/>
+  <w15:commentEx w15:paraId="18AA4A1D" w15:done="0"/>
+  <w15:commentEx w15:paraId="30B28B94" w15:paraIdParent="18AA4A1D" w15:done="0"/>
+  <w15:commentEx w15:paraId="1BEC9B5E" w15:done="0"/>
+  <w15:commentEx w15:paraId="7C678F1B" w15:done="0"/>
+  <w15:commentEx w15:paraId="3ECA0C41" w15:done="0"/>
+  <w15:commentEx w15:paraId="5E4A313D" w15:done="0"/>
+  <w15:commentEx w15:paraId="7D2E97C1" w15:done="0"/>
+  <w15:commentEx w15:paraId="3A508007" w15:done="0"/>
+  <w15:commentEx w15:paraId="176AAD75" w15:done="0"/>
+  <w15:commentEx w15:paraId="02135DC7" w15:done="0"/>
+  <w15:commentEx w15:paraId="1527972F" w15:done="0"/>
+  <w15:commentEx w15:paraId="1E56D01A" w15:done="0"/>
+  <w15:commentEx w15:paraId="63F44B03" w15:done="0"/>
+  <w15:commentEx w15:paraId="68097788" w15:done="0"/>
+  <w15:commentEx w15:paraId="363F2433" w15:paraIdParent="68097788" w15:done="0"/>
+  <w15:commentEx w15:paraId="7C502348" w15:done="0"/>
+  <w15:commentEx w15:paraId="2DACB93A" w15:done="0"/>
+  <w15:commentEx w15:paraId="79A03AAA" w15:done="0"/>
+  <w15:commentEx w15:paraId="171BC15B" w15:done="0"/>
+  <w15:commentEx w15:paraId="63B19016" w15:done="0"/>
+  <w15:commentEx w15:paraId="159962B6" w15:done="0"/>
+  <w15:commentEx w15:paraId="6A164856" w15:done="0"/>
+</w15:commentsEx>
+</file>
+
+<file path=word/commentsExtensible.xml><?xml version="1.0" encoding="utf-8"?>
+<w16cex:commentsExtensible xmlns:wpc="http://schemas.microsoft.com/office/word/2010/wordprocessingCanvas" xmlns:cx="http://schemas.microsoft.com/office/drawing/2014/chartex" xmlns:cx1="http://schemas.microsoft.com/office/drawing/2015/9/8/chartex" xmlns:cx2="http://schemas.microsoft.com/office/drawing/2015/10/21/chartex" xmlns:cx3="http://schemas.microsoft.com/office/drawing/2016/5/9/chartex" xmlns:cx4="http://schemas.microsoft.com/office/drawing/2016/5/10/chartex" xmlns:cx5="http://schemas.microsoft.com/office/drawing/2016/5/11/chartex" xmlns:cx6="http://schemas.microsoft.com/office/drawing/2016/5/12/chartex" xmlns:cx7="http://schemas.microsoft.com/office/drawing/2016/5/13/chartex" xmlns:cx8="http://schemas.microsoft.com/office/drawing/2016/5/14/chartex" xmlns:cr="http://schemas.microsoft.com/office/comments/2020/reactions" xmlns:mc="http://schemas.openxmlformats.org/markup-compatibility/2006" xmlns:aink="http://schemas.microsoft.com/office/drawing/2016/ink" xmlns:am3d="http://schemas.microsoft.com/office/drawing/2017/model3d" xmlns:o="urn:schemas-microsoft-com:office:office" xmlns:oel="http://schemas.microsoft.com/office/2019/extlst" xmlns:r="http://schemas.openxmlformats.org/officeDocument/2006/relationships" xmlns:m="http://schemas.openxmlformats.org/officeDocument/2006/math" xmlns:v="urn:schemas-microsoft-com:vml" xmlns:wp14="http://schemas.microsoft.com/office/word/2010/wordprocessingDrawing" xmlns:wp="http://schemas.openxmlformats.org/drawingml/2006/wordprocessingDrawing" xmlns:w10="urn:schemas-microsoft-com:office:word" xmlns:w="http://schemas.openxmlformats.org/wordprocessingml/2006/main" xmlns:w14="http://schemas.microsoft.com/office/word/2010/wordml" xmlns:w15="http://schemas.microsoft.com/office/word/2012/wordml" xmlns:w16cex="http://schemas.microsoft.com/office/word/2018/wordml/cex" xmlns:w16cid="http://schemas.microsoft.com/office/word/2016/wordml/cid" xmlns:w16="http://schemas.microsoft.com/office/word/2018/wordml" xmlns:w16du="http://schemas.microsoft.com/office/word/2023/wordml/word16du" xmlns:w16sdtdh="http://schemas.microsoft.com/office/word/2020/wordml/sdtdatahash" xmlns:w16sdtfl="http://schemas.microsoft.com/office/word/2024/wordml/sdtformatlock" xmlns:w16se="http://schemas.microsoft.com/office/word/2015/wordml/symex" xmlns:wpg="http://schemas.microsoft.com/office/word/2010/wordprocessingGroup" xmlns:wpi="http://schemas.microsoft.com/office/word/2010/wordprocessingInk" xmlns:wne="http://schemas.microsoft.com/office/word/2006/wordml" xmlns:wps="http://schemas.microsoft.com/office/word/2010/wordprocessingShape" mc:Ignorable="w14 w15 w16se w16cid w16 w16cex w16sdtdh w16sdtfl cr w16du wp14">
+  <w16cex:commentExtensible w16cex:durableId="55130FE9" w16cex:dateUtc="2026-05-14T12:36:00Z"/>
+  <w16cex:commentExtensible w16cex:durableId="01798578" w16cex:dateUtc="2026-05-13T15:38:00Z"/>
+  <w16cex:commentExtensible w16cex:durableId="64F4BAC5" w16cex:dateUtc="2026-05-13T15:43:00Z"/>
+  <w16cex:commentExtensible w16cex:durableId="460E0292" w16cex:dateUtc="2026-05-13T15:42:00Z"/>
+  <w16cex:commentExtensible w16cex:durableId="11EEC7FB" w16cex:dateUtc="2026-05-13T15:40:00Z"/>
+  <w16cex:commentExtensible w16cex:durableId="2944BAB7" w16cex:dateUtc="2026-05-13T15:46:00Z"/>
+  <w16cex:commentExtensible w16cex:durableId="2EA2EDB4" w16cex:dateUtc="2026-05-13T15:48:00Z"/>
+  <w16cex:commentExtensible w16cex:durableId="5BC0092A" w16cex:dateUtc="2026-05-13T15:56:00Z"/>
+  <w16cex:commentExtensible w16cex:durableId="36FA3BDF" w16cex:dateUtc="2026-05-13T16:02:00Z"/>
+  <w16cex:commentExtensible w16cex:durableId="5217F839" w16cex:dateUtc="2026-05-13T15:52:00Z"/>
+  <w16cex:commentExtensible w16cex:durableId="53008C1B" w16cex:dateUtc="2026-05-13T15:53:00Z"/>
+  <w16cex:commentExtensible w16cex:durableId="4AA5E000" w16cex:dateUtc="2026-05-13T15:58:00Z"/>
+  <w16cex:commentExtensible w16cex:durableId="09EE4EAF" w16cex:dateUtc="2026-05-13T15:59:00Z"/>
+  <w16cex:commentExtensible w16cex:durableId="5F779633" w16cex:dateUtc="2026-05-13T16:03:00Z"/>
+  <w16cex:commentExtensible w16cex:durableId="08714C53" w16cex:dateUtc="2026-05-13T15:59:00Z"/>
+  <w16cex:commentExtensible w16cex:durableId="0143BB8E" w16cex:dateUtc="2026-05-13T16:18:00Z"/>
+  <w16cex:commentExtensible w16cex:durableId="2F03A7BE" w16cex:dateUtc="2026-05-13T16:02:00Z"/>
+  <w16cex:commentExtensible w16cex:durableId="74A60D11" w16cex:dateUtc="2026-05-13T16:05:00Z"/>
+  <w16cex:commentExtensible w16cex:durableId="396D016E" w16cex:dateUtc="2026-05-13T16:05:00Z"/>
+  <w16cex:commentExtensible w16cex:durableId="08A7CD08" w16cex:dateUtc="2026-05-13T16:06:00Z"/>
+  <w16cex:commentExtensible w16cex:durableId="0C1693F6" w16cex:dateUtc="2026-05-13T16:03:00Z"/>
+  <w16cex:commentExtensible w16cex:durableId="1BBE6145" w16cex:dateUtc="2026-05-13T16:10:00Z"/>
+  <w16cex:commentExtensible w16cex:durableId="49FA9FC6" w16cex:dateUtc="2026-05-13T16:11:00Z"/>
+  <w16cex:commentExtensible w16cex:durableId="1561D59A" w16cex:dateUtc="2026-05-13T16:13:00Z"/>
+  <w16cex:commentExtensible w16cex:durableId="789F19BE" w16cex:dateUtc="2026-05-13T16:21:00Z"/>
+  <w16cex:commentExtensible w16cex:durableId="6A8D42A9" w16cex:dateUtc="2026-05-13T16:20:00Z"/>
+  <w16cex:commentExtensible w16cex:durableId="2BFC0976" w16cex:dateUtc="2026-05-13T16:23:00Z"/>
+  <w16cex:commentExtensible w16cex:durableId="26E8F8E7" w16cex:dateUtc="2026-05-13T16:26:00Z"/>
+  <w16cex:commentExtensible w16cex:durableId="6C53815D" w16cex:dateUtc="2026-05-14T12:21:00Z"/>
+  <w16cex:commentExtensible w16cex:durableId="30407827" w16cex:dateUtc="2026-05-14T12:23:00Z"/>
+  <w16cex:commentExtensible w16cex:durableId="3D5C94A1" w16cex:dateUtc="2026-05-14T12:24:00Z"/>
+  <w16cex:commentExtensible w16cex:durableId="34416BDB" w16cex:dateUtc="2026-05-14T12:26:00Z"/>
+  <w16cex:commentExtensible w16cex:durableId="417F7122" w16cex:dateUtc="2026-05-14T12:30:00Z"/>
+  <w16cex:commentExtensible w16cex:durableId="08F932E4" w16cex:dateUtc="2026-05-14T12:39:00Z"/>
+</w16cex:commentsExtensible>
+</file>
+
+<file path=word/commentsIds.xml><?xml version="1.0" encoding="utf-8"?>
+<w16cid:commentsIds xmlns:wpc="http://schemas.microsoft.com/office/word/2010/wordprocessingCanvas" xmlns:cx="http://schemas.microsoft.com/office/drawing/2014/chartex" xmlns:cx1="http://schemas.microsoft.com/office/drawing/2015/9/8/chartex" xmlns:cx2="http://schemas.microsoft.com/office/drawing/2015/10/21/chartex" xmlns:cx3="http://schemas.microsoft.com/office/drawing/2016/5/9/chartex" xmlns:cx4="http://schemas.microsoft.com/office/drawing/2016/5/10/chartex" xmlns:cx5="http://schemas.microsoft.com/office/drawing/2016/5/11/chartex" xmlns:cx6="http://schemas.microsoft.com/office/drawing/2016/5/12/chartex" xmlns:cx7="http://schemas.microsoft.com/office/drawing/2016/5/13/chartex" xmlns:cx8="http://schemas.microsoft.com/office/drawing/2016/5/14/chartex" xmlns:mc="http://schemas.openxmlformats.org/markup-compatibility/2006" xmlns:aink="http://schemas.microsoft.com/office/drawing/2016/ink" xmlns:am3d="http://schemas.microsoft.com/office/drawing/2017/model3d" xmlns:o="urn:schemas-microsoft-com:office:office" xmlns:oel="http://schemas.microsoft.com/office/2019/extlst" xmlns:r="http://schemas.openxmlformats.org/officeDocument/2006/relationships" xmlns:m="http://schemas.openxmlformats.org/officeDocument/2006/math" xmlns:v="urn:schemas-microsoft-com:vml" xmlns:wp14="http://schemas.microsoft.com/office/word/2010/wordprocessingDrawing" xmlns:wp="http://schemas.openxmlformats.org/drawingml/2006/wordprocessingDrawing" xmlns:w10="urn:schemas-microsoft-com:office:word" xmlns:w="http://schemas.openxmlformats.org/wordprocessingml/2006/main" xmlns:w14="http://schemas.microsoft.com/office/word/2010/wordml" xmlns:w15="http://schemas.microsoft.com/office/word/2012/wordml" xmlns:w16cex="http://schemas.microsoft.com/office/word/2018/wordml/cex" xmlns:w16cid="http://schemas.microsoft.com/office/word/2016/wordml/cid" xmlns:w16="http://schemas.microsoft.com/office/word/2018/wordml" xmlns:w16du="http://schemas.microsoft.com/office/word/2023/wordml/word16du" xmlns:w16sdtdh="http://schemas.microsoft.com/office/word/2020/wordml/sdtdatahash" xmlns:w16sdtfl="http://schemas.microsoft.com/office/word/2024/wordml/sdtformatlock" xmlns:w16se="http://schemas.microsoft.com/office/word/2015/wordml/symex" xmlns:wpg="http://schemas.microsoft.com/office/word/2010/wordprocessingGroup" xmlns:wpi="http://schemas.microsoft.com/office/word/2010/wordprocessingInk" xmlns:wne="http://schemas.microsoft.com/office/word/2006/wordml" xmlns:wps="http://schemas.microsoft.com/office/word/2010/wordprocessingShape" mc:Ignorable="w14 w15 w16se w16cid w16 w16cex w16sdtdh w16sdtfl w16du wp14">
+  <w16cid:commentId w16cid:paraId="6D89C2C6" w16cid:durableId="55130FE9"/>
+  <w16cid:commentId w16cid:paraId="4DB3189A" w16cid:durableId="01798578"/>
+  <w16cid:commentId w16cid:paraId="114B079A" w16cid:durableId="64F4BAC5"/>
+  <w16cid:commentId w16cid:paraId="6F916F94" w16cid:durableId="460E0292"/>
+  <w16cid:commentId w16cid:paraId="1C1EB747" w16cid:durableId="11EEC7FB"/>
+  <w16cid:commentId w16cid:paraId="080CE271" w16cid:durableId="2944BAB7"/>
+  <w16cid:commentId w16cid:paraId="104E76FF" w16cid:durableId="2EA2EDB4"/>
+  <w16cid:commentId w16cid:paraId="2FD83F76" w16cid:durableId="5BC0092A"/>
+  <w16cid:commentId w16cid:paraId="105C2A52" w16cid:durableId="36FA3BDF"/>
+  <w16cid:commentId w16cid:paraId="2C05B962" w16cid:durableId="5217F839"/>
+  <w16cid:commentId w16cid:paraId="313ED4F9" w16cid:durableId="53008C1B"/>
+  <w16cid:commentId w16cid:paraId="77129AF0" w16cid:durableId="4AA5E000"/>
+  <w16cid:commentId w16cid:paraId="18AA4A1D" w16cid:durableId="09EE4EAF"/>
+  <w16cid:commentId w16cid:paraId="30B28B94" w16cid:durableId="5F779633"/>
+  <w16cid:commentId w16cid:paraId="1BEC9B5E" w16cid:durableId="08714C53"/>
+  <w16cid:commentId w16cid:paraId="7C678F1B" w16cid:durableId="0143BB8E"/>
+  <w16cid:commentId w16cid:paraId="3ECA0C41" w16cid:durableId="2F03A7BE"/>
+  <w16cid:commentId w16cid:paraId="5E4A313D" w16cid:durableId="74A60D11"/>
+  <w16cid:commentId w16cid:paraId="7D2E97C1" w16cid:durableId="396D016E"/>
+  <w16cid:commentId w16cid:paraId="3A508007" w16cid:durableId="08A7CD08"/>
+  <w16cid:commentId w16cid:paraId="176AAD75" w16cid:durableId="0C1693F6"/>
+  <w16cid:commentId w16cid:paraId="02135DC7" w16cid:durableId="1BBE6145"/>
+  <w16cid:commentId w16cid:paraId="1527972F" w16cid:durableId="49FA9FC6"/>
+  <w16cid:commentId w16cid:paraId="1E56D01A" w16cid:durableId="1561D59A"/>
+  <w16cid:commentId w16cid:paraId="63F44B03" w16cid:durableId="789F19BE"/>
+  <w16cid:commentId w16cid:paraId="68097788" w16cid:durableId="6A8D42A9"/>
+  <w16cid:commentId w16cid:paraId="363F2433" w16cid:durableId="2BFC0976"/>
+  <w16cid:commentId w16cid:paraId="7C502348" w16cid:durableId="26E8F8E7"/>
+  <w16cid:commentId w16cid:paraId="2DACB93A" w16cid:durableId="6C53815D"/>
+  <w16cid:commentId w16cid:paraId="79A03AAA" w16cid:durableId="30407827"/>
+  <w16cid:commentId w16cid:paraId="171BC15B" w16cid:durableId="3D5C94A1"/>
+  <w16cid:commentId w16cid:paraId="63B19016" w16cid:durableId="34416BDB"/>
+  <w16cid:commentId w16cid:paraId="159962B6" w16cid:durableId="417F7122"/>
+  <w16cid:commentId w16cid:paraId="6A164856" w16cid:durableId="08F932E4"/>
+</w16cid:commentsIds>
 </file>
 
 <file path=word/endnotes.xml><?xml version="1.0" encoding="utf-8"?>
@@ -9054,6 +10565,14 @@
     </w:lvlOverride>
   </w:num>
 </w:numbering>
+</file>
+
+<file path=word/people.xml><?xml version="1.0" encoding="utf-8"?>
+<w15:people xmlns:wpc="http://schemas.microsoft.com/office/word/2010/wordprocessingCanvas" xmlns:cx="http://schemas.microsoft.com/office/drawing/2014/chartex" xmlns:cx1="http://schemas.microsoft.com/office/drawing/2015/9/8/chartex" xmlns:cx2="http://schemas.microsoft.com/office/drawing/2015/10/21/chartex" xmlns:cx3="http://schemas.microsoft.com/office/drawing/2016/5/9/chartex" xmlns:cx4="http://schemas.microsoft.com/office/drawing/2016/5/10/chartex" xmlns:cx5="http://schemas.microsoft.com/office/drawing/2016/5/11/chartex" xmlns:cx6="http://schemas.microsoft.com/office/drawing/2016/5/12/chartex" xmlns:cx7="http://schemas.microsoft.com/office/drawing/2016/5/13/chartex" xmlns:cx8="http://schemas.microsoft.com/office/drawing/2016/5/14/chartex" xmlns:mc="http://schemas.openxmlformats.org/markup-compatibility/2006" xmlns:aink="http://schemas.microsoft.com/office/drawing/2016/ink" xmlns:am3d="http://schemas.microsoft.com/office/drawing/2017/model3d" xmlns:o="urn:schemas-microsoft-com:office:office" xmlns:oel="http://schemas.microsoft.com/office/2019/extlst" xmlns:r="http://schemas.openxmlformats.org/officeDocument/2006/relationships" xmlns:m="http://schemas.openxmlformats.org/officeDocument/2006/math" xmlns:v="urn:schemas-microsoft-com:vml" xmlns:wp14="http://schemas.microsoft.com/office/word/2010/wordprocessingDrawing" xmlns:wp="http://schemas.openxmlformats.org/drawingml/2006/wordprocessingDrawing" xmlns:w10="urn:schemas-microsoft-com:office:word" xmlns:w="http://schemas.openxmlformats.org/wordprocessingml/2006/main" xmlns:w14="http://schemas.microsoft.com/office/word/2010/wordml" xmlns:w15="http://schemas.microsoft.com/office/word/2012/wordml" xmlns:w16cex="http://schemas.microsoft.com/office/word/2018/wordml/cex" xmlns:w16cid="http://schemas.microsoft.com/office/word/2016/wordml/cid" xmlns:w16="http://schemas.microsoft.com/office/word/2018/wordml" xmlns:w16du="http://schemas.microsoft.com/office/word/2023/wordml/word16du" xmlns:w16sdtdh="http://schemas.microsoft.com/office/word/2020/wordml/sdtdatahash" xmlns:w16sdtfl="http://schemas.microsoft.com/office/word/2024/wordml/sdtformatlock" xmlns:w16se="http://schemas.microsoft.com/office/word/2015/wordml/symex" xmlns:wpg="http://schemas.microsoft.com/office/word/2010/wordprocessingGroup" xmlns:wpi="http://schemas.microsoft.com/office/word/2010/wordprocessingInk" xmlns:wne="http://schemas.microsoft.com/office/word/2006/wordml" xmlns:wps="http://schemas.microsoft.com/office/word/2010/wordprocessingShape" mc:Ignorable="w14 w15 w16se w16cid w16 w16cex w16sdtdh w16sdtfl w16du wp14">
+  <w15:person w15:author="Dalton Solano dos Reis">
+    <w15:presenceInfo w15:providerId="Windows Live" w15:userId="f8a8aa77fb4f515d"/>
+  </w15:person>
+</w15:people>
 </file>
 
 <file path=word/styles.xml><?xml version="1.0" encoding="utf-8"?>
@@ -9665,7 +11184,6 @@
   <w:style w:type="character" w:default="1" w:styleId="Fontepargpadro">
     <w:name w:val="Default Paragraph Font"/>
     <w:uiPriority w:val="1"/>
-    <w:semiHidden/>
     <w:unhideWhenUsed/>
   </w:style>
   <w:style w:type="table" w:default="1" w:styleId="Tabelanormal">
@@ -11485,6 +13003,10 @@
 </file>
 
 <file path=customXml/item1.xml><?xml version="1.0" encoding="utf-8"?>
+<b:Sources xmlns:b="http://schemas.openxmlformats.org/officeDocument/2006/bibliography" xmlns="http://schemas.openxmlformats.org/officeDocument/2006/bibliography" SelectedStyle="" StyleName=""/>
+</file>
+
+<file path=customXml/item2.xml><?xml version="1.0" encoding="utf-8"?>
 <p:properties xmlns:p="http://schemas.microsoft.com/office/2006/metadata/properties" xmlns:xsi="http://www.w3.org/2001/XMLSchema-instance" xmlns:pc="http://schemas.microsoft.com/office/infopath/2007/PartnerControls">
   <documentManagement>
     <Has_Teacher_Only_SectionGroup xmlns="f8440490-6d1a-488a-8abf-48b89d0123a0" xsi:nil="true"/>
@@ -11532,7 +13054,7 @@
 </p:properties>
 </file>
 
-<file path=customXml/item2.xml><?xml version="1.0" encoding="utf-8"?>
+<file path=customXml/item3.xml><?xml version="1.0" encoding="utf-8"?>
 <?mso-contentType ?>
 <FormTemplates xmlns="http://schemas.microsoft.com/sharepoint/v3/contenttype/forms">
   <Display>DocumentLibraryForm</Display>
@@ -11541,7 +13063,7 @@
 </FormTemplates>
 </file>
 
-<file path=customXml/item3.xml><?xml version="1.0" encoding="utf-8"?>
+<file path=customXml/item4.xml><?xml version="1.0" encoding="utf-8"?>
 <ct:contentTypeSchema xmlns:ct="http://schemas.microsoft.com/office/2006/metadata/contentType" xmlns:ma="http://schemas.microsoft.com/office/2006/metadata/properties/metaAttributes" ct:_="" ma:_="" ma:contentTypeName="Documento" ma:contentTypeID="0x010100F13453D0801D5E45B1745A09551F1C32" ma:contentTypeVersion="28" ma:contentTypeDescription="Crie um novo documento." ma:contentTypeScope="" ma:versionID="fa9ef3803bb4ef638f344296fd7d9170">
   <xsd:schema xmlns:xsd="http://www.w3.org/2001/XMLSchema" xmlns:xs="http://www.w3.org/2001/XMLSchema" xmlns:p="http://schemas.microsoft.com/office/2006/metadata/properties" xmlns:ns3="f8440490-6d1a-488a-8abf-48b89d0123a0" xmlns:ns4="22206413-f776-4b11-bcb2-0b935dc83731" targetNamespace="http://schemas.microsoft.com/office/2006/metadata/properties" ma:root="true" ma:fieldsID="5a7e583b53460e8ff4480ccd12c418cb" ns3:_="" ns4:_="">
     <xsd:import namespace="f8440490-6d1a-488a-8abf-48b89d0123a0"/>
@@ -11916,22 +13438,25 @@
 </ct:contentTypeSchema>
 </file>
 
-<file path=customXml/item4.xml><?xml version="1.0" encoding="utf-8"?>
-<b:Sources xmlns:b="http://schemas.openxmlformats.org/officeDocument/2006/bibliography" xmlns="http://schemas.openxmlformats.org/officeDocument/2006/bibliography" SelectedStyle="" StyleName=""/>
-</file>
-
 <file path=customXml/itemProps1.xml><?xml version="1.0" encoding="utf-8"?>
-<ds:datastoreItem xmlns:ds="http://schemas.openxmlformats.org/officeDocument/2006/customXml" ds:itemID="{41853661-3F52-45C5-AABD-8FFE43AA909F}">
+<ds:datastoreItem xmlns:ds="http://schemas.openxmlformats.org/officeDocument/2006/customXml" ds:itemID="{90E28FDA-35C6-4FCD-88ED-F93C837A14A5}">
   <ds:schemaRefs>
-    <ds:schemaRef ds:uri="http://schemas.microsoft.com/office/2006/metadata/properties"/>
-    <ds:schemaRef ds:uri="http://www.w3.org/2000/xmlns/"/>
-    <ds:schemaRef ds:uri="f8440490-6d1a-488a-8abf-48b89d0123a0"/>
-    <ds:schemaRef ds:uri="http://www.w3.org/2001/XMLSchema-instance"/>
+    <ds:schemaRef ds:uri="http://schemas.openxmlformats.org/officeDocument/2006/bibliography"/>
   </ds:schemaRefs>
 </ds:datastoreItem>
 </file>
 
 <file path=customXml/itemProps2.xml><?xml version="1.0" encoding="utf-8"?>
+<ds:datastoreItem xmlns:ds="http://schemas.openxmlformats.org/officeDocument/2006/customXml" ds:itemID="{41853661-3F52-45C5-AABD-8FFE43AA909F}">
+  <ds:schemaRefs>
+    <ds:schemaRef ds:uri="http://schemas.microsoft.com/office/2006/metadata/properties"/>
+    <ds:schemaRef ds:uri="http://schemas.microsoft.com/office/infopath/2007/PartnerControls"/>
+    <ds:schemaRef ds:uri="f8440490-6d1a-488a-8abf-48b89d0123a0"/>
+  </ds:schemaRefs>
+</ds:datastoreItem>
+</file>
+
+<file path=customXml/itemProps3.xml><?xml version="1.0" encoding="utf-8"?>
 <ds:datastoreItem xmlns:ds="http://schemas.openxmlformats.org/officeDocument/2006/customXml" ds:itemID="{7B1E6EB0-B3F5-485A-9397-E673FC4F5C49}">
   <ds:schemaRefs>
     <ds:schemaRef ds:uri="http://schemas.microsoft.com/sharepoint/v3/contenttype/forms"/>
@@ -11939,24 +13464,21 @@
 </ds:datastoreItem>
 </file>
 
-<file path=customXml/itemProps3.xml><?xml version="1.0" encoding="utf-8"?>
+<file path=customXml/itemProps4.xml><?xml version="1.0" encoding="utf-8"?>
 <ds:datastoreItem xmlns:ds="http://schemas.openxmlformats.org/officeDocument/2006/customXml" ds:itemID="{ECA86F05-1AFD-4D7D-A2B0-46D80603D700}">
   <ds:schemaRefs>
     <ds:schemaRef ds:uri="http://schemas.microsoft.com/office/2006/metadata/contentType"/>
     <ds:schemaRef ds:uri="http://schemas.microsoft.com/office/2006/metadata/properties/metaAttributes"/>
-    <ds:schemaRef ds:uri="http://www.w3.org/2000/xmlns/"/>
     <ds:schemaRef ds:uri="http://www.w3.org/2001/XMLSchema"/>
+    <ds:schemaRef ds:uri="http://schemas.microsoft.com/office/2006/metadata/properties"/>
     <ds:schemaRef ds:uri="f8440490-6d1a-488a-8abf-48b89d0123a0"/>
     <ds:schemaRef ds:uri="22206413-f776-4b11-bcb2-0b935dc83731"/>
-  </ds:schemaRefs>
-</ds:datastoreItem>
-</file>
-
-<file path=customXml/itemProps4.xml><?xml version="1.0" encoding="utf-8"?>
-<ds:datastoreItem xmlns:ds="http://schemas.openxmlformats.org/officeDocument/2006/customXml" ds:itemID="{90E28FDA-35C6-4FCD-88ED-F93C837A14A5}">
-  <ds:schemaRefs>
-    <ds:schemaRef ds:uri="http://schemas.openxmlformats.org/officeDocument/2006/bibliography"/>
-    <ds:schemaRef ds:uri="http://www.w3.org/2000/xmlns/"/>
+    <ds:schemaRef ds:uri="http://schemas.microsoft.com/office/2006/documentManagement/types"/>
+    <ds:schemaRef ds:uri="http://schemas.microsoft.com/office/infopath/2007/PartnerControls"/>
+    <ds:schemaRef ds:uri="http://schemas.openxmlformats.org/package/2006/metadata/core-properties"/>
+    <ds:schemaRef ds:uri="http://purl.org/dc/elements/1.1/"/>
+    <ds:schemaRef ds:uri="http://purl.org/dc/terms/"/>
+    <ds:schemaRef ds:uri="http://schemas.microsoft.com/internal/obd"/>
   </ds:schemaRefs>
 </ds:datastoreItem>
 </file>
</xml_diff>